<commit_message>
Adaptează scenariile ca document justificativ pentru Facilitatorul comunitar 2
Adaugă la începutul fiecărei ședințe fișa activității (date de
identificare, repartizarea orelor pe etape, livrabile, dovezi,
semnături), o fundamentare metodologică și elementele de proiectare,
iar înainte de anexe raportul privind desfășurarea activității.

Co-Authored-By: Claude Opus 5.5 <noreply@anthropic.com>
Claude-Session: https://claude.ai/code/session_014YvKj2uLd5NfjHU1PMAHuV
</commit_message>
<xml_diff>
--- a/atelier_puncte_forte/Sedinta_1_Cine_sunt_eu_Scenariu_si_Anexe.docx
+++ b/atelier_puncte_forte/Sedinta_1_Cine_sunt_eu_Scenariu_si_Anexe.docx
@@ -102,6 +102,720 @@
         <w:tblW w:w="9639" w:type="dxa"/>
         <w:jc w:val="center"/>
         <w:tblBorders>
+          <w:top w:val="single" w:sz="12" w:space="0" w:color="4A2A82"/>
+          <w:left w:val="single" w:sz="12" w:space="0" w:color="4A2A82"/>
+          <w:bottom w:val="single" w:sz="12" w:space="0" w:color="4A2A82"/>
+          <w:right w:val="single" w:sz="12" w:space="0" w:color="4A2A82"/>
+          <w:insideH w:val="nil"/>
+          <w:insideV w:val="nil"/>
+        </w:tblBorders>
+        <w:tblLayout w:type="fixed"/>
+        <w:tblCellMar>
+          <w:top w:w="85" w:type="dxa"/>
+          <w:left w:w="170" w:type="dxa"/>
+          <w:bottom w:w="85" w:type="dxa"/>
+          <w:right w:w="170" w:type="dxa"/>
+        </w:tblCellMar>
+        <w:tblLook w:firstColumn="1" w:firstRow="1" w:lastColumn="0" w:lastRow="0" w:noHBand="0" w:noVBand="1" w:val="04A0"/>
+      </w:tblPr>
+      <w:tblGrid>
+        <w:gridCol w:w="9639"/>
+      </w:tblGrid>
+      <w:tr>
+        <w:tc>
+          <w:tcPr>
+            <w:tcW w:type="dxa" w:w="9638"/>
+          </w:tcPr>
+          <w:p>
+            <w:pPr>
+              <w:spacing w:before="0" w:after="0"/>
+              <w:jc w:val="center"/>
+            </w:pPr>
+            <w:r>
+              <w:rPr>
+                <w:b/>
+                <w:i w:val="0"/>
+                <w:color w:val="4A2A82"/>
+                <w:sz w:val="28"/>
+              </w:rPr>
+              <w:t>FIȘA ACTIVITĂȚII – DOCUMENT JUSTIFICATIV</w:t>
+            </w:r>
+          </w:p>
+          <w:p>
+            <w:pPr>
+              <w:spacing w:before="0" w:after="0"/>
+              <w:jc w:val="center"/>
+            </w:pPr>
+            <w:r>
+              <w:rPr>
+                <w:b w:val="0"/>
+                <w:i/>
+                <w:sz w:val="20"/>
+              </w:rPr>
+              <w:t>privind activitatea desfășurată de expertul „Facilitator comunitar 2” în cadrul proiectului UNIC</w:t>
+            </w:r>
+          </w:p>
+        </w:tc>
+      </w:tr>
+    </w:tbl>
+    <w:p>
+      <w:pPr>
+        <w:spacing w:before="0" w:after="0" w:line="120" w:lineRule="exact"/>
+      </w:pPr>
+      <w:r/>
+    </w:p>
+    <w:p>
+      <w:pPr>
+        <w:keepNext/>
+        <w:spacing w:before="160" w:after="80"/>
+      </w:pPr>
+      <w:r>
+        <w:rPr>
+          <w:b/>
+          <w:i w:val="0"/>
+          <w:color w:val="4A2A82"/>
+          <w:sz w:val="22"/>
+        </w:rPr>
+        <w:t>A. Date de identificare</w:t>
+      </w:r>
+    </w:p>
+    <w:tbl>
+      <w:tblPr>
+        <w:tblW w:w="9639" w:type="dxa"/>
+        <w:jc w:val="center"/>
+        <w:tblBorders>
+          <w:top w:val="single" w:sz="4" w:space="0" w:color="DCD0F0"/>
+          <w:left w:val="single" w:sz="4" w:space="0" w:color="DCD0F0"/>
+          <w:bottom w:val="single" w:sz="4" w:space="0" w:color="DCD0F0"/>
+          <w:right w:val="single" w:sz="4" w:space="0" w:color="DCD0F0"/>
+          <w:insideH w:val="single" w:sz="4" w:space="0" w:color="DCD0F0"/>
+          <w:insideV w:val="single" w:sz="4" w:space="0" w:color="DCD0F0"/>
+        </w:tblBorders>
+        <w:tblLayout w:type="fixed"/>
+        <w:tblCellMar>
+          <w:top w:w="39" w:type="dxa"/>
+          <w:left w:w="113" w:type="dxa"/>
+          <w:bottom w:w="39" w:type="dxa"/>
+          <w:right w:w="113" w:type="dxa"/>
+        </w:tblCellMar>
+        <w:tblLook w:firstColumn="1" w:firstRow="1" w:lastColumn="0" w:lastRow="0" w:noHBand="0" w:noVBand="1" w:val="04A0"/>
+      </w:tblPr>
+      <w:tblGrid>
+        <w:gridCol w:w="2835"/>
+        <w:gridCol w:w="6804"/>
+      </w:tblGrid>
+      <w:tr>
+        <w:trPr>
+          <w:cantSplit/>
+          <w:trHeight w:val="425" w:hRule="atLeast"/>
+        </w:trPr>
+        <w:tc>
+          <w:tcPr>
+            <w:tcW w:type="dxa" w:w="2835"/>
+            <w:shd w:val="clear" w:color="auto" w:fill="F1ECF9"/>
+            <w:vAlign w:val="center"/>
+          </w:tcPr>
+          <w:p>
+            <w:pPr>
+              <w:spacing w:before="0" w:after="0"/>
+            </w:pPr>
+            <w:r>
+              <w:rPr>
+                <w:b/>
+                <w:i w:val="0"/>
+                <w:color w:val="4A2A82"/>
+                <w:sz w:val="19"/>
+              </w:rPr>
+              <w:t>Proiectul</w:t>
+            </w:r>
+          </w:p>
+        </w:tc>
+        <w:tc>
+          <w:tcPr>
+            <w:tcW w:type="dxa" w:w="6803"/>
+            <w:vAlign w:val="center"/>
+          </w:tcPr>
+          <w:p>
+            <w:pPr>
+              <w:spacing w:before="0" w:after="0"/>
+            </w:pPr>
+            <w:r>
+              <w:rPr>
+                <w:b w:val="0"/>
+                <w:i w:val="0"/>
+                <w:sz w:val="19"/>
+              </w:rPr>
+              <w:t>UNIC – Uniți pentru Nevoile Incluzive și Continuitatea Educației Elevilor</w:t>
+            </w:r>
+          </w:p>
+        </w:tc>
+      </w:tr>
+      <w:tr>
+        <w:trPr>
+          <w:cantSplit/>
+          <w:trHeight w:val="425" w:hRule="atLeast"/>
+        </w:trPr>
+        <w:tc>
+          <w:tcPr>
+            <w:tcW w:type="dxa" w:w="2835"/>
+            <w:shd w:val="clear" w:color="auto" w:fill="F1ECF9"/>
+            <w:vAlign w:val="center"/>
+          </w:tcPr>
+          <w:p>
+            <w:pPr>
+              <w:spacing w:before="0" w:after="0"/>
+            </w:pPr>
+            <w:r>
+              <w:rPr>
+                <w:b/>
+                <w:i w:val="0"/>
+                <w:color w:val="4A2A82"/>
+                <w:sz w:val="19"/>
+              </w:rPr>
+              <w:t>Cod / program</w:t>
+            </w:r>
+          </w:p>
+        </w:tc>
+        <w:tc>
+          <w:tcPr>
+            <w:tcW w:type="dxa" w:w="6803"/>
+            <w:vAlign w:val="center"/>
+          </w:tcPr>
+          <w:p>
+            <w:pPr>
+              <w:spacing w:before="0" w:after="0"/>
+            </w:pPr>
+            <w:r>
+              <w:rPr>
+                <w:b w:val="0"/>
+                <w:i w:val="0"/>
+                <w:sz w:val="19"/>
+              </w:rPr>
+              <w:t>cod MySMIS 352704  •  Programul Educație și Ocupare (PEO) 2021–2027</w:t>
+            </w:r>
+          </w:p>
+        </w:tc>
+      </w:tr>
+      <w:tr>
+        <w:trPr>
+          <w:cantSplit/>
+          <w:trHeight w:val="425" w:hRule="atLeast"/>
+        </w:trPr>
+        <w:tc>
+          <w:tcPr>
+            <w:tcW w:type="dxa" w:w="2835"/>
+            <w:shd w:val="clear" w:color="auto" w:fill="F1ECF9"/>
+            <w:vAlign w:val="center"/>
+          </w:tcPr>
+          <w:p>
+            <w:pPr>
+              <w:spacing w:before="0" w:after="0"/>
+            </w:pPr>
+            <w:r>
+              <w:rPr>
+                <w:b/>
+                <w:i w:val="0"/>
+                <w:color w:val="4A2A82"/>
+                <w:sz w:val="19"/>
+              </w:rPr>
+              <w:t>Activitatea / subactivitatea din proiect</w:t>
+            </w:r>
+          </w:p>
+        </w:tc>
+        <w:tc>
+          <w:tcPr>
+            <w:tcW w:type="dxa" w:w="6803"/>
+            <w:vAlign w:val="center"/>
+          </w:tcPr>
+          <w:p>
+            <w:pPr>
+              <w:tabs>
+                <w:tab w:pos="6520" w:val="right" w:leader="underscore"/>
+              </w:tabs>
+              <w:spacing w:before="60" w:after="0"/>
+            </w:pPr>
+            <w:r>
+              <w:rPr>
+                <w:color w:val="9A9A9A"/>
+                <w:sz w:val="19"/>
+              </w:rPr>
+              <w:tab/>
+            </w:r>
+          </w:p>
+        </w:tc>
+      </w:tr>
+      <w:tr>
+        <w:trPr>
+          <w:cantSplit/>
+          <w:trHeight w:val="425" w:hRule="atLeast"/>
+        </w:trPr>
+        <w:tc>
+          <w:tcPr>
+            <w:tcW w:type="dxa" w:w="2835"/>
+            <w:shd w:val="clear" w:color="auto" w:fill="F1ECF9"/>
+            <w:vAlign w:val="center"/>
+          </w:tcPr>
+          <w:p>
+            <w:pPr>
+              <w:spacing w:before="0" w:after="0"/>
+            </w:pPr>
+            <w:r>
+              <w:rPr>
+                <w:b/>
+                <w:i w:val="0"/>
+                <w:color w:val="4A2A82"/>
+                <w:sz w:val="19"/>
+              </w:rPr>
+              <w:t>Poziția în proiect</w:t>
+            </w:r>
+          </w:p>
+        </w:tc>
+        <w:tc>
+          <w:tcPr>
+            <w:tcW w:type="dxa" w:w="6803"/>
+            <w:vAlign w:val="center"/>
+          </w:tcPr>
+          <w:p>
+            <w:pPr>
+              <w:spacing w:before="0" w:after="0"/>
+            </w:pPr>
+            <w:r>
+              <w:rPr>
+                <w:b w:val="0"/>
+                <w:i w:val="0"/>
+                <w:sz w:val="19"/>
+              </w:rPr>
+              <w:t>Facilitator comunitar 2</w:t>
+            </w:r>
+          </w:p>
+        </w:tc>
+      </w:tr>
+      <w:tr>
+        <w:trPr>
+          <w:cantSplit/>
+          <w:trHeight w:val="425" w:hRule="atLeast"/>
+        </w:trPr>
+        <w:tc>
+          <w:tcPr>
+            <w:tcW w:type="dxa" w:w="2835"/>
+            <w:shd w:val="clear" w:color="auto" w:fill="F1ECF9"/>
+            <w:vAlign w:val="center"/>
+          </w:tcPr>
+          <w:p>
+            <w:pPr>
+              <w:spacing w:before="0" w:after="0"/>
+            </w:pPr>
+            <w:r>
+              <w:rPr>
+                <w:b/>
+                <w:i w:val="0"/>
+                <w:color w:val="4A2A82"/>
+                <w:sz w:val="19"/>
+              </w:rPr>
+              <w:t>Numele și prenumele expertului</w:t>
+            </w:r>
+          </w:p>
+        </w:tc>
+        <w:tc>
+          <w:tcPr>
+            <w:tcW w:type="dxa" w:w="6803"/>
+            <w:vAlign w:val="center"/>
+          </w:tcPr>
+          <w:p>
+            <w:pPr>
+              <w:tabs>
+                <w:tab w:pos="6520" w:val="right" w:leader="underscore"/>
+              </w:tabs>
+              <w:spacing w:before="60" w:after="0"/>
+            </w:pPr>
+            <w:r>
+              <w:rPr>
+                <w:color w:val="9A9A9A"/>
+                <w:sz w:val="19"/>
+              </w:rPr>
+              <w:tab/>
+            </w:r>
+          </w:p>
+        </w:tc>
+      </w:tr>
+      <w:tr>
+        <w:trPr>
+          <w:cantSplit/>
+          <w:trHeight w:val="425" w:hRule="atLeast"/>
+        </w:trPr>
+        <w:tc>
+          <w:tcPr>
+            <w:tcW w:type="dxa" w:w="2835"/>
+            <w:shd w:val="clear" w:color="auto" w:fill="F1ECF9"/>
+            <w:vAlign w:val="center"/>
+          </w:tcPr>
+          <w:p>
+            <w:pPr>
+              <w:spacing w:before="0" w:after="0"/>
+            </w:pPr>
+            <w:r>
+              <w:rPr>
+                <w:b/>
+                <w:i w:val="0"/>
+                <w:color w:val="4A2A82"/>
+                <w:sz w:val="19"/>
+              </w:rPr>
+              <w:t>Tipul activității</w:t>
+            </w:r>
+          </w:p>
+        </w:tc>
+        <w:tc>
+          <w:tcPr>
+            <w:tcW w:type="dxa" w:w="6803"/>
+            <w:vAlign w:val="center"/>
+          </w:tcPr>
+          <w:p>
+            <w:pPr>
+              <w:spacing w:before="0" w:after="0"/>
+            </w:pPr>
+            <w:r>
+              <w:rPr>
+                <w:b w:val="0"/>
+                <w:i w:val="0"/>
+                <w:sz w:val="19"/>
+              </w:rPr>
+              <w:t>Atelier de dezvoltare personală „Eu, punctele mele forte și ce mă motivează” – Ședința 1 din 2: „Cine sunt eu și ce am bun?”</w:t>
+            </w:r>
+          </w:p>
+        </w:tc>
+      </w:tr>
+      <w:tr>
+        <w:trPr>
+          <w:cantSplit/>
+          <w:trHeight w:val="425" w:hRule="atLeast"/>
+        </w:trPr>
+        <w:tc>
+          <w:tcPr>
+            <w:tcW w:type="dxa" w:w="2835"/>
+            <w:shd w:val="clear" w:color="auto" w:fill="F1ECF9"/>
+            <w:vAlign w:val="center"/>
+          </w:tcPr>
+          <w:p>
+            <w:pPr>
+              <w:spacing w:before="0" w:after="0"/>
+            </w:pPr>
+            <w:r>
+              <w:rPr>
+                <w:b/>
+                <w:i w:val="0"/>
+                <w:color w:val="4A2A82"/>
+                <w:sz w:val="19"/>
+              </w:rPr>
+              <w:t>Unitatea de învățământ / localitatea</w:t>
+            </w:r>
+          </w:p>
+        </w:tc>
+        <w:tc>
+          <w:tcPr>
+            <w:tcW w:type="dxa" w:w="6803"/>
+            <w:vAlign w:val="center"/>
+          </w:tcPr>
+          <w:p>
+            <w:pPr>
+              <w:tabs>
+                <w:tab w:pos="6520" w:val="right" w:leader="underscore"/>
+              </w:tabs>
+              <w:spacing w:before="60" w:after="0"/>
+            </w:pPr>
+            <w:r>
+              <w:rPr>
+                <w:color w:val="9A9A9A"/>
+                <w:sz w:val="19"/>
+              </w:rPr>
+              <w:tab/>
+            </w:r>
+          </w:p>
+        </w:tc>
+      </w:tr>
+      <w:tr>
+        <w:trPr>
+          <w:cantSplit/>
+          <w:trHeight w:val="425" w:hRule="atLeast"/>
+        </w:trPr>
+        <w:tc>
+          <w:tcPr>
+            <w:tcW w:type="dxa" w:w="2835"/>
+            <w:shd w:val="clear" w:color="auto" w:fill="F1ECF9"/>
+            <w:vAlign w:val="center"/>
+          </w:tcPr>
+          <w:p>
+            <w:pPr>
+              <w:spacing w:before="0" w:after="0"/>
+            </w:pPr>
+            <w:r>
+              <w:rPr>
+                <w:b/>
+                <w:i w:val="0"/>
+                <w:color w:val="4A2A82"/>
+                <w:sz w:val="19"/>
+              </w:rPr>
+              <w:t>Data desfășurării</w:t>
+            </w:r>
+          </w:p>
+        </w:tc>
+        <w:tc>
+          <w:tcPr>
+            <w:tcW w:type="dxa" w:w="6803"/>
+            <w:vAlign w:val="center"/>
+          </w:tcPr>
+          <w:p>
+            <w:pPr>
+              <w:tabs>
+                <w:tab w:pos="2608" w:val="right" w:leader="underscore"/>
+                <w:tab w:pos="6520" w:val="right" w:leader="underscore"/>
+              </w:tabs>
+              <w:spacing w:before="60" w:after="0"/>
+            </w:pPr>
+            <w:r>
+              <w:rPr>
+                <w:sz w:val="19"/>
+              </w:rPr>
+              <w:tab/>
+            </w:r>
+            <w:r>
+              <w:rPr>
+                <w:b w:val="0"/>
+                <w:sz w:val="19"/>
+              </w:rPr>
+              <w:t xml:space="preserve">   Interval orar: </w:t>
+            </w:r>
+            <w:r>
+              <w:rPr>
+                <w:sz w:val="19"/>
+              </w:rPr>
+              <w:tab/>
+            </w:r>
+          </w:p>
+        </w:tc>
+      </w:tr>
+      <w:tr>
+        <w:trPr>
+          <w:cantSplit/>
+          <w:trHeight w:val="425" w:hRule="atLeast"/>
+        </w:trPr>
+        <w:tc>
+          <w:tcPr>
+            <w:tcW w:type="dxa" w:w="2835"/>
+            <w:shd w:val="clear" w:color="auto" w:fill="F1ECF9"/>
+            <w:vAlign w:val="center"/>
+          </w:tcPr>
+          <w:p>
+            <w:pPr>
+              <w:spacing w:before="0" w:after="0"/>
+            </w:pPr>
+            <w:r>
+              <w:rPr>
+                <w:b/>
+                <w:i w:val="0"/>
+                <w:color w:val="4A2A82"/>
+                <w:sz w:val="19"/>
+              </w:rPr>
+              <w:t>Grupul țintă</w:t>
+            </w:r>
+          </w:p>
+        </w:tc>
+        <w:tc>
+          <w:tcPr>
+            <w:tcW w:type="dxa" w:w="6803"/>
+            <w:vAlign w:val="center"/>
+          </w:tcPr>
+          <w:p>
+            <w:pPr>
+              <w:spacing w:before="0" w:after="0"/>
+            </w:pPr>
+            <w:r>
+              <w:rPr>
+                <w:b w:val="0"/>
+                <w:i w:val="0"/>
+                <w:sz w:val="19"/>
+              </w:rPr>
+              <w:t>Elevi din clasele a VII-a – a VIII-a</w:t>
+            </w:r>
+          </w:p>
+        </w:tc>
+      </w:tr>
+      <w:tr>
+        <w:trPr>
+          <w:cantSplit/>
+          <w:trHeight w:val="425" w:hRule="atLeast"/>
+        </w:trPr>
+        <w:tc>
+          <w:tcPr>
+            <w:tcW w:type="dxa" w:w="2835"/>
+            <w:shd w:val="clear" w:color="auto" w:fill="F1ECF9"/>
+            <w:vAlign w:val="center"/>
+          </w:tcPr>
+          <w:p>
+            <w:pPr>
+              <w:spacing w:before="0" w:after="0"/>
+            </w:pPr>
+            <w:r>
+              <w:rPr>
+                <w:b/>
+                <w:i w:val="0"/>
+                <w:color w:val="4A2A82"/>
+                <w:sz w:val="19"/>
+              </w:rPr>
+              <w:t>Clasa / grupa</w:t>
+            </w:r>
+          </w:p>
+        </w:tc>
+        <w:tc>
+          <w:tcPr>
+            <w:tcW w:type="dxa" w:w="6803"/>
+            <w:vAlign w:val="center"/>
+          </w:tcPr>
+          <w:p>
+            <w:pPr>
+              <w:tabs>
+                <w:tab w:pos="2608" w:val="right" w:leader="underscore"/>
+                <w:tab w:pos="6520" w:val="right" w:leader="underscore"/>
+              </w:tabs>
+              <w:spacing w:before="60" w:after="0"/>
+            </w:pPr>
+            <w:r>
+              <w:rPr>
+                <w:sz w:val="19"/>
+              </w:rPr>
+              <w:tab/>
+            </w:r>
+            <w:r>
+              <w:rPr>
+                <w:b w:val="0"/>
+                <w:sz w:val="19"/>
+              </w:rPr>
+              <w:t xml:space="preserve">   Nr. participanți: </w:t>
+            </w:r>
+            <w:r>
+              <w:rPr>
+                <w:sz w:val="19"/>
+              </w:rPr>
+              <w:tab/>
+            </w:r>
+          </w:p>
+        </w:tc>
+      </w:tr>
+      <w:tr>
+        <w:trPr>
+          <w:cantSplit/>
+          <w:trHeight w:val="425" w:hRule="atLeast"/>
+        </w:trPr>
+        <w:tc>
+          <w:tcPr>
+            <w:tcW w:type="dxa" w:w="2835"/>
+            <w:shd w:val="clear" w:color="auto" w:fill="F1ECF9"/>
+            <w:vAlign w:val="center"/>
+          </w:tcPr>
+          <w:p>
+            <w:pPr>
+              <w:spacing w:before="0" w:after="0"/>
+            </w:pPr>
+            <w:r>
+              <w:rPr>
+                <w:b/>
+                <w:i w:val="0"/>
+                <w:color w:val="4A2A82"/>
+                <w:sz w:val="19"/>
+              </w:rPr>
+              <w:t>Durata sesiunii cu grupul țintă</w:t>
+            </w:r>
+          </w:p>
+        </w:tc>
+        <w:tc>
+          <w:tcPr>
+            <w:tcW w:type="dxa" w:w="6803"/>
+            <w:vAlign w:val="center"/>
+          </w:tcPr>
+          <w:p>
+            <w:pPr>
+              <w:spacing w:before="0" w:after="0"/>
+            </w:pPr>
+            <w:r>
+              <w:rPr>
+                <w:b w:val="0"/>
+                <w:i w:val="0"/>
+                <w:sz w:val="19"/>
+              </w:rPr>
+              <w:t>60 de minute (1 oră)</w:t>
+            </w:r>
+          </w:p>
+        </w:tc>
+      </w:tr>
+    </w:tbl>
+    <w:p>
+      <w:pPr>
+        <w:spacing w:before="0" w:after="0" w:line="120" w:lineRule="exact"/>
+      </w:pPr>
+      <w:r/>
+    </w:p>
+    <w:p>
+      <w:pPr>
+        <w:keepNext/>
+        <w:spacing w:before="160" w:after="80"/>
+      </w:pPr>
+      <w:r>
+        <w:rPr>
+          <w:b/>
+          <w:i w:val="0"/>
+          <w:color w:val="4A2A82"/>
+          <w:sz w:val="22"/>
+        </w:rPr>
+        <w:t>B. Descrierea pe scurt a activității</w:t>
+      </w:r>
+    </w:p>
+    <w:p>
+      <w:pPr>
+        <w:spacing w:before="0" w:after="80"/>
+        <w:jc w:val="both"/>
+      </w:pPr>
+      <w:r>
+        <w:rPr>
+          <w:b w:val="0"/>
+          <w:i w:val="0"/>
+          <w:sz w:val="20"/>
+        </w:rPr>
+        <w:t>Ședința face parte dintr-un atelier de dezvoltare personală de 2 ședințe a câte 60 de minute, destinat elevilor din clasele a VII-a – a VIII-a. Scopul ședinței este dezvoltarea autocunoașterii prin identificarea punctelor forte și a resurselor personale, precum și exersarea oferirii și primirii feedbackului pozitiv.</w:t>
+      </w:r>
+    </w:p>
+    <w:p>
+      <w:pPr>
+        <w:spacing w:before="0" w:after="80"/>
+        <w:jc w:val="both"/>
+      </w:pPr>
+      <w:r>
+        <w:rPr>
+          <w:b w:val="0"/>
+          <w:i w:val="0"/>
+          <w:sz w:val="20"/>
+        </w:rPr>
+        <w:t>Activitatea a fost proiectată și realizată de facilitatorul comunitar: elaborarea scenariului detaliat și a 9 materiale-suport (Anexele 1–9), pregătirea logistică, facilitarea directă a ședinței cu grupul țintă, evaluarea și raportarea rezultatelor. Ședința cuprinde 7 secvențe de învățare experiențială (joc de energizare, exercițiu anonim, interviu în perechi, hartă colectivă a resurselor, studiu de caz, cerc de feedback, reflecție individuală), descrise la secțiunea 9.</w:t>
+      </w:r>
+    </w:p>
+    <w:p>
+      <w:pPr>
+        <w:keepNext/>
+        <w:spacing w:before="160" w:after="80"/>
+      </w:pPr>
+      <w:r>
+        <w:rPr>
+          <w:b/>
+          <w:i w:val="0"/>
+          <w:color w:val="4A2A82"/>
+          <w:sz w:val="22"/>
+        </w:rPr>
+        <w:t>C. Repartizarea timpului de lucru al expertului</w:t>
+      </w:r>
+    </w:p>
+    <w:tbl>
+      <w:tblPr>
+        <w:tblW w:w="9639" w:type="dxa"/>
+        <w:jc w:val="center"/>
+        <w:tblBorders>
           <w:top w:val="single" w:sz="4" w:space="0" w:color="DCD0F0"/>
           <w:left w:val="single" w:sz="4" w:space="0" w:color="DCD0F0"/>
           <w:bottom w:val="single" w:sz="4" w:space="0" w:color="DCD0F0"/>
@@ -119,67 +833,92 @@
         <w:tblLook w:firstColumn="1" w:firstRow="1" w:lastColumn="0" w:lastRow="0" w:noHBand="0" w:noVBand="1" w:val="04A0"/>
       </w:tblPr>
       <w:tblGrid>
-        <w:gridCol w:w="1644"/>
-        <w:gridCol w:w="3175"/>
-        <w:gridCol w:w="1644"/>
-        <w:gridCol w:w="3175"/>
+        <w:gridCol w:w="510"/>
+        <w:gridCol w:w="2041"/>
+        <w:gridCol w:w="4989"/>
+        <w:gridCol w:w="1190"/>
+        <w:gridCol w:w="907"/>
       </w:tblGrid>
       <w:tr>
-        <w:tc>
-          <w:tcPr>
-            <w:tcW w:type="dxa" w:w="1644"/>
-            <w:shd w:val="clear" w:color="auto" w:fill="F1ECF9"/>
-          </w:tcPr>
-          <w:p>
-            <w:pPr>
-              <w:spacing w:before="0" w:after="0"/>
-            </w:pPr>
-            <w:r>
-              <w:rPr>
-                <w:b/>
-                <w:i w:val="0"/>
-                <w:color w:val="4A2A82"/>
-                <w:sz w:val="19"/>
-              </w:rPr>
-              <w:t>Școala</w:t>
-            </w:r>
-          </w:p>
-        </w:tc>
-        <w:tc>
-          <w:tcPr>
-            <w:tcW w:type="dxa" w:w="3175"/>
-          </w:tcPr>
-          <w:p>
-            <w:pPr>
-              <w:tabs>
-                <w:tab w:pos="2948" w:val="right" w:leader="underscore"/>
-              </w:tabs>
-              <w:spacing w:before="40" w:after="0"/>
-            </w:pPr>
-            <w:r>
-              <w:rPr>
-                <w:color w:val="9A9A9A"/>
-                <w:sz w:val="19"/>
-              </w:rPr>
-              <w:tab/>
-            </w:r>
-          </w:p>
-        </w:tc>
-        <w:tc>
-          <w:tcPr>
-            <w:tcW w:type="dxa" w:w="1644"/>
-            <w:shd w:val="clear" w:color="auto" w:fill="F1ECF9"/>
-          </w:tcPr>
-          <w:p>
-            <w:pPr>
-              <w:spacing w:before="0" w:after="0"/>
-            </w:pPr>
-            <w:r>
-              <w:rPr>
-                <w:b/>
-                <w:i w:val="0"/>
-                <w:color w:val="4A2A82"/>
-                <w:sz w:val="19"/>
+        <w:trPr>
+          <w:cantSplit/>
+          <w:tblHeader/>
+        </w:trPr>
+        <w:tc>
+          <w:tcPr>
+            <w:tcW w:type="dxa" w:w="510"/>
+            <w:shd w:val="clear" w:color="auto" w:fill="4A2A82"/>
+          </w:tcPr>
+          <w:p>
+            <w:pPr>
+              <w:spacing w:before="0" w:after="0"/>
+            </w:pPr>
+            <w:r>
+              <w:rPr>
+                <w:b/>
+                <w:i w:val="0"/>
+                <w:color w:val="FFFFFF"/>
+                <w:sz w:val="18"/>
+              </w:rPr>
+              <w:t>Nr.</w:t>
+            </w:r>
+          </w:p>
+        </w:tc>
+        <w:tc>
+          <w:tcPr>
+            <w:tcW w:type="dxa" w:w="2041"/>
+            <w:shd w:val="clear" w:color="auto" w:fill="4A2A82"/>
+          </w:tcPr>
+          <w:p>
+            <w:pPr>
+              <w:spacing w:before="0" w:after="0"/>
+            </w:pPr>
+            <w:r>
+              <w:rPr>
+                <w:b/>
+                <w:i w:val="0"/>
+                <w:color w:val="FFFFFF"/>
+                <w:sz w:val="18"/>
+              </w:rPr>
+              <w:t>Etapa</w:t>
+            </w:r>
+          </w:p>
+        </w:tc>
+        <w:tc>
+          <w:tcPr>
+            <w:tcW w:type="dxa" w:w="4989"/>
+            <w:shd w:val="clear" w:color="auto" w:fill="4A2A82"/>
+          </w:tcPr>
+          <w:p>
+            <w:pPr>
+              <w:spacing w:before="0" w:after="0"/>
+            </w:pPr>
+            <w:r>
+              <w:rPr>
+                <w:b/>
+                <w:i w:val="0"/>
+                <w:color w:val="FFFFFF"/>
+                <w:sz w:val="18"/>
+              </w:rPr>
+              <w:t>Activități realizate concret</w:t>
+            </w:r>
+          </w:p>
+        </w:tc>
+        <w:tc>
+          <w:tcPr>
+            <w:tcW w:type="dxa" w:w="1191"/>
+            <w:shd w:val="clear" w:color="auto" w:fill="4A2A82"/>
+          </w:tcPr>
+          <w:p>
+            <w:pPr>
+              <w:spacing w:before="0" w:after="0"/>
+            </w:pPr>
+            <w:r>
+              <w:rPr>
+                <w:b/>
+                <w:i w:val="0"/>
+                <w:color w:val="FFFFFF"/>
+                <w:sz w:val="18"/>
               </w:rPr>
               <w:t>Data</w:t>
             </w:r>
@@ -187,182 +926,1150 @@
         </w:tc>
         <w:tc>
           <w:tcPr>
-            <w:tcW w:type="dxa" w:w="3175"/>
-          </w:tcPr>
-          <w:p>
-            <w:pPr>
-              <w:tabs>
-                <w:tab w:pos="2948" w:val="right" w:leader="underscore"/>
-              </w:tabs>
-              <w:spacing w:before="40" w:after="0"/>
-            </w:pPr>
-            <w:r>
-              <w:rPr>
-                <w:color w:val="9A9A9A"/>
-                <w:sz w:val="19"/>
-              </w:rPr>
-              <w:tab/>
+            <w:tcW w:type="dxa" w:w="907"/>
+            <w:shd w:val="clear" w:color="auto" w:fill="4A2A82"/>
+          </w:tcPr>
+          <w:p>
+            <w:pPr>
+              <w:spacing w:before="0" w:after="0"/>
+            </w:pPr>
+            <w:r>
+              <w:rPr>
+                <w:b/>
+                <w:i w:val="0"/>
+                <w:color w:val="FFFFFF"/>
+                <w:sz w:val="18"/>
+              </w:rPr>
+              <w:t>Nr. ore</w:t>
             </w:r>
           </w:p>
         </w:tc>
       </w:tr>
       <w:tr>
-        <w:tc>
-          <w:tcPr>
-            <w:tcW w:type="dxa" w:w="1644"/>
-            <w:shd w:val="clear" w:color="auto" w:fill="F1ECF9"/>
-          </w:tcPr>
-          <w:p>
-            <w:pPr>
-              <w:spacing w:before="0" w:after="0"/>
-            </w:pPr>
-            <w:r>
-              <w:rPr>
-                <w:b/>
-                <w:i w:val="0"/>
-                <w:color w:val="4A2A82"/>
-                <w:sz w:val="19"/>
-              </w:rPr>
-              <w:t>Clasa / grupa</w:t>
-            </w:r>
-          </w:p>
-        </w:tc>
-        <w:tc>
-          <w:tcPr>
-            <w:tcW w:type="dxa" w:w="3175"/>
-          </w:tcPr>
-          <w:p>
-            <w:pPr>
-              <w:tabs>
-                <w:tab w:pos="2948" w:val="right" w:leader="underscore"/>
-              </w:tabs>
-              <w:spacing w:before="40" w:after="0"/>
-            </w:pPr>
-            <w:r>
-              <w:rPr>
-                <w:color w:val="9A9A9A"/>
-                <w:sz w:val="19"/>
-              </w:rPr>
-              <w:tab/>
-            </w:r>
-          </w:p>
-        </w:tc>
-        <w:tc>
-          <w:tcPr>
-            <w:tcW w:type="dxa" w:w="1644"/>
-            <w:shd w:val="clear" w:color="auto" w:fill="F1ECF9"/>
-          </w:tcPr>
-          <w:p>
-            <w:pPr>
-              <w:spacing w:before="0" w:after="0"/>
-            </w:pPr>
-            <w:r>
-              <w:rPr>
-                <w:b/>
-                <w:i w:val="0"/>
-                <w:color w:val="4A2A82"/>
-                <w:sz w:val="19"/>
-              </w:rPr>
-              <w:t>Nr. participanți</w:t>
-            </w:r>
-          </w:p>
-        </w:tc>
-        <w:tc>
-          <w:tcPr>
-            <w:tcW w:type="dxa" w:w="3175"/>
-          </w:tcPr>
-          <w:p>
-            <w:pPr>
-              <w:tabs>
-                <w:tab w:pos="2948" w:val="right" w:leader="underscore"/>
-              </w:tabs>
-              <w:spacing w:before="40" w:after="0"/>
-            </w:pPr>
-            <w:r>
-              <w:rPr>
-                <w:color w:val="9A9A9A"/>
-                <w:sz w:val="19"/>
-              </w:rPr>
-              <w:tab/>
-            </w:r>
+        <w:trPr>
+          <w:cantSplit/>
+        </w:trPr>
+        <w:tc>
+          <w:tcPr>
+            <w:tcW w:type="dxa" w:w="510"/>
+          </w:tcPr>
+          <w:p>
+            <w:pPr>
+              <w:spacing w:before="0" w:after="0"/>
+            </w:pPr>
+            <w:r>
+              <w:rPr>
+                <w:b w:val="0"/>
+                <w:i w:val="0"/>
+                <w:sz w:val="18"/>
+              </w:rPr>
+              <w:t>1</w:t>
+            </w:r>
+          </w:p>
+        </w:tc>
+        <w:tc>
+          <w:tcPr>
+            <w:tcW w:type="dxa" w:w="2041"/>
+          </w:tcPr>
+          <w:p>
+            <w:pPr>
+              <w:spacing w:before="0" w:after="0"/>
+            </w:pPr>
+            <w:r>
+              <w:rPr>
+                <w:b w:val="0"/>
+                <w:i w:val="0"/>
+                <w:sz w:val="18"/>
+              </w:rPr>
+              <w:t>Documentare și proiectare</w:t>
+            </w:r>
+          </w:p>
+        </w:tc>
+        <w:tc>
+          <w:tcPr>
+            <w:tcW w:type="dxa" w:w="4989"/>
+          </w:tcPr>
+          <w:p>
+            <w:pPr>
+              <w:spacing w:before="0" w:after="0"/>
+            </w:pPr>
+            <w:r>
+              <w:rPr>
+                <w:b w:val="0"/>
+                <w:i w:val="0"/>
+                <w:sz w:val="18"/>
+              </w:rPr>
+              <w:t>Analiza nevoilor grupului țintă; documentare privind metode de dezvoltare personală adaptate vârstei de 13–14 ani; elaborarea scenariului detaliat (obiective, etape, timp, replici, întrebări de reflecție, gestionarea situațiilor dificile).</w:t>
+            </w:r>
+          </w:p>
+        </w:tc>
+        <w:tc>
+          <w:tcPr>
+            <w:tcW w:type="dxa" w:w="1191"/>
+          </w:tcPr>
+          <w:p>
+            <w:pPr>
+              <w:spacing w:before="0" w:after="0"/>
+            </w:pPr>
+          </w:p>
+        </w:tc>
+        <w:tc>
+          <w:tcPr>
+            <w:tcW w:type="dxa" w:w="907"/>
+          </w:tcPr>
+          <w:p>
+            <w:pPr>
+              <w:spacing w:before="0" w:after="0"/>
+            </w:pPr>
           </w:p>
         </w:tc>
       </w:tr>
       <w:tr>
-        <w:tc>
-          <w:tcPr>
-            <w:tcW w:type="dxa" w:w="1644"/>
-            <w:shd w:val="clear" w:color="auto" w:fill="F1ECF9"/>
-          </w:tcPr>
-          <w:p>
-            <w:pPr>
-              <w:spacing w:before="0" w:after="0"/>
-            </w:pPr>
-            <w:r>
-              <w:rPr>
-                <w:b/>
-                <w:i w:val="0"/>
+        <w:trPr>
+          <w:cantSplit/>
+        </w:trPr>
+        <w:tc>
+          <w:tcPr>
+            <w:tcW w:type="dxa" w:w="510"/>
+          </w:tcPr>
+          <w:p>
+            <w:pPr>
+              <w:spacing w:before="0" w:after="0"/>
+            </w:pPr>
+            <w:r>
+              <w:rPr>
+                <w:b w:val="0"/>
+                <w:i w:val="0"/>
+                <w:sz w:val="18"/>
+              </w:rPr>
+              <w:t>2</w:t>
+            </w:r>
+          </w:p>
+        </w:tc>
+        <w:tc>
+          <w:tcPr>
+            <w:tcW w:type="dxa" w:w="2041"/>
+          </w:tcPr>
+          <w:p>
+            <w:pPr>
+              <w:spacing w:before="0" w:after="0"/>
+            </w:pPr>
+            <w:r>
+              <w:rPr>
+                <w:b w:val="0"/>
+                <w:i w:val="0"/>
+                <w:sz w:val="18"/>
+              </w:rPr>
+              <w:t>Elaborarea materialelor-suport</w:t>
+            </w:r>
+          </w:p>
+        </w:tc>
+        <w:tc>
+          <w:tcPr>
+            <w:tcW w:type="dxa" w:w="4989"/>
+          </w:tcPr>
+          <w:p>
+            <w:pPr>
+              <w:spacing w:before="0" w:after="0"/>
+            </w:pPr>
+            <w:r>
+              <w:rPr>
+                <w:b w:val="0"/>
+                <w:i w:val="0"/>
+                <w:sz w:val="18"/>
+              </w:rPr>
+              <w:t>Conceperea și redactarea celor 9 anexe: ecusoane, bilețele „Dosar secret”, Fișa 1 – Detectivul, indicatoare, cartonașe „Misiunea imposibilă”, banca de complimente, Cardul de agent, Fișa 2 – Harta mea, bilet de ieșire.</w:t>
+            </w:r>
+          </w:p>
+        </w:tc>
+        <w:tc>
+          <w:tcPr>
+            <w:tcW w:type="dxa" w:w="1191"/>
+          </w:tcPr>
+          <w:p>
+            <w:pPr>
+              <w:spacing w:before="0" w:after="0"/>
+            </w:pPr>
+          </w:p>
+        </w:tc>
+        <w:tc>
+          <w:tcPr>
+            <w:tcW w:type="dxa" w:w="907"/>
+          </w:tcPr>
+          <w:p>
+            <w:pPr>
+              <w:spacing w:before="0" w:after="0"/>
+            </w:pPr>
+          </w:p>
+        </w:tc>
+      </w:tr>
+      <w:tr>
+        <w:trPr>
+          <w:cantSplit/>
+        </w:trPr>
+        <w:tc>
+          <w:tcPr>
+            <w:tcW w:type="dxa" w:w="510"/>
+          </w:tcPr>
+          <w:p>
+            <w:pPr>
+              <w:spacing w:before="0" w:after="0"/>
+            </w:pPr>
+            <w:r>
+              <w:rPr>
+                <w:b w:val="0"/>
+                <w:i w:val="0"/>
+                <w:sz w:val="18"/>
+              </w:rPr>
+              <w:t>3</w:t>
+            </w:r>
+          </w:p>
+        </w:tc>
+        <w:tc>
+          <w:tcPr>
+            <w:tcW w:type="dxa" w:w="2041"/>
+          </w:tcPr>
+          <w:p>
+            <w:pPr>
+              <w:spacing w:before="0" w:after="0"/>
+            </w:pPr>
+            <w:r>
+              <w:rPr>
+                <w:b w:val="0"/>
+                <w:i w:val="0"/>
+                <w:sz w:val="18"/>
+              </w:rPr>
+              <w:t>Pregătire logistică</w:t>
+            </w:r>
+          </w:p>
+        </w:tc>
+        <w:tc>
+          <w:tcPr>
+            <w:tcW w:type="dxa" w:w="4989"/>
+          </w:tcPr>
+          <w:p>
+            <w:pPr>
+              <w:spacing w:before="0" w:after="0"/>
+            </w:pPr>
+            <w:r>
+              <w:rPr>
+                <w:b w:val="0"/>
+                <w:i w:val="0"/>
+                <w:sz w:val="18"/>
+              </w:rPr>
+              <w:t>Comunicarea cu unitatea de învățământ (stabilirea datei, a sălii și a grupului); multiplicarea și decuparea materialelor; pregătirea consumabilelor; amenajarea sălii.</w:t>
+            </w:r>
+          </w:p>
+        </w:tc>
+        <w:tc>
+          <w:tcPr>
+            <w:tcW w:type="dxa" w:w="1191"/>
+          </w:tcPr>
+          <w:p>
+            <w:pPr>
+              <w:spacing w:before="0" w:after="0"/>
+            </w:pPr>
+          </w:p>
+        </w:tc>
+        <w:tc>
+          <w:tcPr>
+            <w:tcW w:type="dxa" w:w="907"/>
+          </w:tcPr>
+          <w:p>
+            <w:pPr>
+              <w:spacing w:before="0" w:after="0"/>
+            </w:pPr>
+          </w:p>
+        </w:tc>
+      </w:tr>
+      <w:tr>
+        <w:trPr>
+          <w:cantSplit/>
+        </w:trPr>
+        <w:tc>
+          <w:tcPr>
+            <w:tcW w:type="dxa" w:w="510"/>
+          </w:tcPr>
+          <w:p>
+            <w:pPr>
+              <w:spacing w:before="0" w:after="0"/>
+            </w:pPr>
+            <w:r>
+              <w:rPr>
+                <w:b w:val="0"/>
+                <w:i w:val="0"/>
+                <w:sz w:val="18"/>
+              </w:rPr>
+              <w:t>4</w:t>
+            </w:r>
+          </w:p>
+        </w:tc>
+        <w:tc>
+          <w:tcPr>
+            <w:tcW w:type="dxa" w:w="2041"/>
+          </w:tcPr>
+          <w:p>
+            <w:pPr>
+              <w:spacing w:before="0" w:after="0"/>
+            </w:pPr>
+            <w:r>
+              <w:rPr>
+                <w:b w:val="0"/>
+                <w:i w:val="0"/>
+                <w:sz w:val="18"/>
+              </w:rPr>
+              <w:t>Desfășurarea activității cu grupul țintă</w:t>
+            </w:r>
+          </w:p>
+        </w:tc>
+        <w:tc>
+          <w:tcPr>
+            <w:tcW w:type="dxa" w:w="4989"/>
+          </w:tcPr>
+          <w:p>
+            <w:pPr>
+              <w:spacing w:before="0" w:after="0"/>
+            </w:pPr>
+            <w:r>
+              <w:rPr>
+                <w:b w:val="0"/>
+                <w:i w:val="0"/>
+                <w:sz w:val="18"/>
+              </w:rPr>
+              <w:t>Facilitarea atelierului (60 de minute) conform scenariului; gestionarea listei de prezență; realizarea fotografiilor.</w:t>
+            </w:r>
+          </w:p>
+        </w:tc>
+        <w:tc>
+          <w:tcPr>
+            <w:tcW w:type="dxa" w:w="1191"/>
+          </w:tcPr>
+          <w:p>
+            <w:pPr>
+              <w:spacing w:before="0" w:after="0"/>
+            </w:pPr>
+          </w:p>
+        </w:tc>
+        <w:tc>
+          <w:tcPr>
+            <w:tcW w:type="dxa" w:w="907"/>
+          </w:tcPr>
+          <w:p>
+            <w:pPr>
+              <w:spacing w:before="0" w:after="0"/>
+            </w:pPr>
+          </w:p>
+        </w:tc>
+      </w:tr>
+      <w:tr>
+        <w:trPr>
+          <w:cantSplit/>
+        </w:trPr>
+        <w:tc>
+          <w:tcPr>
+            <w:tcW w:type="dxa" w:w="510"/>
+          </w:tcPr>
+          <w:p>
+            <w:pPr>
+              <w:spacing w:before="0" w:after="0"/>
+            </w:pPr>
+            <w:r>
+              <w:rPr>
+                <w:b w:val="0"/>
+                <w:i w:val="0"/>
+                <w:sz w:val="18"/>
+              </w:rPr>
+              <w:t>5</w:t>
+            </w:r>
+          </w:p>
+        </w:tc>
+        <w:tc>
+          <w:tcPr>
+            <w:tcW w:type="dxa" w:w="2041"/>
+          </w:tcPr>
+          <w:p>
+            <w:pPr>
+              <w:spacing w:before="0" w:after="0"/>
+            </w:pPr>
+            <w:r>
+              <w:rPr>
+                <w:b w:val="0"/>
+                <w:i w:val="0"/>
+                <w:sz w:val="18"/>
+              </w:rPr>
+              <w:t>Evaluare și raportare</w:t>
+            </w:r>
+          </w:p>
+        </w:tc>
+        <w:tc>
+          <w:tcPr>
+            <w:tcW w:type="dxa" w:w="4989"/>
+          </w:tcPr>
+          <w:p>
+            <w:pPr>
+              <w:spacing w:before="0" w:after="0"/>
+            </w:pPr>
+            <w:r>
+              <w:rPr>
+                <w:b w:val="0"/>
+                <w:i w:val="0"/>
+                <w:sz w:val="18"/>
+              </w:rPr>
+              <w:t>Analiza biletelor de ieșire și a produselor elevilor; completarea raportului de desfășurare; centralizarea documentelor justificative; ajustarea planului pentru Ședința 2.</w:t>
+            </w:r>
+          </w:p>
+        </w:tc>
+        <w:tc>
+          <w:tcPr>
+            <w:tcW w:type="dxa" w:w="1191"/>
+          </w:tcPr>
+          <w:p>
+            <w:pPr>
+              <w:spacing w:before="0" w:after="0"/>
+            </w:pPr>
+          </w:p>
+        </w:tc>
+        <w:tc>
+          <w:tcPr>
+            <w:tcW w:type="dxa" w:w="907"/>
+          </w:tcPr>
+          <w:p>
+            <w:pPr>
+              <w:spacing w:before="0" w:after="0"/>
+            </w:pPr>
+          </w:p>
+        </w:tc>
+      </w:tr>
+      <w:tr>
+        <w:trPr>
+          <w:cantSplit/>
+        </w:trPr>
+        <w:tc>
+          <w:tcPr>
+            <w:tcW w:type="dxa" w:w="510"/>
+            <w:shd w:val="clear" w:color="auto" w:fill="FFF4D2"/>
+          </w:tcPr>
+          <w:p>
+            <w:pPr>
+              <w:spacing w:before="0" w:after="0"/>
+            </w:pPr>
+          </w:p>
+        </w:tc>
+        <w:tc>
+          <w:tcPr>
+            <w:tcW w:type="dxa" w:w="2041"/>
+            <w:shd w:val="clear" w:color="auto" w:fill="FFF4D2"/>
+          </w:tcPr>
+          <w:p>
+            <w:pPr>
+              <w:spacing w:before="0" w:after="0"/>
+            </w:pPr>
+            <w:r>
+              <w:rPr>
+                <w:b/>
+                <w:i w:val="0"/>
+                <w:sz w:val="18"/>
+              </w:rPr>
+              <w:t>TOTAL ORE</w:t>
+            </w:r>
+          </w:p>
+        </w:tc>
+        <w:tc>
+          <w:tcPr>
+            <w:tcW w:type="dxa" w:w="4989"/>
+            <w:shd w:val="clear" w:color="auto" w:fill="FFF4D2"/>
+          </w:tcPr>
+          <w:p>
+            <w:pPr>
+              <w:spacing w:before="0" w:after="0"/>
+            </w:pPr>
+          </w:p>
+        </w:tc>
+        <w:tc>
+          <w:tcPr>
+            <w:tcW w:type="dxa" w:w="1191"/>
+            <w:shd w:val="clear" w:color="auto" w:fill="FFF4D2"/>
+          </w:tcPr>
+          <w:p>
+            <w:pPr>
+              <w:spacing w:before="0" w:after="0"/>
+            </w:pPr>
+          </w:p>
+        </w:tc>
+        <w:tc>
+          <w:tcPr>
+            <w:tcW w:type="dxa" w:w="907"/>
+            <w:shd w:val="clear" w:color="auto" w:fill="FFF4D2"/>
+          </w:tcPr>
+          <w:p>
+            <w:pPr>
+              <w:spacing w:before="0" w:after="0"/>
+            </w:pPr>
+          </w:p>
+        </w:tc>
+      </w:tr>
+    </w:tbl>
+    <w:p>
+      <w:pPr>
+        <w:spacing w:before="0" w:after="0" w:line="120" w:lineRule="exact"/>
+      </w:pPr>
+      <w:r/>
+    </w:p>
+    <w:p>
+      <w:pPr>
+        <w:spacing w:before="0" w:after="80"/>
+      </w:pPr>
+      <w:r>
+        <w:rPr>
+          <w:b w:val="0"/>
+          <w:i/>
+          <w:color w:val="666666"/>
+          <w:sz w:val="17"/>
+        </w:rPr>
+        <w:t>Datele și numărul de ore se completează în concordanță cu fișa de pontaj (timesheet-ul) lunar și cu atribuțiile din fișa postului.</w:t>
+      </w:r>
+    </w:p>
+    <w:p>
+      <w:pPr>
+        <w:keepNext/>
+        <w:spacing w:before="160" w:after="80"/>
+      </w:pPr>
+      <w:r>
+        <w:rPr>
+          <w:b/>
+          <w:i w:val="0"/>
+          <w:color w:val="4A2A82"/>
+          <w:sz w:val="22"/>
+        </w:rPr>
+        <w:t>D. Rezultate și livrabile</w:t>
+      </w:r>
+    </w:p>
+    <w:p>
+      <w:pPr>
+        <w:tabs>
+          <w:tab w:pos="283" w:val="left"/>
+        </w:tabs>
+        <w:spacing w:after="40" w:before="0"/>
+        <w:ind w:left="283" w:hanging="238"/>
+      </w:pPr>
+      <w:r>
+        <w:rPr>
+          <w:b/>
+          <w:color w:val="4A2A82"/>
+          <w:sz w:val="20"/>
+        </w:rPr>
+        <w:t>▪</w:t>
+        <w:tab/>
+      </w:r>
+      <w:r>
+        <w:rPr>
+          <w:b w:val="0"/>
+          <w:i w:val="0"/>
+          <w:sz w:val="20"/>
+        </w:rPr>
+        <w:t>Scenariul complet al Ședinței 1 (prezentul document), cu 9 materiale-suport (Anexele 1–9).</w:t>
+      </w:r>
+    </w:p>
+    <w:p>
+      <w:pPr>
+        <w:tabs>
+          <w:tab w:pos="283" w:val="left"/>
+        </w:tabs>
+        <w:spacing w:after="40" w:before="0"/>
+        <w:ind w:left="283" w:hanging="238"/>
+      </w:pPr>
+      <w:r>
+        <w:rPr>
+          <w:b/>
+          <w:color w:val="4A2A82"/>
+          <w:sz w:val="20"/>
+        </w:rPr>
+        <w:t>▪</w:t>
+        <w:tab/>
+      </w:r>
+      <w:r>
+        <w:rPr>
+          <w:b w:val="0"/>
+          <w:i w:val="0"/>
+          <w:sz w:val="20"/>
+        </w:rPr>
+        <w:t>Ședință de 60 de minute desfășurată cu elevi din clasele a VII-a – a VIII-a (numărul de participanți – conform listei de prezență).</w:t>
+      </w:r>
+    </w:p>
+    <w:p>
+      <w:pPr>
+        <w:tabs>
+          <w:tab w:pos="283" w:val="left"/>
+        </w:tabs>
+        <w:spacing w:after="40" w:before="0"/>
+        <w:ind w:left="283" w:hanging="238"/>
+      </w:pPr>
+      <w:r>
+        <w:rPr>
+          <w:b/>
+          <w:color w:val="4A2A82"/>
+          <w:sz w:val="20"/>
+        </w:rPr>
+        <w:t>▪</w:t>
+        <w:tab/>
+      </w:r>
+      <w:r>
+        <w:rPr>
+          <w:b w:val="0"/>
+          <w:i w:val="0"/>
+          <w:sz w:val="20"/>
+        </w:rPr>
+        <w:t>Produse ale elevilor: Fișa 1 – Detectivul, Harta echipei (afiș colectiv), Cardurile de agent, biletele de ieșire.</w:t>
+      </w:r>
+    </w:p>
+    <w:p>
+      <w:pPr>
+        <w:tabs>
+          <w:tab w:pos="283" w:val="left"/>
+        </w:tabs>
+        <w:spacing w:after="40" w:before="0"/>
+        <w:ind w:left="283" w:hanging="238"/>
+      </w:pPr>
+      <w:r>
+        <w:rPr>
+          <w:b/>
+          <w:color w:val="4A2A82"/>
+          <w:sz w:val="20"/>
+        </w:rPr>
+        <w:t>▪</w:t>
+        <w:tab/>
+      </w:r>
+      <w:r>
+        <w:rPr>
+          <w:b w:val="0"/>
+          <w:i w:val="0"/>
+          <w:sz w:val="20"/>
+        </w:rPr>
+        <w:t>Raportul privind desfășurarea activității (secțiunea 12).</w:t>
+      </w:r>
+    </w:p>
+    <w:p>
+      <w:pPr>
+        <w:keepNext/>
+        <w:spacing w:before="160" w:after="80"/>
+      </w:pPr>
+      <w:r>
+        <w:rPr>
+          <w:b/>
+          <w:i w:val="0"/>
+          <w:color w:val="4A2A82"/>
+          <w:sz w:val="22"/>
+        </w:rPr>
+        <w:t>E. Documente doveditoare anexate</w:t>
+      </w:r>
+    </w:p>
+    <w:tbl>
+      <w:tblPr>
+        <w:tblW w:w="9639" w:type="dxa"/>
+        <w:jc w:val="center"/>
+        <w:tblBorders>
+          <w:top w:val="nil"/>
+          <w:left w:val="nil"/>
+          <w:bottom w:val="nil"/>
+          <w:right w:val="nil"/>
+          <w:insideH w:val="nil"/>
+          <w:insideV w:val="nil"/>
+        </w:tblBorders>
+        <w:tblLayout w:type="fixed"/>
+        <w:tblCellMar>
+          <w:top w:w="22" w:type="dxa"/>
+          <w:left w:w="28" w:type="dxa"/>
+          <w:bottom w:w="22" w:type="dxa"/>
+          <w:right w:w="28" w:type="dxa"/>
+        </w:tblCellMar>
+        <w:tblLook w:firstColumn="1" w:firstRow="1" w:lastColumn="0" w:lastRow="0" w:noHBand="0" w:noVBand="1" w:val="04A0"/>
+      </w:tblPr>
+      <w:tblGrid>
+        <w:gridCol w:w="4819"/>
+        <w:gridCol w:w="4819"/>
+      </w:tblGrid>
+      <w:tr>
+        <w:tc>
+          <w:tcPr>
+            <w:tcW w:type="dxa" w:w="4819"/>
+          </w:tcPr>
+          <w:p>
+            <w:pPr>
+              <w:spacing w:before="0" w:after="0"/>
+            </w:pPr>
+            <w:r>
+              <w:rPr>
                 <w:color w:val="4A2A82"/>
-                <w:sz w:val="19"/>
-              </w:rPr>
-              <w:t>Facilitator</w:t>
-            </w:r>
-          </w:p>
-        </w:tc>
-        <w:tc>
-          <w:tcPr>
-            <w:tcW w:type="dxa" w:w="3175"/>
-          </w:tcPr>
+                <w:sz w:val="23"/>
+              </w:rPr>
+              <w:t xml:space="preserve">☐ </w:t>
+            </w:r>
+            <w:r>
+              <w:rPr>
+                <w:b w:val="0"/>
+                <w:i w:val="0"/>
+                <w:sz w:val="19"/>
+              </w:rPr>
+              <w:t>Lista de prezență semnată de participanți</w:t>
+            </w:r>
+          </w:p>
+        </w:tc>
+        <w:tc>
+          <w:tcPr>
+            <w:tcW w:type="dxa" w:w="4819"/>
+          </w:tcPr>
+          <w:p>
+            <w:pPr>
+              <w:spacing w:before="0" w:after="0"/>
+            </w:pPr>
+            <w:r>
+              <w:rPr>
+                <w:color w:val="4A2A82"/>
+                <w:sz w:val="23"/>
+              </w:rPr>
+              <w:t xml:space="preserve">☐ </w:t>
+            </w:r>
+            <w:r>
+              <w:rPr>
+                <w:b w:val="0"/>
+                <w:i w:val="0"/>
+                <w:sz w:val="19"/>
+              </w:rPr>
+              <w:t>Fotografii din timpul activității (cu acordul părinților / GDPR)</w:t>
+            </w:r>
+          </w:p>
+        </w:tc>
+      </w:tr>
+      <w:tr>
+        <w:tc>
+          <w:tcPr>
+            <w:tcW w:type="dxa" w:w="4819"/>
+          </w:tcPr>
+          <w:p>
+            <w:pPr>
+              <w:spacing w:before="0" w:after="0"/>
+            </w:pPr>
+            <w:r>
+              <w:rPr>
+                <w:color w:val="4A2A82"/>
+                <w:sz w:val="23"/>
+              </w:rPr>
+              <w:t xml:space="preserve">☐ </w:t>
+            </w:r>
+            <w:r>
+              <w:rPr>
+                <w:b w:val="0"/>
+                <w:i w:val="0"/>
+                <w:sz w:val="19"/>
+              </w:rPr>
+              <w:t>Scenariul activității și materialele-suport (prezentul document)</w:t>
+            </w:r>
+          </w:p>
+        </w:tc>
+        <w:tc>
+          <w:tcPr>
+            <w:tcW w:type="dxa" w:w="4819"/>
+          </w:tcPr>
+          <w:p>
+            <w:pPr>
+              <w:spacing w:before="0" w:after="0"/>
+            </w:pPr>
+            <w:r>
+              <w:rPr>
+                <w:color w:val="4A2A82"/>
+                <w:sz w:val="23"/>
+              </w:rPr>
+              <w:t xml:space="preserve">☐ </w:t>
+            </w:r>
+            <w:r>
+              <w:rPr>
+                <w:b w:val="0"/>
+                <w:i w:val="0"/>
+                <w:sz w:val="19"/>
+              </w:rPr>
+              <w:t>Produse ale activității (fișe completate de elevi)</w:t>
+            </w:r>
+          </w:p>
+        </w:tc>
+      </w:tr>
+      <w:tr>
+        <w:tc>
+          <w:tcPr>
+            <w:tcW w:type="dxa" w:w="4819"/>
+          </w:tcPr>
+          <w:p>
+            <w:pPr>
+              <w:spacing w:before="0" w:after="0"/>
+            </w:pPr>
+            <w:r>
+              <w:rPr>
+                <w:color w:val="4A2A82"/>
+                <w:sz w:val="23"/>
+              </w:rPr>
+              <w:t xml:space="preserve">☐ </w:t>
+            </w:r>
+            <w:r>
+              <w:rPr>
+                <w:b w:val="0"/>
+                <w:i w:val="0"/>
+                <w:sz w:val="19"/>
+              </w:rPr>
+              <w:t>Raportul privind desfășurarea activității (secțiunea 12)</w:t>
+            </w:r>
+          </w:p>
+        </w:tc>
+        <w:tc>
+          <w:tcPr>
+            <w:tcW w:type="dxa" w:w="4819"/>
+          </w:tcPr>
+          <w:p>
+            <w:pPr>
+              <w:spacing w:before="0" w:after="0"/>
+            </w:pPr>
+            <w:r>
+              <w:rPr>
+                <w:color w:val="4A2A82"/>
+                <w:sz w:val="23"/>
+              </w:rPr>
+              <w:t xml:space="preserve">☐ </w:t>
+            </w:r>
+            <w:r>
+              <w:rPr>
+                <w:b w:val="0"/>
+                <w:i w:val="0"/>
+                <w:sz w:val="19"/>
+              </w:rPr>
+              <w:t>Alte documente: ______________________</w:t>
+            </w:r>
+          </w:p>
+        </w:tc>
+      </w:tr>
+    </w:tbl>
+    <w:p>
+      <w:pPr>
+        <w:spacing w:before="0" w:after="0" w:line="160" w:lineRule="exact"/>
+      </w:pPr>
+      <w:r/>
+    </w:p>
+    <w:tbl>
+      <w:tblPr>
+        <w:tblW w:w="9639" w:type="dxa"/>
+        <w:jc w:val="center"/>
+        <w:tblBorders>
+          <w:top w:val="single" w:sz="4" w:space="0" w:color="DCD0F0"/>
+          <w:left w:val="single" w:sz="4" w:space="0" w:color="DCD0F0"/>
+          <w:bottom w:val="single" w:sz="4" w:space="0" w:color="DCD0F0"/>
+          <w:right w:val="single" w:sz="4" w:space="0" w:color="DCD0F0"/>
+          <w:insideH w:val="single" w:sz="4" w:space="0" w:color="DCD0F0"/>
+          <w:insideV w:val="single" w:sz="4" w:space="0" w:color="DCD0F0"/>
+        </w:tblBorders>
+        <w:tblLayout w:type="fixed"/>
+        <w:tblCellMar>
+          <w:top w:w="68" w:type="dxa"/>
+          <w:left w:w="113" w:type="dxa"/>
+          <w:bottom w:w="68" w:type="dxa"/>
+          <w:right w:w="113" w:type="dxa"/>
+        </w:tblCellMar>
+        <w:tblLook w:firstColumn="1" w:firstRow="1" w:lastColumn="0" w:lastRow="0" w:noHBand="0" w:noVBand="1" w:val="04A0"/>
+      </w:tblPr>
+      <w:tblGrid>
+        <w:gridCol w:w="3213"/>
+        <w:gridCol w:w="3213"/>
+        <w:gridCol w:w="3213"/>
+      </w:tblGrid>
+      <w:tr>
+        <w:trPr>
+          <w:cantSplit/>
+          <w:trHeight w:val="2381" w:hRule="atLeast"/>
+        </w:trPr>
+        <w:tc>
+          <w:tcPr>
+            <w:tcW w:type="dxa" w:w="3213"/>
+          </w:tcPr>
+          <w:p>
+            <w:pPr>
+              <w:spacing w:before="0" w:after="0"/>
+              <w:jc w:val="center"/>
+            </w:pPr>
+            <w:r>
+              <w:rPr>
+                <w:b/>
+                <w:i w:val="0"/>
+                <w:color w:val="4A2A82"/>
+                <w:sz w:val="20"/>
+              </w:rPr>
+              <w:t>Întocmit</w:t>
+            </w:r>
+          </w:p>
+          <w:p>
+            <w:pPr>
+              <w:spacing w:before="0" w:after="80"/>
+              <w:jc w:val="center"/>
+            </w:pPr>
+            <w:r>
+              <w:rPr>
+                <w:b w:val="0"/>
+                <w:i/>
+                <w:color w:val="666666"/>
+                <w:sz w:val="18"/>
+              </w:rPr>
+              <w:t>Facilitator comunitar 2</w:t>
+            </w:r>
+          </w:p>
           <w:p>
             <w:pPr>
               <w:tabs>
-                <w:tab w:pos="2948" w:val="right" w:leader="underscore"/>
+                <w:tab w:pos="2929" w:val="right" w:leader="underscore"/>
               </w:tabs>
-              <w:spacing w:before="40" w:after="0"/>
-            </w:pPr>
-            <w:r>
-              <w:rPr>
-                <w:color w:val="9A9A9A"/>
+              <w:spacing w:before="160" w:after="0"/>
+            </w:pPr>
+            <w:r>
+              <w:rPr>
+                <w:b/>
+                <w:sz w:val="19"/>
+              </w:rPr>
+              <w:t xml:space="preserve">Nume: </w:t>
+            </w:r>
+            <w:r>
+              <w:rPr>
                 <w:sz w:val="19"/>
               </w:rPr>
               <w:tab/>
             </w:r>
           </w:p>
-        </w:tc>
-        <w:tc>
-          <w:tcPr>
-            <w:tcW w:type="dxa" w:w="1644"/>
-            <w:shd w:val="clear" w:color="auto" w:fill="F1ECF9"/>
-          </w:tcPr>
-          <w:p>
-            <w:pPr>
-              <w:spacing w:before="0" w:after="0"/>
+          <w:p>
+            <w:pPr>
+              <w:tabs>
+                <w:tab w:pos="2929" w:val="right" w:leader="underscore"/>
+              </w:tabs>
+              <w:spacing w:before="280" w:after="0"/>
+            </w:pPr>
+            <w:r>
+              <w:rPr>
+                <w:b/>
+                <w:sz w:val="19"/>
+              </w:rPr>
+              <w:t xml:space="preserve">Semnătura: </w:t>
+            </w:r>
+            <w:r>
+              <w:rPr>
+                <w:sz w:val="19"/>
+              </w:rPr>
+              <w:tab/>
+            </w:r>
+          </w:p>
+          <w:p>
+            <w:pPr>
+              <w:tabs>
+                <w:tab w:pos="2929" w:val="right" w:leader="underscore"/>
+              </w:tabs>
+              <w:spacing w:before="200" w:after="0"/>
+            </w:pPr>
+            <w:r>
+              <w:rPr>
+                <w:b/>
+                <w:sz w:val="19"/>
+              </w:rPr>
+              <w:t xml:space="preserve">Data: </w:t>
+            </w:r>
+            <w:r>
+              <w:rPr>
+                <w:sz w:val="19"/>
+              </w:rPr>
+              <w:tab/>
+            </w:r>
+          </w:p>
+        </w:tc>
+        <w:tc>
+          <w:tcPr>
+            <w:tcW w:type="dxa" w:w="3213"/>
+          </w:tcPr>
+          <w:p>
+            <w:pPr>
+              <w:spacing w:before="0" w:after="0"/>
+              <w:jc w:val="center"/>
             </w:pPr>
             <w:r>
               <w:rPr>
                 <w:b/>
                 <w:i w:val="0"/>
                 <w:color w:val="4A2A82"/>
-                <w:sz w:val="19"/>
-              </w:rPr>
-              <w:t>Sala</w:t>
-            </w:r>
-          </w:p>
-        </w:tc>
-        <w:tc>
-          <w:tcPr>
-            <w:tcW w:type="dxa" w:w="3175"/>
-          </w:tcPr>
+                <w:sz w:val="20"/>
+              </w:rPr>
+              <w:t>Confirmat</w:t>
+            </w:r>
+          </w:p>
+          <w:p>
+            <w:pPr>
+              <w:spacing w:before="0" w:after="80"/>
+              <w:jc w:val="center"/>
+            </w:pPr>
+            <w:r>
+              <w:rPr>
+                <w:b w:val="0"/>
+                <w:i/>
+                <w:color w:val="666666"/>
+                <w:sz w:val="18"/>
+              </w:rPr>
+              <w:t>Unitatea de învățământ (director / diriginte), ștampila</w:t>
+            </w:r>
+          </w:p>
           <w:p>
             <w:pPr>
               <w:tabs>
-                <w:tab w:pos="2948" w:val="right" w:leader="underscore"/>
+                <w:tab w:pos="2929" w:val="right" w:leader="underscore"/>
               </w:tabs>
-              <w:spacing w:before="40" w:after="0"/>
-            </w:pPr>
-            <w:r>
-              <w:rPr>
-                <w:color w:val="9A9A9A"/>
+              <w:spacing w:before="160" w:after="0"/>
+            </w:pPr>
+            <w:r>
+              <w:rPr>
+                <w:b/>
+                <w:sz w:val="19"/>
+              </w:rPr>
+              <w:t xml:space="preserve">Nume: </w:t>
+            </w:r>
+            <w:r>
+              <w:rPr>
+                <w:sz w:val="19"/>
+              </w:rPr>
+              <w:tab/>
+            </w:r>
+          </w:p>
+          <w:p>
+            <w:pPr>
+              <w:tabs>
+                <w:tab w:pos="2929" w:val="right" w:leader="underscore"/>
+              </w:tabs>
+              <w:spacing w:before="280" w:after="0"/>
+            </w:pPr>
+            <w:r>
+              <w:rPr>
+                <w:b/>
+                <w:sz w:val="19"/>
+              </w:rPr>
+              <w:t xml:space="preserve">Semnătura: </w:t>
+            </w:r>
+            <w:r>
+              <w:rPr>
+                <w:sz w:val="19"/>
+              </w:rPr>
+              <w:tab/>
+            </w:r>
+          </w:p>
+          <w:p>
+            <w:pPr>
+              <w:tabs>
+                <w:tab w:pos="2929" w:val="right" w:leader="underscore"/>
+              </w:tabs>
+              <w:spacing w:before="200" w:after="0"/>
+            </w:pPr>
+            <w:r>
+              <w:rPr>
+                <w:b/>
+                <w:sz w:val="19"/>
+              </w:rPr>
+              <w:t xml:space="preserve">Data: </w:t>
+            </w:r>
+            <w:r>
+              <w:rPr>
+                <w:sz w:val="19"/>
+              </w:rPr>
+              <w:tab/>
+            </w:r>
+          </w:p>
+        </w:tc>
+        <w:tc>
+          <w:tcPr>
+            <w:tcW w:type="dxa" w:w="3213"/>
+          </w:tcPr>
+          <w:p>
+            <w:pPr>
+              <w:spacing w:before="0" w:after="0"/>
+              <w:jc w:val="center"/>
+            </w:pPr>
+            <w:r>
+              <w:rPr>
+                <w:b/>
+                <w:i w:val="0"/>
+                <w:color w:val="4A2A82"/>
+                <w:sz w:val="20"/>
+              </w:rPr>
+              <w:t>Avizat</w:t>
+            </w:r>
+          </w:p>
+          <w:p>
+            <w:pPr>
+              <w:spacing w:before="0" w:after="80"/>
+              <w:jc w:val="center"/>
+            </w:pPr>
+            <w:r>
+              <w:rPr>
+                <w:b w:val="0"/>
+                <w:i/>
+                <w:color w:val="666666"/>
+                <w:sz w:val="18"/>
+              </w:rPr>
+              <w:t>Coordonator / manager de proiect</w:t>
+            </w:r>
+          </w:p>
+          <w:p>
+            <w:pPr>
+              <w:tabs>
+                <w:tab w:pos="2929" w:val="right" w:leader="underscore"/>
+              </w:tabs>
+              <w:spacing w:before="160" w:after="0"/>
+            </w:pPr>
+            <w:r>
+              <w:rPr>
+                <w:b/>
+                <w:sz w:val="19"/>
+              </w:rPr>
+              <w:t xml:space="preserve">Nume: </w:t>
+            </w:r>
+            <w:r>
+              <w:rPr>
+                <w:sz w:val="19"/>
+              </w:rPr>
+              <w:tab/>
+            </w:r>
+          </w:p>
+          <w:p>
+            <w:pPr>
+              <w:tabs>
+                <w:tab w:pos="2929" w:val="right" w:leader="underscore"/>
+              </w:tabs>
+              <w:spacing w:before="280" w:after="0"/>
+            </w:pPr>
+            <w:r>
+              <w:rPr>
+                <w:b/>
+                <w:sz w:val="19"/>
+              </w:rPr>
+              <w:t xml:space="preserve">Semnătura: </w:t>
+            </w:r>
+            <w:r>
+              <w:rPr>
+                <w:sz w:val="19"/>
+              </w:rPr>
+              <w:tab/>
+            </w:r>
+          </w:p>
+          <w:p>
+            <w:pPr>
+              <w:tabs>
+                <w:tab w:pos="2929" w:val="right" w:leader="underscore"/>
+              </w:tabs>
+              <w:spacing w:before="200" w:after="0"/>
+            </w:pPr>
+            <w:r>
+              <w:rPr>
+                <w:b/>
+                <w:sz w:val="19"/>
+              </w:rPr>
+              <w:t xml:space="preserve">Data: </w:t>
+            </w:r>
+            <w:r>
+              <w:rPr>
                 <w:sz w:val="19"/>
               </w:rPr>
               <w:tab/>
@@ -376,6 +2083,29 @@
         <w:spacing w:before="0" w:after="0" w:line="80" w:lineRule="exact"/>
       </w:pPr>
       <w:r/>
+    </w:p>
+    <w:p>
+      <w:pPr>
+        <w:spacing w:after="0"/>
+      </w:pPr>
+      <w:r>
+        <w:br w:type="page"/>
+      </w:r>
+    </w:p>
+    <w:p>
+      <w:pPr>
+        <w:pStyle w:val="Heading1"/>
+        <w:pBdr>
+          <w:bottom w:val="single" w:sz="8" w:space="0" w:color="DCD0F0"/>
+        </w:pBdr>
+      </w:pPr>
+      <w:r>
+        <w:rPr>
+          <w:b w:val="0"/>
+          <w:i w:val="0"/>
+        </w:rPr>
+        <w:t>SCENARIUL ACTIVITĂȚII</w:t>
+      </w:r>
     </w:p>
     <w:p>
       <w:pPr>
@@ -389,33 +2119,46 @@
           <w:b w:val="0"/>
           <w:i w:val="0"/>
         </w:rPr>
-        <w:t>Ideea creativă a atelierului</w:t>
+        <w:t>1. Fundamentare și abordare metodologică</w:t>
       </w:r>
     </w:p>
     <w:p>
       <w:pPr>
         <w:spacing w:before="0" w:after="80"/>
+        <w:jc w:val="both"/>
       </w:pPr>
       <w:r>
         <w:rPr>
           <w:b w:val="0"/>
           <w:i w:val="0"/>
         </w:rPr>
-        <w:t xml:space="preserve">La 13–14 ani, mulți elevi se compară permanent cu alții (inclusiv pe rețelele sociale) și spun mai ușor „nu sunt bun la nimic” decât „mă pricep la...”. De aceea, atelierul nu arată ca o lecție, ci ca un </w:t>
+        <w:t>La vârsta de 13–14 ani, elevii se raportează intens la ceilalți, iar comparația socială (inclusiv în mediul online) le poate diminua încrederea în propriile resurse. Mulți elevi formulează mai ușor ce nu le reușește decât ce le reușește. Atelierul răspunde acestei nevoi prin activități care îi ajută să-și identifice și să-și valorizeze punctele forte, într-un cadru sigur și fără evaluare școlară.</w:t>
+      </w:r>
+    </w:p>
+    <w:p>
+      <w:pPr>
+        <w:spacing w:before="0" w:after="40"/>
+      </w:pPr>
+      <w:r>
+        <w:rPr>
+          <w:b w:val="0"/>
+          <w:i w:val="0"/>
+        </w:rPr>
+        <w:t xml:space="preserve">Pentru a crește implicarea, activitatea folosește </w:t>
       </w:r>
       <w:r>
         <w:rPr>
           <w:b/>
           <w:i w:val="0"/>
         </w:rPr>
-        <w:t>joc cu misiuni</w:t>
+        <w:t>elemente de gamificare</w:t>
       </w:r>
       <w:r>
         <w:rPr>
           <w:b w:val="0"/>
           <w:i w:val="0"/>
         </w:rPr>
-        <w:t>:</w:t>
+        <w:t>, adaptate intereselor vârstei:</w:t>
       </w:r>
     </w:p>
     <w:p>
@@ -439,14 +2182,14 @@
           <w:b/>
           <w:i w:val="0"/>
         </w:rPr>
-        <w:t>Ședința 1 – Agenția Secretă a Punctelor Forte:</w:t>
+        <w:t>Ședința 1 – „Agenția Secretă a Punctelor Forte”:</w:t>
       </w:r>
       <w:r>
         <w:rPr>
           <w:b w:val="0"/>
           <w:i w:val="0"/>
         </w:rPr>
-        <w:t xml:space="preserve"> elevii sunt „recrutați” ca agenți. Primesc ecuson și nume de cod, trec prin probe și descoperă, ca niște detectivi, punctele forte proprii și ale colegilor.</w:t>
+        <w:t xml:space="preserve"> elevii devin „agenți”, primesc ecuson și nume de cod și descoperă, prin probe și interviuri în perechi, punctele forte proprii și ale colegilor.</w:t>
       </w:r>
     </w:p>
     <w:p>
@@ -470,14 +2213,14 @@
           <w:b/>
           <w:i w:val="0"/>
         </w:rPr>
-        <w:t>Ședința 2 – Level Up:</w:t>
+        <w:t>Ședința 2 – „Level Up”:</w:t>
       </w:r>
       <w:r>
         <w:rPr>
           <w:b w:val="0"/>
           <w:i w:val="0"/>
         </w:rPr>
-        <w:t xml:space="preserve"> agenții „trec la nivelul următor”. Descoperă ce îi motivează, își aleg o superputere și primesc un quest (o provocare) de 30 de zile.</w:t>
+        <w:t xml:space="preserve"> elevii explorează sursele de motivație, își aleg o „superputere” (un punct forte) și își stabilesc o provocare personală de 30 de zile.</w:t>
       </w:r>
     </w:p>
     <w:p>
@@ -501,41 +2244,41 @@
           <w:b/>
           <w:i w:val="0"/>
         </w:rPr>
-        <w:t>Firul roșu:</w:t>
+        <w:t>Continuitatea între ședințe</w:t>
       </w:r>
       <w:r>
         <w:rPr>
           <w:b w:val="0"/>
           <w:i w:val="0"/>
         </w:rPr>
-        <w:t xml:space="preserve"> fiecare elev completează în Ședința 1 un </w:t>
+        <w:t xml:space="preserve"> este asigurată prin </w:t>
       </w:r>
       <w:r>
         <w:rPr>
           <w:b/>
           <w:i w:val="0"/>
         </w:rPr>
-        <w:t>Card de agent</w:t>
+        <w:t>Cardul de agent</w:t>
       </w:r>
       <w:r>
         <w:rPr>
           <w:b w:val="0"/>
           <w:i w:val="0"/>
         </w:rPr>
-        <w:t xml:space="preserve"> (în stilul cardurilor din jocuri). Cardul rămâne la facilitator, este returnat și „deblocat” în Ședința 2, iar apoi elevul îl ia acasă.</w:t>
+        <w:t>, completat în Ședința 1 și finalizat în Ședința 2.</w:t>
       </w:r>
     </w:p>
     <w:p>
       <w:pPr>
         <w:spacing w:before="0" w:after="80"/>
+        <w:jc w:val="both"/>
       </w:pPr>
       <w:r>
         <w:rPr>
           <w:b w:val="0"/>
-          <w:i/>
-          <w:color w:val="666666"/>
+          <w:i w:val="0"/>
         </w:rPr>
-        <w:t>Mișcarea, anonimatul, lucrul în perechi și dreptul de a spune „pas” le dau elevilor siguranța de a vorbi despre ei fără presiune.</w:t>
+        <w:t>Activitatea contribuie la scopul proiectului UNIC – incluziunea și continuitatea educației elevilor – prin dezvoltarea stimei de sine, a competențelor socio-emoționale și a motivației pentru învățare, factori care susțin participarea și menținerea elevilor în educație.</w:t>
       </w:r>
     </w:p>
     <w:p>
@@ -550,7 +2293,7 @@
           <w:b w:val="0"/>
           <w:i w:val="0"/>
         </w:rPr>
-        <w:t>1. Scopul ședinței</w:t>
+        <w:t>2. Scopul ședinței</w:t>
       </w:r>
     </w:p>
     <w:p>
@@ -577,7 +2320,7 @@
           <w:b w:val="0"/>
           <w:i w:val="0"/>
         </w:rPr>
-        <w:t>2. Obiective</w:t>
+        <w:t>3. Obiective</w:t>
       </w:r>
     </w:p>
     <w:p>
@@ -728,7 +2471,417 @@
           <w:b w:val="0"/>
           <w:i w:val="0"/>
         </w:rPr>
-        <w:t>3. Materiale necesare (listă de verificare)</w:t>
+        <w:t>4. Elemente de proiectare</w:t>
+      </w:r>
+    </w:p>
+    <w:tbl>
+      <w:tblPr>
+        <w:tblW w:w="9639" w:type="dxa"/>
+        <w:jc w:val="center"/>
+        <w:tblBorders>
+          <w:top w:val="single" w:sz="4" w:space="0" w:color="DCD0F0"/>
+          <w:left w:val="single" w:sz="4" w:space="0" w:color="DCD0F0"/>
+          <w:bottom w:val="single" w:sz="4" w:space="0" w:color="DCD0F0"/>
+          <w:right w:val="single" w:sz="4" w:space="0" w:color="DCD0F0"/>
+          <w:insideH w:val="single" w:sz="4" w:space="0" w:color="DCD0F0"/>
+          <w:insideV w:val="single" w:sz="4" w:space="0" w:color="DCD0F0"/>
+        </w:tblBorders>
+        <w:tblLayout w:type="fixed"/>
+        <w:tblCellMar>
+          <w:top w:w="34" w:type="dxa"/>
+          <w:left w:w="85" w:type="dxa"/>
+          <w:bottom w:w="34" w:type="dxa"/>
+          <w:right w:w="85" w:type="dxa"/>
+        </w:tblCellMar>
+        <w:tblLook w:firstColumn="1" w:firstRow="1" w:lastColumn="0" w:lastRow="0" w:noHBand="0" w:noVBand="1" w:val="04A0"/>
+      </w:tblPr>
+      <w:tblGrid>
+        <w:gridCol w:w="2381"/>
+        <w:gridCol w:w="7257"/>
+      </w:tblGrid>
+      <w:tr>
+        <w:trPr>
+          <w:cantSplit/>
+          <w:tblHeader/>
+        </w:trPr>
+        <w:tc>
+          <w:tcPr>
+            <w:tcW w:type="dxa" w:w="2381"/>
+            <w:shd w:val="clear" w:color="auto" w:fill="4A2A82"/>
+          </w:tcPr>
+          <w:p>
+            <w:pPr>
+              <w:spacing w:before="0" w:after="0"/>
+            </w:pPr>
+            <w:r>
+              <w:rPr>
+                <w:b/>
+                <w:i w:val="0"/>
+                <w:color w:val="FFFFFF"/>
+                <w:sz w:val="19"/>
+              </w:rPr>
+              <w:t>Element</w:t>
+            </w:r>
+          </w:p>
+        </w:tc>
+        <w:tc>
+          <w:tcPr>
+            <w:tcW w:type="dxa" w:w="7257"/>
+            <w:shd w:val="clear" w:color="auto" w:fill="4A2A82"/>
+          </w:tcPr>
+          <w:p>
+            <w:pPr>
+              <w:spacing w:before="0" w:after="0"/>
+            </w:pPr>
+            <w:r>
+              <w:rPr>
+                <w:b/>
+                <w:i w:val="0"/>
+                <w:color w:val="FFFFFF"/>
+                <w:sz w:val="19"/>
+              </w:rPr>
+              <w:t>Descriere</w:t>
+            </w:r>
+          </w:p>
+        </w:tc>
+      </w:tr>
+      <w:tr>
+        <w:trPr>
+          <w:cantSplit/>
+        </w:trPr>
+        <w:tc>
+          <w:tcPr>
+            <w:tcW w:type="dxa" w:w="2381"/>
+          </w:tcPr>
+          <w:p>
+            <w:pPr>
+              <w:spacing w:before="0" w:after="0"/>
+            </w:pPr>
+            <w:r>
+              <w:rPr>
+                <w:b/>
+                <w:i w:val="0"/>
+                <w:sz w:val="19"/>
+              </w:rPr>
+              <w:t>Domeniul</w:t>
+            </w:r>
+          </w:p>
+        </w:tc>
+        <w:tc>
+          <w:tcPr>
+            <w:tcW w:type="dxa" w:w="7257"/>
+          </w:tcPr>
+          <w:p>
+            <w:pPr>
+              <w:spacing w:before="0" w:after="0"/>
+            </w:pPr>
+            <w:r>
+              <w:rPr>
+                <w:b w:val="0"/>
+                <w:i w:val="0"/>
+                <w:sz w:val="19"/>
+              </w:rPr>
+              <w:t>Consiliere și dezvoltare personală – autocunoaștere, stimă de sine, relaționare pozitivă.</w:t>
+            </w:r>
+          </w:p>
+        </w:tc>
+      </w:tr>
+      <w:tr>
+        <w:trPr>
+          <w:cantSplit/>
+        </w:trPr>
+        <w:tc>
+          <w:tcPr>
+            <w:tcW w:type="dxa" w:w="2381"/>
+            <w:shd w:val="clear" w:color="auto" w:fill="F2F2F2"/>
+          </w:tcPr>
+          <w:p>
+            <w:pPr>
+              <w:spacing w:before="0" w:after="0"/>
+            </w:pPr>
+            <w:r>
+              <w:rPr>
+                <w:b/>
+                <w:i w:val="0"/>
+                <w:sz w:val="19"/>
+              </w:rPr>
+              <w:t>Competențe vizate</w:t>
+            </w:r>
+          </w:p>
+        </w:tc>
+        <w:tc>
+          <w:tcPr>
+            <w:tcW w:type="dxa" w:w="7257"/>
+            <w:shd w:val="clear" w:color="auto" w:fill="F2F2F2"/>
+          </w:tcPr>
+          <w:p>
+            <w:pPr>
+              <w:tabs>
+                <w:tab w:pos="283" w:val="left"/>
+              </w:tabs>
+              <w:spacing w:after="40" w:before="0"/>
+              <w:ind w:left="283" w:hanging="238"/>
+            </w:pPr>
+            <w:r>
+              <w:rPr>
+                <w:b/>
+                <w:color w:val="4A2A82"/>
+                <w:sz w:val="19"/>
+              </w:rPr>
+              <w:t>▪</w:t>
+              <w:tab/>
+            </w:r>
+            <w:r>
+              <w:rPr>
+                <w:b w:val="0"/>
+                <w:i w:val="0"/>
+                <w:sz w:val="19"/>
+              </w:rPr>
+              <w:t>identificarea resurselor personale (calități, abilități, interese);</w:t>
+            </w:r>
+          </w:p>
+          <w:p>
+            <w:pPr>
+              <w:tabs>
+                <w:tab w:pos="283" w:val="left"/>
+              </w:tabs>
+              <w:spacing w:after="40" w:before="0"/>
+              <w:ind w:left="283" w:hanging="238"/>
+            </w:pPr>
+            <w:r>
+              <w:rPr>
+                <w:b/>
+                <w:color w:val="4A2A82"/>
+                <w:sz w:val="19"/>
+              </w:rPr>
+              <w:t>▪</w:t>
+              <w:tab/>
+            </w:r>
+            <w:r>
+              <w:rPr>
+                <w:b w:val="0"/>
+                <w:i w:val="0"/>
+                <w:sz w:val="19"/>
+              </w:rPr>
+              <w:t>oferirea și primirea feedbackului pozitiv;</w:t>
+            </w:r>
+          </w:p>
+          <w:p>
+            <w:pPr>
+              <w:tabs>
+                <w:tab w:pos="283" w:val="left"/>
+              </w:tabs>
+              <w:spacing w:after="40" w:before="0"/>
+              <w:ind w:left="283" w:hanging="238"/>
+            </w:pPr>
+            <w:r>
+              <w:rPr>
+                <w:b/>
+                <w:color w:val="4A2A82"/>
+                <w:sz w:val="19"/>
+              </w:rPr>
+              <w:t>▪</w:t>
+              <w:tab/>
+            </w:r>
+            <w:r>
+              <w:rPr>
+                <w:b w:val="0"/>
+                <w:i w:val="0"/>
+                <w:sz w:val="19"/>
+              </w:rPr>
+              <w:t>valorizarea diversității și a contribuției fiecăruia într-o echipă.</w:t>
+            </w:r>
+          </w:p>
+        </w:tc>
+      </w:tr>
+      <w:tr>
+        <w:trPr>
+          <w:cantSplit/>
+        </w:trPr>
+        <w:tc>
+          <w:tcPr>
+            <w:tcW w:type="dxa" w:w="2381"/>
+          </w:tcPr>
+          <w:p>
+            <w:pPr>
+              <w:spacing w:before="0" w:after="0"/>
+            </w:pPr>
+            <w:r>
+              <w:rPr>
+                <w:b/>
+                <w:i w:val="0"/>
+                <w:sz w:val="19"/>
+              </w:rPr>
+              <w:t>Metode și procedee</w:t>
+            </w:r>
+          </w:p>
+        </w:tc>
+        <w:tc>
+          <w:tcPr>
+            <w:tcW w:type="dxa" w:w="7257"/>
+          </w:tcPr>
+          <w:p>
+            <w:pPr>
+              <w:spacing w:before="0" w:after="0"/>
+            </w:pPr>
+            <w:r>
+              <w:rPr>
+                <w:b w:val="0"/>
+                <w:i w:val="0"/>
+                <w:sz w:val="19"/>
+              </w:rPr>
+              <w:t>Joc de energizare, joc de ghicire (exercițiu anonim), interviul în perechi, brainstorming pe categorii (harta colectivă), studiu de caz („Misiunea imposibilă”), cercul de feedback, reflecția ghidată, gamificarea.</w:t>
+            </w:r>
+          </w:p>
+        </w:tc>
+      </w:tr>
+      <w:tr>
+        <w:trPr>
+          <w:cantSplit/>
+        </w:trPr>
+        <w:tc>
+          <w:tcPr>
+            <w:tcW w:type="dxa" w:w="2381"/>
+            <w:shd w:val="clear" w:color="auto" w:fill="F2F2F2"/>
+          </w:tcPr>
+          <w:p>
+            <w:pPr>
+              <w:spacing w:before="0" w:after="0"/>
+            </w:pPr>
+            <w:r>
+              <w:rPr>
+                <w:b/>
+                <w:i w:val="0"/>
+                <w:sz w:val="19"/>
+              </w:rPr>
+              <w:t>Forme de organizare</w:t>
+            </w:r>
+          </w:p>
+        </w:tc>
+        <w:tc>
+          <w:tcPr>
+            <w:tcW w:type="dxa" w:w="7257"/>
+            <w:shd w:val="clear" w:color="auto" w:fill="F2F2F2"/>
+          </w:tcPr>
+          <w:p>
+            <w:pPr>
+              <w:spacing w:before="0" w:after="0"/>
+            </w:pPr>
+            <w:r>
+              <w:rPr>
+                <w:b w:val="0"/>
+                <w:i w:val="0"/>
+                <w:sz w:val="19"/>
+              </w:rPr>
+              <w:t>Frontal, în perechi, pe grupe, individual.</w:t>
+            </w:r>
+          </w:p>
+        </w:tc>
+      </w:tr>
+      <w:tr>
+        <w:trPr>
+          <w:cantSplit/>
+        </w:trPr>
+        <w:tc>
+          <w:tcPr>
+            <w:tcW w:type="dxa" w:w="2381"/>
+          </w:tcPr>
+          <w:p>
+            <w:pPr>
+              <w:spacing w:before="0" w:after="0"/>
+            </w:pPr>
+            <w:r>
+              <w:rPr>
+                <w:b/>
+                <w:i w:val="0"/>
+                <w:sz w:val="19"/>
+              </w:rPr>
+              <w:t>Resurse</w:t>
+            </w:r>
+          </w:p>
+        </w:tc>
+        <w:tc>
+          <w:tcPr>
+            <w:tcW w:type="dxa" w:w="7257"/>
+          </w:tcPr>
+          <w:p>
+            <w:pPr>
+              <w:spacing w:before="0" w:after="0"/>
+            </w:pPr>
+            <w:r>
+              <w:rPr>
+                <w:b w:val="0"/>
+                <w:i w:val="0"/>
+                <w:sz w:val="19"/>
+              </w:rPr>
+              <w:t>Materiale: Anexele 1–9 și consumabile (secțiunea 5). Temporale: 60 de minute. Umane: 10–15 elevi, facilitatorul comunitar. Spațiale: sală de clasă cu scaune așezate în cerc.</w:t>
+            </w:r>
+          </w:p>
+        </w:tc>
+      </w:tr>
+      <w:tr>
+        <w:trPr>
+          <w:cantSplit/>
+        </w:trPr>
+        <w:tc>
+          <w:tcPr>
+            <w:tcW w:type="dxa" w:w="2381"/>
+            <w:shd w:val="clear" w:color="auto" w:fill="F2F2F2"/>
+          </w:tcPr>
+          <w:p>
+            <w:pPr>
+              <w:spacing w:before="0" w:after="0"/>
+            </w:pPr>
+            <w:r>
+              <w:rPr>
+                <w:b/>
+                <w:i w:val="0"/>
+                <w:sz w:val="19"/>
+              </w:rPr>
+              <w:t>Evaluare</w:t>
+            </w:r>
+          </w:p>
+        </w:tc>
+        <w:tc>
+          <w:tcPr>
+            <w:tcW w:type="dxa" w:w="7257"/>
+            <w:shd w:val="clear" w:color="auto" w:fill="F2F2F2"/>
+          </w:tcPr>
+          <w:p>
+            <w:pPr>
+              <w:spacing w:before="0" w:after="0"/>
+            </w:pPr>
+            <w:r>
+              <w:rPr>
+                <w:b w:val="0"/>
+                <w:i w:val="0"/>
+                <w:sz w:val="19"/>
+              </w:rPr>
+              <w:t>Observarea sistematică a participării; analiza produselor (Fișa 1, Harta echipei, Cardul de agent); biletul de ieșire (autoevaluare și feedback).</w:t>
+            </w:r>
+          </w:p>
+        </w:tc>
+      </w:tr>
+    </w:tbl>
+    <w:p>
+      <w:pPr>
+        <w:spacing w:before="0" w:after="0" w:line="120" w:lineRule="exact"/>
+      </w:pPr>
+      <w:r/>
+    </w:p>
+    <w:p>
+      <w:pPr>
+        <w:pStyle w:val="Heading2"/>
+        <w:pBdr>
+          <w:bottom w:val="single" w:sz="8" w:space="0" w:color="DCD0F0"/>
+        </w:pBdr>
+      </w:pPr>
+      <w:r>
+        <w:rPr>
+          <w:b w:val="0"/>
+          <w:i w:val="0"/>
+        </w:rPr>
+        <w:t>5. Materiale necesare (listă de verificare)</w:t>
       </w:r>
     </w:p>
     <w:tbl>
@@ -2127,7 +4280,7 @@
           <w:b w:val="0"/>
           <w:i w:val="0"/>
         </w:rPr>
-        <w:t>4. Pregătirea sălii (cu 10 minute înainte)</w:t>
+        <w:t>6. Pregătirea sălii (cu 10 minute înainte)</w:t>
       </w:r>
     </w:p>
     <w:p>
@@ -2311,7 +4464,7 @@
           <w:b w:val="0"/>
           <w:i w:val="0"/>
         </w:rPr>
-        <w:t>5. Principii pentru facilitator</w:t>
+        <w:t>7. Principii pentru facilitator</w:t>
       </w:r>
     </w:p>
     <w:tbl>
@@ -2626,7 +4779,7 @@
           <w:b w:val="0"/>
           <w:i w:val="0"/>
         </w:rPr>
-        <w:t>6. Agenda pe scurt</w:t>
+        <w:t>8. Agenda pe scurt</w:t>
       </w:r>
     </w:p>
     <w:tbl>
@@ -3312,7 +5465,7 @@
           <w:b w:val="0"/>
           <w:i w:val="0"/>
         </w:rPr>
-        <w:t>7. Desfășurarea pas cu pas</w:t>
+        <w:t>9. Desfășurarea pas cu pas</w:t>
       </w:r>
     </w:p>
     <w:tbl>
@@ -7490,7 +9643,7 @@
           <w:b w:val="0"/>
           <w:i w:val="0"/>
         </w:rPr>
-        <w:t>8. Situații dificile – ce faci dacă...</w:t>
+        <w:t>10. Situații dificile – ce faci dacă...</w:t>
       </w:r>
     </w:p>
     <w:tbl>
@@ -7876,137 +10029,7 @@
           <w:b w:val="0"/>
           <w:i w:val="0"/>
         </w:rPr>
-        <w:t>9. După ședință – lista facilitatorului</w:t>
-      </w:r>
-    </w:p>
-    <w:p>
-      <w:pPr>
-        <w:tabs>
-          <w:tab w:pos="57" w:val="left"/>
-        </w:tabs>
-        <w:spacing w:after="40" w:before="0"/>
-        <w:ind w:left="57" w:hanging="238"/>
-      </w:pPr>
-      <w:r>
-        <w:rPr>
-          <w:b/>
-          <w:color w:val="4A2A82"/>
-        </w:rPr>
-        <w:tab/>
-      </w:r>
-      <w:r>
-        <w:rPr>
-          <w:b w:val="0"/>
-          <w:i w:val="0"/>
-        </w:rPr>
-        <w:t>☐  Fotografiază harta echipei (și, dacă e posibil, păstreaz-o pentru Ședința 2).</w:t>
-      </w:r>
-    </w:p>
-    <w:p>
-      <w:pPr>
-        <w:tabs>
-          <w:tab w:pos="57" w:val="left"/>
-        </w:tabs>
-        <w:spacing w:after="40" w:before="0"/>
-        <w:ind w:left="57" w:hanging="238"/>
-      </w:pPr>
-      <w:r>
-        <w:rPr>
-          <w:b/>
-          <w:color w:val="4A2A82"/>
-        </w:rPr>
-        <w:tab/>
-      </w:r>
-      <w:r>
-        <w:rPr>
-          <w:b w:val="0"/>
-          <w:i w:val="0"/>
-        </w:rPr>
-        <w:t>☐  Păstrează Cardurile de agent în plic, în ordine alfabetică.</w:t>
-      </w:r>
-    </w:p>
-    <w:p>
-      <w:pPr>
-        <w:tabs>
-          <w:tab w:pos="57" w:val="left"/>
-        </w:tabs>
-        <w:spacing w:after="40" w:before="0"/>
-        <w:ind w:left="57" w:hanging="238"/>
-      </w:pPr>
-      <w:r>
-        <w:rPr>
-          <w:b/>
-          <w:color w:val="4A2A82"/>
-        </w:rPr>
-        <w:tab/>
-      </w:r>
-      <w:r>
-        <w:rPr>
-          <w:b w:val="0"/>
-          <w:i w:val="0"/>
-        </w:rPr>
-        <w:t>☐  Citește biletele de ieșire. Notează elevii care au avut nevoie de mai mult sprijin și punctele forte care au apărut des.</w:t>
-      </w:r>
-    </w:p>
-    <w:p>
-      <w:pPr>
-        <w:tabs>
-          <w:tab w:pos="57" w:val="left"/>
-        </w:tabs>
-        <w:spacing w:after="40" w:before="0"/>
-        <w:ind w:left="57" w:hanging="238"/>
-      </w:pPr>
-      <w:r>
-        <w:rPr>
-          <w:b/>
-          <w:color w:val="4A2A82"/>
-        </w:rPr>
-        <w:tab/>
-      </w:r>
-      <w:r>
-        <w:rPr>
-          <w:b w:val="0"/>
-          <w:i w:val="0"/>
-        </w:rPr>
-        <w:t>☐  Completează documentele de proiect (listă de prezență, fotografii, raport de activitate), conform procedurilor UNIC.</w:t>
-      </w:r>
-    </w:p>
-    <w:p>
-      <w:pPr>
-        <w:tabs>
-          <w:tab w:pos="57" w:val="left"/>
-        </w:tabs>
-        <w:spacing w:after="40" w:before="0"/>
-        <w:ind w:left="57" w:hanging="238"/>
-      </w:pPr>
-      <w:r>
-        <w:rPr>
-          <w:b/>
-          <w:color w:val="4A2A82"/>
-        </w:rPr>
-        <w:tab/>
-      </w:r>
-      <w:r>
-        <w:rPr>
-          <w:b w:val="0"/>
-          <w:i w:val="0"/>
-        </w:rPr>
-        <w:t>☐  Pregătește materialele pentru Ședința 2.</w:t>
-      </w:r>
-    </w:p>
-    <w:p>
-      <w:pPr>
-        <w:pStyle w:val="Heading2"/>
-        <w:pBdr>
-          <w:bottom w:val="single" w:sz="8" w:space="0" w:color="DCD0F0"/>
-        </w:pBdr>
-      </w:pPr>
-      <w:r>
-        <w:rPr>
-          <w:b w:val="0"/>
-          <w:i w:val="0"/>
-        </w:rPr>
-        <w:t>10. Lista anexelor și numărul de exemplare de tipărit</w:t>
+        <w:t>11. Lista anexelor și numărul de exemplare de tipărit</w:t>
       </w:r>
     </w:p>
     <w:p>
@@ -8664,6 +10687,1209 @@
       </w:pPr>
       <w:r/>
     </w:p>
+    <w:p>
+      <w:pPr>
+        <w:spacing w:after="0"/>
+      </w:pPr>
+      <w:r>
+        <w:br w:type="page"/>
+      </w:r>
+    </w:p>
+    <w:p>
+      <w:pPr>
+        <w:pStyle w:val="Heading2"/>
+        <w:pBdr>
+          <w:bottom w:val="single" w:sz="8" w:space="0" w:color="DCD0F0"/>
+        </w:pBdr>
+      </w:pPr>
+      <w:r>
+        <w:rPr>
+          <w:b w:val="0"/>
+          <w:i w:val="0"/>
+        </w:rPr>
+        <w:t>12. Raport privind desfășurarea activității</w:t>
+      </w:r>
+    </w:p>
+    <w:p>
+      <w:pPr>
+        <w:spacing w:before="0" w:after="80"/>
+      </w:pPr>
+      <w:r>
+        <w:rPr>
+          <w:b w:val="0"/>
+          <w:i/>
+          <w:color w:val="666666"/>
+          <w:sz w:val="19"/>
+        </w:rPr>
+        <w:t>Se completează de facilitator imediat după desfășurarea ședinței și se anexează la documentele justificative.</w:t>
+      </w:r>
+    </w:p>
+    <w:tbl>
+      <w:tblPr>
+        <w:tblW w:w="9639" w:type="dxa"/>
+        <w:jc w:val="center"/>
+        <w:tblBorders>
+          <w:top w:val="single" w:sz="4" w:space="0" w:color="DCD0F0"/>
+          <w:left w:val="single" w:sz="4" w:space="0" w:color="DCD0F0"/>
+          <w:bottom w:val="single" w:sz="4" w:space="0" w:color="DCD0F0"/>
+          <w:right w:val="single" w:sz="4" w:space="0" w:color="DCD0F0"/>
+          <w:insideH w:val="single" w:sz="4" w:space="0" w:color="DCD0F0"/>
+          <w:insideV w:val="single" w:sz="4" w:space="0" w:color="DCD0F0"/>
+        </w:tblBorders>
+        <w:tblLayout w:type="fixed"/>
+        <w:tblCellMar>
+          <w:top w:w="39" w:type="dxa"/>
+          <w:left w:w="113" w:type="dxa"/>
+          <w:bottom w:w="39" w:type="dxa"/>
+          <w:right w:w="113" w:type="dxa"/>
+        </w:tblCellMar>
+        <w:tblLook w:firstColumn="1" w:firstRow="1" w:lastColumn="0" w:lastRow="0" w:noHBand="0" w:noVBand="1" w:val="04A0"/>
+      </w:tblPr>
+      <w:tblGrid>
+        <w:gridCol w:w="2835"/>
+        <w:gridCol w:w="6804"/>
+      </w:tblGrid>
+      <w:tr>
+        <w:trPr>
+          <w:cantSplit/>
+          <w:trHeight w:val="425" w:hRule="atLeast"/>
+        </w:trPr>
+        <w:tc>
+          <w:tcPr>
+            <w:tcW w:type="dxa" w:w="2835"/>
+            <w:shd w:val="clear" w:color="auto" w:fill="F1ECF9"/>
+            <w:vAlign w:val="center"/>
+          </w:tcPr>
+          <w:p>
+            <w:pPr>
+              <w:spacing w:before="0" w:after="0"/>
+            </w:pPr>
+            <w:r>
+              <w:rPr>
+                <w:b/>
+                <w:i w:val="0"/>
+                <w:color w:val="4A2A82"/>
+                <w:sz w:val="19"/>
+              </w:rPr>
+              <w:t>Data și intervalul orar efectiv</w:t>
+            </w:r>
+          </w:p>
+        </w:tc>
+        <w:tc>
+          <w:tcPr>
+            <w:tcW w:type="dxa" w:w="6803"/>
+            <w:vAlign w:val="center"/>
+          </w:tcPr>
+          <w:p>
+            <w:pPr>
+              <w:tabs>
+                <w:tab w:pos="2608" w:val="right" w:leader="underscore"/>
+                <w:tab w:pos="6520" w:val="right" w:leader="underscore"/>
+              </w:tabs>
+              <w:spacing w:before="60" w:after="0"/>
+            </w:pPr>
+            <w:r>
+              <w:rPr>
+                <w:sz w:val="19"/>
+              </w:rPr>
+              <w:tab/>
+            </w:r>
+            <w:r>
+              <w:rPr>
+                <w:b w:val="0"/>
+                <w:sz w:val="19"/>
+              </w:rPr>
+              <w:t xml:space="preserve">   ora: </w:t>
+            </w:r>
+            <w:r>
+              <w:rPr>
+                <w:sz w:val="19"/>
+              </w:rPr>
+              <w:tab/>
+            </w:r>
+          </w:p>
+        </w:tc>
+      </w:tr>
+      <w:tr>
+        <w:trPr>
+          <w:cantSplit/>
+          <w:trHeight w:val="425" w:hRule="atLeast"/>
+        </w:trPr>
+        <w:tc>
+          <w:tcPr>
+            <w:tcW w:type="dxa" w:w="2835"/>
+            <w:shd w:val="clear" w:color="auto" w:fill="F1ECF9"/>
+            <w:vAlign w:val="center"/>
+          </w:tcPr>
+          <w:p>
+            <w:pPr>
+              <w:spacing w:before="0" w:after="0"/>
+            </w:pPr>
+            <w:r>
+              <w:rPr>
+                <w:b/>
+                <w:i w:val="0"/>
+                <w:color w:val="4A2A82"/>
+                <w:sz w:val="19"/>
+              </w:rPr>
+              <w:t>Unitatea de învățământ / clasa</w:t>
+            </w:r>
+          </w:p>
+        </w:tc>
+        <w:tc>
+          <w:tcPr>
+            <w:tcW w:type="dxa" w:w="6803"/>
+            <w:vAlign w:val="center"/>
+          </w:tcPr>
+          <w:p>
+            <w:pPr>
+              <w:tabs>
+                <w:tab w:pos="6520" w:val="right" w:leader="underscore"/>
+              </w:tabs>
+              <w:spacing w:before="60" w:after="0"/>
+            </w:pPr>
+            <w:r>
+              <w:rPr>
+                <w:color w:val="9A9A9A"/>
+                <w:sz w:val="19"/>
+              </w:rPr>
+              <w:tab/>
+            </w:r>
+          </w:p>
+        </w:tc>
+      </w:tr>
+      <w:tr>
+        <w:trPr>
+          <w:cantSplit/>
+          <w:trHeight w:val="425" w:hRule="atLeast"/>
+        </w:trPr>
+        <w:tc>
+          <w:tcPr>
+            <w:tcW w:type="dxa" w:w="2835"/>
+            <w:shd w:val="clear" w:color="auto" w:fill="F1ECF9"/>
+            <w:vAlign w:val="center"/>
+          </w:tcPr>
+          <w:p>
+            <w:pPr>
+              <w:spacing w:before="0" w:after="0"/>
+            </w:pPr>
+            <w:r>
+              <w:rPr>
+                <w:b/>
+                <w:i w:val="0"/>
+                <w:color w:val="4A2A82"/>
+                <w:sz w:val="19"/>
+              </w:rPr>
+              <w:t>Număr elevi participanți</w:t>
+            </w:r>
+          </w:p>
+        </w:tc>
+        <w:tc>
+          <w:tcPr>
+            <w:tcW w:type="dxa" w:w="6803"/>
+            <w:vAlign w:val="center"/>
+          </w:tcPr>
+          <w:p>
+            <w:pPr>
+              <w:tabs>
+                <w:tab w:pos="1984" w:val="right" w:leader="underscore"/>
+                <w:tab w:pos="4252" w:val="right" w:leader="underscore"/>
+                <w:tab w:pos="6520" w:val="right" w:leader="underscore"/>
+              </w:tabs>
+              <w:spacing w:before="60" w:after="0"/>
+            </w:pPr>
+            <w:r>
+              <w:rPr>
+                <w:b w:val="0"/>
+                <w:sz w:val="19"/>
+              </w:rPr>
+              <w:t xml:space="preserve">total: </w:t>
+            </w:r>
+            <w:r>
+              <w:rPr>
+                <w:sz w:val="19"/>
+              </w:rPr>
+              <w:tab/>
+            </w:r>
+            <w:r>
+              <w:rPr>
+                <w:b w:val="0"/>
+                <w:sz w:val="19"/>
+              </w:rPr>
+              <w:t xml:space="preserve">   din care fete: </w:t>
+            </w:r>
+            <w:r>
+              <w:rPr>
+                <w:sz w:val="19"/>
+              </w:rPr>
+              <w:tab/>
+            </w:r>
+            <w:r>
+              <w:rPr>
+                <w:b w:val="0"/>
+                <w:sz w:val="19"/>
+              </w:rPr>
+              <w:t xml:space="preserve">   băieți: </w:t>
+            </w:r>
+            <w:r>
+              <w:rPr>
+                <w:sz w:val="19"/>
+              </w:rPr>
+              <w:tab/>
+            </w:r>
+          </w:p>
+        </w:tc>
+      </w:tr>
+    </w:tbl>
+    <w:p>
+      <w:pPr>
+        <w:spacing w:before="0" w:after="0" w:line="120" w:lineRule="exact"/>
+      </w:pPr>
+      <w:r/>
+    </w:p>
+    <w:p>
+      <w:pPr>
+        <w:keepNext/>
+        <w:spacing w:before="160" w:after="80"/>
+      </w:pPr>
+      <w:r>
+        <w:rPr>
+          <w:b/>
+          <w:i w:val="0"/>
+          <w:color w:val="4A2A82"/>
+          <w:sz w:val="22"/>
+        </w:rPr>
+        <w:t>Gradul de realizare a obiectivelor</w:t>
+      </w:r>
+    </w:p>
+    <w:tbl>
+      <w:tblPr>
+        <w:tblW w:w="9639" w:type="dxa"/>
+        <w:jc w:val="center"/>
+        <w:tblBorders>
+          <w:top w:val="single" w:sz="4" w:space="0" w:color="DCD0F0"/>
+          <w:left w:val="single" w:sz="4" w:space="0" w:color="DCD0F0"/>
+          <w:bottom w:val="single" w:sz="4" w:space="0" w:color="DCD0F0"/>
+          <w:right w:val="single" w:sz="4" w:space="0" w:color="DCD0F0"/>
+          <w:insideH w:val="single" w:sz="4" w:space="0" w:color="DCD0F0"/>
+          <w:insideV w:val="single" w:sz="4" w:space="0" w:color="DCD0F0"/>
+        </w:tblBorders>
+        <w:tblLayout w:type="fixed"/>
+        <w:tblCellMar>
+          <w:top w:w="34" w:type="dxa"/>
+          <w:left w:w="85" w:type="dxa"/>
+          <w:bottom w:w="34" w:type="dxa"/>
+          <w:right w:w="85" w:type="dxa"/>
+        </w:tblCellMar>
+        <w:tblLook w:firstColumn="1" w:firstRow="1" w:lastColumn="0" w:lastRow="0" w:noHBand="0" w:noVBand="1" w:val="04A0"/>
+      </w:tblPr>
+      <w:tblGrid>
+        <w:gridCol w:w="4195"/>
+        <w:gridCol w:w="907"/>
+        <w:gridCol w:w="907"/>
+        <w:gridCol w:w="1077"/>
+        <w:gridCol w:w="2551"/>
+      </w:tblGrid>
+      <w:tr>
+        <w:trPr>
+          <w:cantSplit/>
+          <w:tblHeader/>
+        </w:trPr>
+        <w:tc>
+          <w:tcPr>
+            <w:tcW w:type="dxa" w:w="4195"/>
+            <w:shd w:val="clear" w:color="auto" w:fill="4A2A82"/>
+          </w:tcPr>
+          <w:p>
+            <w:pPr>
+              <w:spacing w:before="0" w:after="0"/>
+            </w:pPr>
+            <w:r>
+              <w:rPr>
+                <w:b/>
+                <w:i w:val="0"/>
+                <w:color w:val="FFFFFF"/>
+                <w:sz w:val="18"/>
+              </w:rPr>
+              <w:t>Obiectiv</w:t>
+            </w:r>
+          </w:p>
+        </w:tc>
+        <w:tc>
+          <w:tcPr>
+            <w:tcW w:type="dxa" w:w="907"/>
+            <w:shd w:val="clear" w:color="auto" w:fill="4A2A82"/>
+          </w:tcPr>
+          <w:p>
+            <w:pPr>
+              <w:spacing w:before="0" w:after="0"/>
+            </w:pPr>
+            <w:r>
+              <w:rPr>
+                <w:b/>
+                <w:i w:val="0"/>
+                <w:color w:val="FFFFFF"/>
+                <w:sz w:val="18"/>
+              </w:rPr>
+              <w:t>Realizat</w:t>
+            </w:r>
+          </w:p>
+        </w:tc>
+        <w:tc>
+          <w:tcPr>
+            <w:tcW w:type="dxa" w:w="907"/>
+            <w:shd w:val="clear" w:color="auto" w:fill="4A2A82"/>
+          </w:tcPr>
+          <w:p>
+            <w:pPr>
+              <w:spacing w:before="0" w:after="0"/>
+            </w:pPr>
+            <w:r>
+              <w:rPr>
+                <w:b/>
+                <w:i w:val="0"/>
+                <w:color w:val="FFFFFF"/>
+                <w:sz w:val="18"/>
+              </w:rPr>
+              <w:t>Parțial</w:t>
+            </w:r>
+          </w:p>
+        </w:tc>
+        <w:tc>
+          <w:tcPr>
+            <w:tcW w:type="dxa" w:w="1077"/>
+            <w:shd w:val="clear" w:color="auto" w:fill="4A2A82"/>
+          </w:tcPr>
+          <w:p>
+            <w:pPr>
+              <w:spacing w:before="0" w:after="0"/>
+            </w:pPr>
+            <w:r>
+              <w:rPr>
+                <w:b/>
+                <w:i w:val="0"/>
+                <w:color w:val="FFFFFF"/>
+                <w:sz w:val="18"/>
+              </w:rPr>
+              <w:t>Nerealizat</w:t>
+            </w:r>
+          </w:p>
+        </w:tc>
+        <w:tc>
+          <w:tcPr>
+            <w:tcW w:type="dxa" w:w="2551"/>
+            <w:shd w:val="clear" w:color="auto" w:fill="4A2A82"/>
+          </w:tcPr>
+          <w:p>
+            <w:pPr>
+              <w:spacing w:before="0" w:after="0"/>
+            </w:pPr>
+            <w:r>
+              <w:rPr>
+                <w:b/>
+                <w:i w:val="0"/>
+                <w:color w:val="FFFFFF"/>
+                <w:sz w:val="18"/>
+              </w:rPr>
+              <w:t>Observații</w:t>
+            </w:r>
+          </w:p>
+        </w:tc>
+      </w:tr>
+      <w:tr>
+        <w:trPr>
+          <w:cantSplit/>
+          <w:trHeight w:val="397" w:hRule="atLeast"/>
+        </w:trPr>
+        <w:tc>
+          <w:tcPr>
+            <w:tcW w:type="dxa" w:w="4195"/>
+          </w:tcPr>
+          <w:p>
+            <w:pPr>
+              <w:spacing w:before="0" w:after="0"/>
+            </w:pPr>
+            <w:r>
+              <w:rPr>
+                <w:b w:val="0"/>
+                <w:i w:val="0"/>
+                <w:sz w:val="18"/>
+              </w:rPr>
+              <w:t>O1 – numește cel puțin 2–3 puncte forte personale</w:t>
+            </w:r>
+          </w:p>
+        </w:tc>
+        <w:tc>
+          <w:tcPr>
+            <w:tcW w:type="dxa" w:w="907"/>
+          </w:tcPr>
+          <w:p>
+            <w:pPr>
+              <w:spacing w:before="0" w:after="0"/>
+              <w:jc w:val="center"/>
+            </w:pPr>
+            <w:r>
+              <w:rPr>
+                <w:b w:val="0"/>
+                <w:i w:val="0"/>
+                <w:sz w:val="18"/>
+              </w:rPr>
+              <w:t>☐</w:t>
+            </w:r>
+          </w:p>
+        </w:tc>
+        <w:tc>
+          <w:tcPr>
+            <w:tcW w:type="dxa" w:w="907"/>
+          </w:tcPr>
+          <w:p>
+            <w:pPr>
+              <w:spacing w:before="0" w:after="0"/>
+              <w:jc w:val="center"/>
+            </w:pPr>
+            <w:r>
+              <w:rPr>
+                <w:b w:val="0"/>
+                <w:i w:val="0"/>
+                <w:sz w:val="18"/>
+              </w:rPr>
+              <w:t>☐</w:t>
+            </w:r>
+          </w:p>
+        </w:tc>
+        <w:tc>
+          <w:tcPr>
+            <w:tcW w:type="dxa" w:w="1077"/>
+          </w:tcPr>
+          <w:p>
+            <w:pPr>
+              <w:spacing w:before="0" w:after="0"/>
+              <w:jc w:val="center"/>
+            </w:pPr>
+            <w:r>
+              <w:rPr>
+                <w:b w:val="0"/>
+                <w:i w:val="0"/>
+                <w:sz w:val="18"/>
+              </w:rPr>
+              <w:t>☐</w:t>
+            </w:r>
+          </w:p>
+        </w:tc>
+        <w:tc>
+          <w:tcPr>
+            <w:tcW w:type="dxa" w:w="2551"/>
+          </w:tcPr>
+          <w:p>
+            <w:pPr>
+              <w:spacing w:before="0" w:after="0"/>
+            </w:pPr>
+          </w:p>
+        </w:tc>
+      </w:tr>
+      <w:tr>
+        <w:trPr>
+          <w:cantSplit/>
+          <w:trHeight w:val="397" w:hRule="atLeast"/>
+        </w:trPr>
+        <w:tc>
+          <w:tcPr>
+            <w:tcW w:type="dxa" w:w="4195"/>
+          </w:tcPr>
+          <w:p>
+            <w:pPr>
+              <w:spacing w:before="0" w:after="0"/>
+            </w:pPr>
+            <w:r>
+              <w:rPr>
+                <w:b w:val="0"/>
+                <w:i w:val="0"/>
+                <w:sz w:val="18"/>
+              </w:rPr>
+              <w:t>O2 – descoperă o calitate observată de colegi</w:t>
+            </w:r>
+          </w:p>
+        </w:tc>
+        <w:tc>
+          <w:tcPr>
+            <w:tcW w:type="dxa" w:w="907"/>
+          </w:tcPr>
+          <w:p>
+            <w:pPr>
+              <w:spacing w:before="0" w:after="0"/>
+              <w:jc w:val="center"/>
+            </w:pPr>
+            <w:r>
+              <w:rPr>
+                <w:b w:val="0"/>
+                <w:i w:val="0"/>
+                <w:sz w:val="18"/>
+              </w:rPr>
+              <w:t>☐</w:t>
+            </w:r>
+          </w:p>
+        </w:tc>
+        <w:tc>
+          <w:tcPr>
+            <w:tcW w:type="dxa" w:w="907"/>
+          </w:tcPr>
+          <w:p>
+            <w:pPr>
+              <w:spacing w:before="0" w:after="0"/>
+              <w:jc w:val="center"/>
+            </w:pPr>
+            <w:r>
+              <w:rPr>
+                <w:b w:val="0"/>
+                <w:i w:val="0"/>
+                <w:sz w:val="18"/>
+              </w:rPr>
+              <w:t>☐</w:t>
+            </w:r>
+          </w:p>
+        </w:tc>
+        <w:tc>
+          <w:tcPr>
+            <w:tcW w:type="dxa" w:w="1077"/>
+          </w:tcPr>
+          <w:p>
+            <w:pPr>
+              <w:spacing w:before="0" w:after="0"/>
+              <w:jc w:val="center"/>
+            </w:pPr>
+            <w:r>
+              <w:rPr>
+                <w:b w:val="0"/>
+                <w:i w:val="0"/>
+                <w:sz w:val="18"/>
+              </w:rPr>
+              <w:t>☐</w:t>
+            </w:r>
+          </w:p>
+        </w:tc>
+        <w:tc>
+          <w:tcPr>
+            <w:tcW w:type="dxa" w:w="2551"/>
+          </w:tcPr>
+          <w:p>
+            <w:pPr>
+              <w:spacing w:before="0" w:after="0"/>
+            </w:pPr>
+          </w:p>
+        </w:tc>
+      </w:tr>
+      <w:tr>
+        <w:trPr>
+          <w:cantSplit/>
+          <w:trHeight w:val="397" w:hRule="atLeast"/>
+        </w:trPr>
+        <w:tc>
+          <w:tcPr>
+            <w:tcW w:type="dxa" w:w="4195"/>
+          </w:tcPr>
+          <w:p>
+            <w:pPr>
+              <w:spacing w:before="0" w:after="0"/>
+            </w:pPr>
+            <w:r>
+              <w:rPr>
+                <w:b w:val="0"/>
+                <w:i w:val="0"/>
+                <w:sz w:val="18"/>
+              </w:rPr>
+              <w:t>O3 – explică de ce o echipă are nevoie de puncte forte diferite</w:t>
+            </w:r>
+          </w:p>
+        </w:tc>
+        <w:tc>
+          <w:tcPr>
+            <w:tcW w:type="dxa" w:w="907"/>
+          </w:tcPr>
+          <w:p>
+            <w:pPr>
+              <w:spacing w:before="0" w:after="0"/>
+              <w:jc w:val="center"/>
+            </w:pPr>
+            <w:r>
+              <w:rPr>
+                <w:b w:val="0"/>
+                <w:i w:val="0"/>
+                <w:sz w:val="18"/>
+              </w:rPr>
+              <w:t>☐</w:t>
+            </w:r>
+          </w:p>
+        </w:tc>
+        <w:tc>
+          <w:tcPr>
+            <w:tcW w:type="dxa" w:w="907"/>
+          </w:tcPr>
+          <w:p>
+            <w:pPr>
+              <w:spacing w:before="0" w:after="0"/>
+              <w:jc w:val="center"/>
+            </w:pPr>
+            <w:r>
+              <w:rPr>
+                <w:b w:val="0"/>
+                <w:i w:val="0"/>
+                <w:sz w:val="18"/>
+              </w:rPr>
+              <w:t>☐</w:t>
+            </w:r>
+          </w:p>
+        </w:tc>
+        <w:tc>
+          <w:tcPr>
+            <w:tcW w:type="dxa" w:w="1077"/>
+          </w:tcPr>
+          <w:p>
+            <w:pPr>
+              <w:spacing w:before="0" w:after="0"/>
+              <w:jc w:val="center"/>
+            </w:pPr>
+            <w:r>
+              <w:rPr>
+                <w:b w:val="0"/>
+                <w:i w:val="0"/>
+                <w:sz w:val="18"/>
+              </w:rPr>
+              <w:t>☐</w:t>
+            </w:r>
+          </w:p>
+        </w:tc>
+        <w:tc>
+          <w:tcPr>
+            <w:tcW w:type="dxa" w:w="2551"/>
+          </w:tcPr>
+          <w:p>
+            <w:pPr>
+              <w:spacing w:before="0" w:after="0"/>
+            </w:pPr>
+          </w:p>
+        </w:tc>
+      </w:tr>
+      <w:tr>
+        <w:trPr>
+          <w:cantSplit/>
+          <w:trHeight w:val="397" w:hRule="atLeast"/>
+        </w:trPr>
+        <w:tc>
+          <w:tcPr>
+            <w:tcW w:type="dxa" w:w="4195"/>
+          </w:tcPr>
+          <w:p>
+            <w:pPr>
+              <w:spacing w:before="0" w:after="0"/>
+            </w:pPr>
+            <w:r>
+              <w:rPr>
+                <w:b w:val="0"/>
+                <w:i w:val="0"/>
+                <w:sz w:val="18"/>
+              </w:rPr>
+              <w:t>O4 – formulează un feedback pozitiv concret</w:t>
+            </w:r>
+          </w:p>
+        </w:tc>
+        <w:tc>
+          <w:tcPr>
+            <w:tcW w:type="dxa" w:w="907"/>
+          </w:tcPr>
+          <w:p>
+            <w:pPr>
+              <w:spacing w:before="0" w:after="0"/>
+              <w:jc w:val="center"/>
+            </w:pPr>
+            <w:r>
+              <w:rPr>
+                <w:b w:val="0"/>
+                <w:i w:val="0"/>
+                <w:sz w:val="18"/>
+              </w:rPr>
+              <w:t>☐</w:t>
+            </w:r>
+          </w:p>
+        </w:tc>
+        <w:tc>
+          <w:tcPr>
+            <w:tcW w:type="dxa" w:w="907"/>
+          </w:tcPr>
+          <w:p>
+            <w:pPr>
+              <w:spacing w:before="0" w:after="0"/>
+              <w:jc w:val="center"/>
+            </w:pPr>
+            <w:r>
+              <w:rPr>
+                <w:b w:val="0"/>
+                <w:i w:val="0"/>
+                <w:sz w:val="18"/>
+              </w:rPr>
+              <w:t>☐</w:t>
+            </w:r>
+          </w:p>
+        </w:tc>
+        <w:tc>
+          <w:tcPr>
+            <w:tcW w:type="dxa" w:w="1077"/>
+          </w:tcPr>
+          <w:p>
+            <w:pPr>
+              <w:spacing w:before="0" w:after="0"/>
+              <w:jc w:val="center"/>
+            </w:pPr>
+            <w:r>
+              <w:rPr>
+                <w:b w:val="0"/>
+                <w:i w:val="0"/>
+                <w:sz w:val="18"/>
+              </w:rPr>
+              <w:t>☐</w:t>
+            </w:r>
+          </w:p>
+        </w:tc>
+        <w:tc>
+          <w:tcPr>
+            <w:tcW w:type="dxa" w:w="2551"/>
+          </w:tcPr>
+          <w:p>
+            <w:pPr>
+              <w:spacing w:before="0" w:after="0"/>
+            </w:pPr>
+          </w:p>
+        </w:tc>
+      </w:tr>
+    </w:tbl>
+    <w:p>
+      <w:pPr>
+        <w:spacing w:before="0" w:after="0" w:line="120" w:lineRule="exact"/>
+      </w:pPr>
+      <w:r/>
+    </w:p>
+    <w:p>
+      <w:pPr>
+        <w:keepNext/>
+        <w:spacing w:before="160" w:after="80"/>
+      </w:pPr>
+      <w:r>
+        <w:rPr>
+          <w:b/>
+          <w:i w:val="0"/>
+          <w:color w:val="4A2A82"/>
+          <w:sz w:val="22"/>
+        </w:rPr>
+        <w:t>Desfășurarea activității</w:t>
+      </w:r>
+    </w:p>
+    <w:tbl>
+      <w:tblPr>
+        <w:tblW w:w="9639" w:type="dxa"/>
+        <w:jc w:val="center"/>
+        <w:tblBorders>
+          <w:top w:val="nil"/>
+          <w:left w:val="nil"/>
+          <w:bottom w:val="nil"/>
+          <w:right w:val="nil"/>
+          <w:insideH w:val="nil"/>
+          <w:insideV w:val="nil"/>
+        </w:tblBorders>
+        <w:tblLayout w:type="fixed"/>
+        <w:tblCellMar>
+          <w:top w:w="22" w:type="dxa"/>
+          <w:left w:w="28" w:type="dxa"/>
+          <w:bottom w:w="22" w:type="dxa"/>
+          <w:right w:w="28" w:type="dxa"/>
+        </w:tblCellMar>
+        <w:tblLook w:firstColumn="1" w:firstRow="1" w:lastColumn="0" w:lastRow="0" w:noHBand="0" w:noVBand="1" w:val="04A0"/>
+      </w:tblPr>
+      <w:tblGrid>
+        <w:gridCol w:w="4819"/>
+        <w:gridCol w:w="4819"/>
+      </w:tblGrid>
+      <w:tr>
+        <w:tc>
+          <w:tcPr>
+            <w:tcW w:type="dxa" w:w="4819"/>
+          </w:tcPr>
+          <w:p>
+            <w:pPr>
+              <w:spacing w:before="0" w:after="0"/>
+            </w:pPr>
+            <w:r>
+              <w:rPr>
+                <w:color w:val="4A2A82"/>
+                <w:sz w:val="24"/>
+              </w:rPr>
+              <w:t xml:space="preserve">☐ </w:t>
+            </w:r>
+            <w:r>
+              <w:rPr>
+                <w:b w:val="0"/>
+                <w:i w:val="0"/>
+                <w:sz w:val="20"/>
+              </w:rPr>
+              <w:t>conform scenariului</w:t>
+            </w:r>
+          </w:p>
+        </w:tc>
+        <w:tc>
+          <w:tcPr>
+            <w:tcW w:type="dxa" w:w="4819"/>
+          </w:tcPr>
+          <w:p>
+            <w:pPr>
+              <w:spacing w:before="0" w:after="0"/>
+            </w:pPr>
+            <w:r>
+              <w:rPr>
+                <w:color w:val="4A2A82"/>
+                <w:sz w:val="24"/>
+              </w:rPr>
+              <w:t xml:space="preserve">☐ </w:t>
+            </w:r>
+            <w:r>
+              <w:rPr>
+                <w:b w:val="0"/>
+                <w:i w:val="0"/>
+                <w:sz w:val="20"/>
+              </w:rPr>
+              <w:t>cu adaptări (descrise mai jos)</w:t>
+            </w:r>
+          </w:p>
+        </w:tc>
+      </w:tr>
+    </w:tbl>
+    <w:p>
+      <w:pPr>
+        <w:tabs>
+          <w:tab w:pos="9638" w:val="right" w:leader="underscore"/>
+        </w:tabs>
+        <w:spacing w:before="160" w:after="0"/>
+      </w:pPr>
+      <w:r>
+        <w:rPr>
+          <w:color w:val="9A9A9A"/>
+          <w:sz w:val="20"/>
+        </w:rPr>
+        <w:tab/>
+      </w:r>
+    </w:p>
+    <w:p>
+      <w:pPr>
+        <w:keepNext/>
+        <w:spacing w:before="100" w:after="0"/>
+      </w:pPr>
+      <w:r>
+        <w:rPr>
+          <w:b/>
+          <w:i w:val="0"/>
+          <w:sz w:val="20"/>
+        </w:rPr>
+        <w:t>Implicarea și participarea elevilor</w:t>
+      </w:r>
+    </w:p>
+    <w:p>
+      <w:pPr>
+        <w:tabs>
+          <w:tab w:pos="9638" w:val="right" w:leader="underscore"/>
+        </w:tabs>
+        <w:spacing w:before="160" w:after="0"/>
+      </w:pPr>
+      <w:r>
+        <w:rPr>
+          <w:color w:val="9A9A9A"/>
+          <w:sz w:val="20"/>
+        </w:rPr>
+        <w:tab/>
+      </w:r>
+    </w:p>
+    <w:p>
+      <w:pPr>
+        <w:tabs>
+          <w:tab w:pos="9638" w:val="right" w:leader="underscore"/>
+        </w:tabs>
+        <w:spacing w:before="160" w:after="0"/>
+      </w:pPr>
+      <w:r>
+        <w:rPr>
+          <w:color w:val="9A9A9A"/>
+          <w:sz w:val="20"/>
+        </w:rPr>
+        <w:tab/>
+      </w:r>
+    </w:p>
+    <w:p>
+      <w:pPr>
+        <w:keepNext/>
+        <w:spacing w:before="100" w:after="0"/>
+      </w:pPr>
+      <w:r>
+        <w:rPr>
+          <w:b/>
+          <w:i w:val="0"/>
+          <w:sz w:val="20"/>
+        </w:rPr>
+        <w:t>Rezultate obținute / produse ale activității</w:t>
+      </w:r>
+    </w:p>
+    <w:p>
+      <w:pPr>
+        <w:keepNext/>
+        <w:spacing w:before="0" w:after="0"/>
+      </w:pPr>
+      <w:r>
+        <w:rPr>
+          <w:b w:val="0"/>
+          <w:i/>
+          <w:color w:val="666666"/>
+          <w:sz w:val="17"/>
+        </w:rPr>
+        <w:t>De ex.: nr. de fișe „Detectivul” completate, Harta echipei (fotografie), Cardurile de agent, biletele de ieșire.</w:t>
+      </w:r>
+    </w:p>
+    <w:p>
+      <w:pPr>
+        <w:tabs>
+          <w:tab w:pos="9638" w:val="right" w:leader="underscore"/>
+        </w:tabs>
+        <w:spacing w:before="160" w:after="0"/>
+      </w:pPr>
+      <w:r>
+        <w:rPr>
+          <w:color w:val="9A9A9A"/>
+          <w:sz w:val="20"/>
+        </w:rPr>
+        <w:tab/>
+      </w:r>
+    </w:p>
+    <w:p>
+      <w:pPr>
+        <w:tabs>
+          <w:tab w:pos="9638" w:val="right" w:leader="underscore"/>
+        </w:tabs>
+        <w:spacing w:before="160" w:after="0"/>
+      </w:pPr>
+      <w:r>
+        <w:rPr>
+          <w:color w:val="9A9A9A"/>
+          <w:sz w:val="20"/>
+        </w:rPr>
+        <w:tab/>
+      </w:r>
+    </w:p>
+    <w:p>
+      <w:pPr>
+        <w:keepNext/>
+        <w:spacing w:before="100" w:after="0"/>
+      </w:pPr>
+      <w:r>
+        <w:rPr>
+          <w:b/>
+          <w:i w:val="0"/>
+          <w:sz w:val="20"/>
+        </w:rPr>
+        <w:t>Dificultăți întâmpinate și modul de rezolvare</w:t>
+      </w:r>
+    </w:p>
+    <w:p>
+      <w:pPr>
+        <w:tabs>
+          <w:tab w:pos="9638" w:val="right" w:leader="underscore"/>
+        </w:tabs>
+        <w:spacing w:before="160" w:after="0"/>
+      </w:pPr>
+      <w:r>
+        <w:rPr>
+          <w:color w:val="9A9A9A"/>
+          <w:sz w:val="20"/>
+        </w:rPr>
+        <w:tab/>
+      </w:r>
+    </w:p>
+    <w:p>
+      <w:pPr>
+        <w:tabs>
+          <w:tab w:pos="9638" w:val="right" w:leader="underscore"/>
+        </w:tabs>
+        <w:spacing w:before="160" w:after="0"/>
+      </w:pPr>
+      <w:r>
+        <w:rPr>
+          <w:color w:val="9A9A9A"/>
+          <w:sz w:val="20"/>
+        </w:rPr>
+        <w:tab/>
+      </w:r>
+    </w:p>
+    <w:p>
+      <w:pPr>
+        <w:keepNext/>
+        <w:spacing w:before="100" w:after="0"/>
+      </w:pPr>
+      <w:r>
+        <w:rPr>
+          <w:b/>
+          <w:i w:val="0"/>
+          <w:sz w:val="20"/>
+        </w:rPr>
+        <w:t>Concluzii și recomandări</w:t>
+      </w:r>
+    </w:p>
+    <w:p>
+      <w:pPr>
+        <w:tabs>
+          <w:tab w:pos="9638" w:val="right" w:leader="underscore"/>
+        </w:tabs>
+        <w:spacing w:before="160" w:after="0"/>
+      </w:pPr>
+      <w:r>
+        <w:rPr>
+          <w:color w:val="9A9A9A"/>
+          <w:sz w:val="20"/>
+        </w:rPr>
+        <w:tab/>
+      </w:r>
+    </w:p>
+    <w:p>
+      <w:pPr>
+        <w:tabs>
+          <w:tab w:pos="9638" w:val="right" w:leader="underscore"/>
+        </w:tabs>
+        <w:spacing w:before="160" w:after="0"/>
+      </w:pPr>
+      <w:r>
+        <w:rPr>
+          <w:color w:val="9A9A9A"/>
+          <w:sz w:val="20"/>
+        </w:rPr>
+        <w:tab/>
+      </w:r>
+    </w:p>
+    <w:p>
+      <w:pPr>
+        <w:spacing w:before="0" w:after="0" w:line="120" w:lineRule="exact"/>
+      </w:pPr>
+      <w:r/>
+    </w:p>
+    <w:tbl>
+      <w:tblPr>
+        <w:tblW w:w="9639" w:type="dxa"/>
+        <w:jc w:val="center"/>
+        <w:tblBorders>
+          <w:top w:val="nil"/>
+          <w:left w:val="nil"/>
+          <w:bottom w:val="nil"/>
+          <w:right w:val="nil"/>
+          <w:insideH w:val="nil"/>
+          <w:insideV w:val="nil"/>
+        </w:tblBorders>
+        <w:tblLayout w:type="fixed"/>
+        <w:tblCellMar>
+          <w:top w:w="56" w:type="dxa"/>
+          <w:left w:w="113" w:type="dxa"/>
+          <w:bottom w:w="56" w:type="dxa"/>
+          <w:right w:w="113" w:type="dxa"/>
+        </w:tblCellMar>
+        <w:tblLook w:firstColumn="1" w:firstRow="1" w:lastColumn="0" w:lastRow="0" w:noHBand="0" w:noVBand="1" w:val="04A0"/>
+      </w:tblPr>
+      <w:tblGrid>
+        <w:gridCol w:w="4819"/>
+        <w:gridCol w:w="4819"/>
+      </w:tblGrid>
+      <w:tr>
+        <w:trPr>
+          <w:cantSplit/>
+        </w:trPr>
+        <w:tc>
+          <w:tcPr>
+            <w:tcW w:type="dxa" w:w="4819"/>
+          </w:tcPr>
+          <w:p>
+            <w:pPr>
+              <w:tabs>
+                <w:tab w:pos="4252" w:val="right" w:leader="underscore"/>
+              </w:tabs>
+              <w:spacing w:before="120" w:after="0"/>
+            </w:pPr>
+            <w:r>
+              <w:rPr>
+                <w:b/>
+                <w:sz w:val="20"/>
+              </w:rPr>
+              <w:t xml:space="preserve">Data: </w:t>
+            </w:r>
+            <w:r>
+              <w:rPr>
+                <w:sz w:val="20"/>
+              </w:rPr>
+              <w:tab/>
+            </w:r>
+          </w:p>
+        </w:tc>
+        <w:tc>
+          <w:tcPr>
+            <w:tcW w:type="dxa" w:w="4819"/>
+          </w:tcPr>
+          <w:p>
+            <w:pPr>
+              <w:spacing w:before="0" w:after="0"/>
+              <w:jc w:val="center"/>
+            </w:pPr>
+            <w:r>
+              <w:rPr>
+                <w:b/>
+                <w:i w:val="0"/>
+                <w:sz w:val="20"/>
+              </w:rPr>
+              <w:t>Facilitator comunitar 2</w:t>
+            </w:r>
+          </w:p>
+          <w:p>
+            <w:pPr>
+              <w:tabs>
+                <w:tab w:pos="4535" w:val="right" w:leader="underscore"/>
+              </w:tabs>
+              <w:spacing w:before="160" w:after="0"/>
+            </w:pPr>
+            <w:r>
+              <w:rPr>
+                <w:b/>
+                <w:sz w:val="20"/>
+              </w:rPr>
+              <w:t xml:space="preserve">Nume: </w:t>
+            </w:r>
+            <w:r>
+              <w:rPr>
+                <w:sz w:val="20"/>
+              </w:rPr>
+              <w:tab/>
+            </w:r>
+          </w:p>
+          <w:p>
+            <w:pPr>
+              <w:tabs>
+                <w:tab w:pos="4535" w:val="right" w:leader="underscore"/>
+              </w:tabs>
+              <w:spacing w:before="240" w:after="0"/>
+            </w:pPr>
+            <w:r>
+              <w:rPr>
+                <w:b/>
+                <w:sz w:val="20"/>
+              </w:rPr>
+              <w:t xml:space="preserve">Semnătura: </w:t>
+            </w:r>
+            <w:r>
+              <w:rPr>
+                <w:sz w:val="20"/>
+              </w:rPr>
+              <w:tab/>
+            </w:r>
+          </w:p>
+        </w:tc>
+      </w:tr>
+    </w:tbl>
     <w:p>
       <w:pPr>
         <w:spacing w:after="0"/>

</xml_diff>

<commit_message>
Corelează fișa justificativă cu atribuțiile din fișa postului
Etapele de lucru din fișa activității sunt formulate după atribuțiile
Facilitatorului comunitar 2 (pct. 3 din fișa postului), cu o coloană
care indică atribuția aferentă. Se adaugă numele titularului și codul
COR, dovezile cerute de fișa postului și, în raport, verificările
privind acordurile pentru minori, transmiterea către Expertul
comunicare și arhivarea.

Co-Authored-By: Claude Opus 5.5 <noreply@anthropic.com>
Claude-Session: https://claude.ai/code/session_014YvKj2uLd5NfjHU1PMAHuV
</commit_message>
<xml_diff>
--- a/atelier_puncte_forte/Sedinta_1_Cine_sunt_eu_Scenariu_si_Anexe.docx
+++ b/atelier_puncte_forte/Sedinta_1_Cine_sunt_eu_Scenariu_si_Anexe.docx
@@ -423,17 +423,61 @@
           </w:tcPr>
           <w:p>
             <w:pPr>
-              <w:tabs>
-                <w:tab w:pos="6520" w:val="right" w:leader="underscore"/>
-              </w:tabs>
-              <w:spacing w:before="60" w:after="0"/>
-            </w:pPr>
-            <w:r>
-              <w:rPr>
-                <w:color w:val="9A9A9A"/>
-                <w:sz w:val="19"/>
-              </w:rPr>
-              <w:tab/>
+              <w:spacing w:before="0" w:after="0"/>
+            </w:pPr>
+            <w:r>
+              <w:rPr>
+                <w:b w:val="0"/>
+                <w:i w:val="0"/>
+                <w:sz w:val="19"/>
+              </w:rPr>
+              <w:t>GOLOVATIC LIVIA</w:t>
+            </w:r>
+          </w:p>
+        </w:tc>
+      </w:tr>
+      <w:tr>
+        <w:trPr>
+          <w:cantSplit/>
+          <w:trHeight w:val="425" w:hRule="atLeast"/>
+        </w:trPr>
+        <w:tc>
+          <w:tcPr>
+            <w:tcW w:type="dxa" w:w="2835"/>
+            <w:shd w:val="clear" w:color="auto" w:fill="F1ECF9"/>
+            <w:vAlign w:val="center"/>
+          </w:tcPr>
+          <w:p>
+            <w:pPr>
+              <w:spacing w:before="0" w:after="0"/>
+            </w:pPr>
+            <w:r>
+              <w:rPr>
+                <w:b/>
+                <w:i w:val="0"/>
+                <w:color w:val="4A2A82"/>
+                <w:sz w:val="19"/>
+              </w:rPr>
+              <w:t>Codul ocupației (COR)</w:t>
+            </w:r>
+          </w:p>
+        </w:tc>
+        <w:tc>
+          <w:tcPr>
+            <w:tcW w:type="dxa" w:w="6803"/>
+            <w:vAlign w:val="center"/>
+          </w:tcPr>
+          <w:p>
+            <w:pPr>
+              <w:spacing w:before="0" w:after="0"/>
+            </w:pPr>
+            <w:r>
+              <w:rPr>
+                <w:b w:val="0"/>
+                <w:i w:val="0"/>
+                <w:sz w:val="19"/>
+              </w:rPr>
+              <w:t>341204 – Facilitator de dezvoltare comunitară</w:t>
             </w:r>
           </w:p>
         </w:tc>
@@ -793,7 +837,7 @@
           <w:i w:val="0"/>
           <w:sz w:val="20"/>
         </w:rPr>
-        <w:t>Activitatea a fost proiectată și realizată de facilitatorul comunitar: elaborarea scenariului detaliat și a 9 materiale-suport (Anexele 1–9), pregătirea logistică, facilitarea directă a ședinței cu grupul țintă, evaluarea și raportarea rezultatelor. Ședința cuprinde 7 secvențe de învățare experiențială (joc de energizare, exercițiu anonim, interviu în perechi, hartă colectivă a resurselor, studiu de caz, cerc de feedback, reflecție individuală), descrise la secțiunea 9.</w:t>
+        <w:t>În conformitate cu atribuțiile din fișa postului (pct. 3), facilitatorul comunitar a planificat activitatea împreună cu managerul de proiect și echipa de implementare, a informat și a mobilizat elevii, a pregătit documentele și materialele de lucru (agenda și scenariul, Anexele 1–9, lista de prezență, instrumentele de feedback), a asigurat suportul logistic și a verificat condițiile de participare și siguranță pentru minori, a facilitat participarea elevilor la ședință, a monitorizat participarea și a documentat și raportat activitatea. Ședința cuprinde 7 secvențe de învățare experiențială (joc de energizare, exercițiu anonim, interviu în perechi, hartă colectivă a resurselor, studiu de caz, cerc de feedback, reflecție individuală), descrise la secțiunea 9.</w:t>
       </w:r>
     </w:p>
     <w:p>
@@ -808,7 +852,7 @@
           <w:color w:val="4A2A82"/>
           <w:sz w:val="22"/>
         </w:rPr>
-        <w:t>C. Repartizarea timpului de lucru al expertului</w:t>
+        <w:t>C. Repartizarea timpului de lucru al expertului, corelată cu atribuțiile din fișa postului</w:t>
       </w:r>
     </w:p>
     <w:tbl>
@@ -833,11 +877,12 @@
         <w:tblLook w:firstColumn="1" w:firstRow="1" w:lastColumn="0" w:lastRow="0" w:noHBand="0" w:noVBand="1" w:val="04A0"/>
       </w:tblPr>
       <w:tblGrid>
-        <w:gridCol w:w="510"/>
-        <w:gridCol w:w="2041"/>
-        <w:gridCol w:w="4989"/>
-        <w:gridCol w:w="1190"/>
-        <w:gridCol w:w="907"/>
+        <w:gridCol w:w="453"/>
+        <w:gridCol w:w="1417"/>
+        <w:gridCol w:w="4479"/>
+        <w:gridCol w:w="1927"/>
+        <w:gridCol w:w="737"/>
+        <w:gridCol w:w="623"/>
       </w:tblGrid>
       <w:tr>
         <w:trPr>
@@ -846,7 +891,7 @@
         </w:trPr>
         <w:tc>
           <w:tcPr>
-            <w:tcW w:type="dxa" w:w="510"/>
+            <w:tcW w:type="dxa" w:w="454"/>
             <w:shd w:val="clear" w:color="auto" w:fill="4A2A82"/>
           </w:tcPr>
           <w:p>
@@ -858,7 +903,7 @@
                 <w:b/>
                 <w:i w:val="0"/>
                 <w:color w:val="FFFFFF"/>
-                <w:sz w:val="18"/>
+                <w:sz w:val="17"/>
               </w:rPr>
               <w:t>Nr.</w:t>
             </w:r>
@@ -866,7 +911,7 @@
         </w:tc>
         <w:tc>
           <w:tcPr>
-            <w:tcW w:type="dxa" w:w="2041"/>
+            <w:tcW w:type="dxa" w:w="1417"/>
             <w:shd w:val="clear" w:color="auto" w:fill="4A2A82"/>
           </w:tcPr>
           <w:p>
@@ -878,7 +923,7 @@
                 <w:b/>
                 <w:i w:val="0"/>
                 <w:color w:val="FFFFFF"/>
-                <w:sz w:val="18"/>
+                <w:sz w:val="17"/>
               </w:rPr>
               <w:t>Etapa</w:t>
             </w:r>
@@ -886,7 +931,7 @@
         </w:tc>
         <w:tc>
           <w:tcPr>
-            <w:tcW w:type="dxa" w:w="4989"/>
+            <w:tcW w:type="dxa" w:w="4479"/>
             <w:shd w:val="clear" w:color="auto" w:fill="4A2A82"/>
           </w:tcPr>
           <w:p>
@@ -898,7 +943,7 @@
                 <w:b/>
                 <w:i w:val="0"/>
                 <w:color w:val="FFFFFF"/>
-                <w:sz w:val="18"/>
+                <w:sz w:val="17"/>
               </w:rPr>
               <w:t>Activități realizate concret</w:t>
             </w:r>
@@ -906,7 +951,7 @@
         </w:tc>
         <w:tc>
           <w:tcPr>
-            <w:tcW w:type="dxa" w:w="1191"/>
+            <w:tcW w:type="dxa" w:w="1928"/>
             <w:shd w:val="clear" w:color="auto" w:fill="4A2A82"/>
           </w:tcPr>
           <w:p>
@@ -918,7 +963,27 @@
                 <w:b/>
                 <w:i w:val="0"/>
                 <w:color w:val="FFFFFF"/>
-                <w:sz w:val="18"/>
+                <w:sz w:val="17"/>
+              </w:rPr>
+              <w:t>Atribuția din fișa postului (pct. 3)</w:t>
+            </w:r>
+          </w:p>
+        </w:tc>
+        <w:tc>
+          <w:tcPr>
+            <w:tcW w:type="dxa" w:w="737"/>
+            <w:shd w:val="clear" w:color="auto" w:fill="4A2A82"/>
+          </w:tcPr>
+          <w:p>
+            <w:pPr>
+              <w:spacing w:before="0" w:after="0"/>
+            </w:pPr>
+            <w:r>
+              <w:rPr>
+                <w:b/>
+                <w:i w:val="0"/>
+                <w:color w:val="FFFFFF"/>
+                <w:sz w:val="17"/>
               </w:rPr>
               <w:t>Data</w:t>
             </w:r>
@@ -926,7 +991,7 @@
         </w:tc>
         <w:tc>
           <w:tcPr>
-            <w:tcW w:type="dxa" w:w="907"/>
+            <w:tcW w:type="dxa" w:w="624"/>
             <w:shd w:val="clear" w:color="auto" w:fill="4A2A82"/>
           </w:tcPr>
           <w:p>
@@ -938,7 +1003,7 @@
                 <w:b/>
                 <w:i w:val="0"/>
                 <w:color w:val="FFFFFF"/>
-                <w:sz w:val="18"/>
+                <w:sz w:val="17"/>
               </w:rPr>
               <w:t>Nr. ore</w:t>
             </w:r>
@@ -951,17 +1016,17 @@
         </w:trPr>
         <w:tc>
           <w:tcPr>
-            <w:tcW w:type="dxa" w:w="510"/>
-          </w:tcPr>
-          <w:p>
-            <w:pPr>
-              <w:spacing w:before="0" w:after="0"/>
-            </w:pPr>
-            <w:r>
-              <w:rPr>
-                <w:b w:val="0"/>
-                <w:i w:val="0"/>
-                <w:sz w:val="18"/>
+            <w:tcW w:type="dxa" w:w="454"/>
+          </w:tcPr>
+          <w:p>
+            <w:pPr>
+              <w:spacing w:before="0" w:after="0"/>
+            </w:pPr>
+            <w:r>
+              <w:rPr>
+                <w:b w:val="0"/>
+                <w:i w:val="0"/>
+                <w:sz w:val="17"/>
               </w:rPr>
               <w:t>1</w:t>
             </w:r>
@@ -969,53 +1034,71 @@
         </w:tc>
         <w:tc>
           <w:tcPr>
-            <w:tcW w:type="dxa" w:w="2041"/>
-          </w:tcPr>
-          <w:p>
-            <w:pPr>
-              <w:spacing w:before="0" w:after="0"/>
-            </w:pPr>
-            <w:r>
-              <w:rPr>
-                <w:b w:val="0"/>
-                <w:i w:val="0"/>
-                <w:sz w:val="18"/>
-              </w:rPr>
-              <w:t>Documentare și proiectare</w:t>
-            </w:r>
-          </w:p>
-        </w:tc>
-        <w:tc>
-          <w:tcPr>
-            <w:tcW w:type="dxa" w:w="4989"/>
-          </w:tcPr>
-          <w:p>
-            <w:pPr>
-              <w:spacing w:before="0" w:after="0"/>
-            </w:pPr>
-            <w:r>
-              <w:rPr>
-                <w:b w:val="0"/>
-                <w:i w:val="0"/>
-                <w:sz w:val="18"/>
-              </w:rPr>
-              <w:t>Analiza nevoilor grupului țintă; documentare privind metode de dezvoltare personală adaptate vârstei de 13–14 ani; elaborarea scenariului detaliat (obiective, etape, timp, replici, întrebări de reflecție, gestionarea situațiilor dificile).</w:t>
-            </w:r>
-          </w:p>
-        </w:tc>
-        <w:tc>
-          <w:tcPr>
-            <w:tcW w:type="dxa" w:w="1191"/>
-          </w:tcPr>
-          <w:p>
-            <w:pPr>
-              <w:spacing w:before="0" w:after="0"/>
-            </w:pPr>
-          </w:p>
-        </w:tc>
-        <w:tc>
-          <w:tcPr>
-            <w:tcW w:type="dxa" w:w="907"/>
+            <w:tcW w:type="dxa" w:w="1417"/>
+          </w:tcPr>
+          <w:p>
+            <w:pPr>
+              <w:spacing w:before="0" w:after="0"/>
+            </w:pPr>
+            <w:r>
+              <w:rPr>
+                <w:b w:val="0"/>
+                <w:i w:val="0"/>
+                <w:sz w:val="17"/>
+              </w:rPr>
+              <w:t>Planificare</w:t>
+            </w:r>
+          </w:p>
+        </w:tc>
+        <w:tc>
+          <w:tcPr>
+            <w:tcW w:type="dxa" w:w="4479"/>
+          </w:tcPr>
+          <w:p>
+            <w:pPr>
+              <w:spacing w:before="0" w:after="0"/>
+            </w:pPr>
+            <w:r>
+              <w:rPr>
+                <w:b w:val="0"/>
+                <w:i w:val="0"/>
+                <w:sz w:val="17"/>
+              </w:rPr>
+              <w:t>Planificarea atelierului și a calendarului intervenției împreună cu managerul de proiect și echipa de implementare; stabilirea cu unitatea de învățământ a datei, a sălii și a grupului de elevi.</w:t>
+            </w:r>
+          </w:p>
+        </w:tc>
+        <w:tc>
+          <w:tcPr>
+            <w:tcW w:type="dxa" w:w="1928"/>
+          </w:tcPr>
+          <w:p>
+            <w:pPr>
+              <w:spacing w:before="0" w:after="0"/>
+            </w:pPr>
+            <w:r>
+              <w:rPr>
+                <w:b w:val="0"/>
+                <w:i/>
+                <w:sz w:val="17"/>
+              </w:rPr>
+              <w:t>Planifică activitățile comunitare și calendarul intervențiilor.</w:t>
+            </w:r>
+          </w:p>
+        </w:tc>
+        <w:tc>
+          <w:tcPr>
+            <w:tcW w:type="dxa" w:w="737"/>
+          </w:tcPr>
+          <w:p>
+            <w:pPr>
+              <w:spacing w:before="0" w:after="0"/>
+            </w:pPr>
+          </w:p>
+        </w:tc>
+        <w:tc>
+          <w:tcPr>
+            <w:tcW w:type="dxa" w:w="624"/>
           </w:tcPr>
           <w:p>
             <w:pPr>
@@ -1030,17 +1113,17 @@
         </w:trPr>
         <w:tc>
           <w:tcPr>
-            <w:tcW w:type="dxa" w:w="510"/>
-          </w:tcPr>
-          <w:p>
-            <w:pPr>
-              <w:spacing w:before="0" w:after="0"/>
-            </w:pPr>
-            <w:r>
-              <w:rPr>
-                <w:b w:val="0"/>
-                <w:i w:val="0"/>
-                <w:sz w:val="18"/>
+            <w:tcW w:type="dxa" w:w="454"/>
+          </w:tcPr>
+          <w:p>
+            <w:pPr>
+              <w:spacing w:before="0" w:after="0"/>
+            </w:pPr>
+            <w:r>
+              <w:rPr>
+                <w:b w:val="0"/>
+                <w:i w:val="0"/>
+                <w:sz w:val="17"/>
               </w:rPr>
               <w:t>2</w:t>
             </w:r>
@@ -1048,53 +1131,71 @@
         </w:tc>
         <w:tc>
           <w:tcPr>
-            <w:tcW w:type="dxa" w:w="2041"/>
-          </w:tcPr>
-          <w:p>
-            <w:pPr>
-              <w:spacing w:before="0" w:after="0"/>
-            </w:pPr>
-            <w:r>
-              <w:rPr>
-                <w:b w:val="0"/>
-                <w:i w:val="0"/>
-                <w:sz w:val="18"/>
-              </w:rPr>
-              <w:t>Elaborarea materialelor-suport</w:t>
-            </w:r>
-          </w:p>
-        </w:tc>
-        <w:tc>
-          <w:tcPr>
-            <w:tcW w:type="dxa" w:w="4989"/>
-          </w:tcPr>
-          <w:p>
-            <w:pPr>
-              <w:spacing w:before="0" w:after="0"/>
-            </w:pPr>
-            <w:r>
-              <w:rPr>
-                <w:b w:val="0"/>
-                <w:i w:val="0"/>
-                <w:sz w:val="18"/>
-              </w:rPr>
-              <w:t>Conceperea și redactarea celor 9 anexe: ecusoane, bilețele „Dosar secret”, Fișa 1 – Detectivul, indicatoare, cartonașe „Misiunea imposibilă”, banca de complimente, Cardul de agent, Fișa 2 – Harta mea, bilet de ieșire.</w:t>
-            </w:r>
-          </w:p>
-        </w:tc>
-        <w:tc>
-          <w:tcPr>
-            <w:tcW w:type="dxa" w:w="1191"/>
-          </w:tcPr>
-          <w:p>
-            <w:pPr>
-              <w:spacing w:before="0" w:after="0"/>
-            </w:pPr>
-          </w:p>
-        </w:tc>
-        <w:tc>
-          <w:tcPr>
-            <w:tcW w:type="dxa" w:w="907"/>
+            <w:tcW w:type="dxa" w:w="1417"/>
+          </w:tcPr>
+          <w:p>
+            <w:pPr>
+              <w:spacing w:before="0" w:after="0"/>
+            </w:pPr>
+            <w:r>
+              <w:rPr>
+                <w:b w:val="0"/>
+                <w:i w:val="0"/>
+                <w:sz w:val="17"/>
+              </w:rPr>
+              <w:t>Informare și mobilizare</w:t>
+            </w:r>
+          </w:p>
+        </w:tc>
+        <w:tc>
+          <w:tcPr>
+            <w:tcW w:type="dxa" w:w="4479"/>
+          </w:tcPr>
+          <w:p>
+            <w:pPr>
+              <w:spacing w:before="0" w:after="0"/>
+            </w:pPr>
+            <w:r>
+              <w:rPr>
+                <w:b w:val="0"/>
+                <w:i w:val="0"/>
+                <w:sz w:val="17"/>
+              </w:rPr>
+              <w:t>Informarea elevilor și a dirigintelui (și, după caz, a părinților) despre atelier, într-un limbaj accesibil; mobilizarea elevilor pentru participare; verificarea acordurilor necesare pentru minori, inclusiv pentru fotografii.</w:t>
+            </w:r>
+          </w:p>
+        </w:tc>
+        <w:tc>
+          <w:tcPr>
+            <w:tcW w:type="dxa" w:w="1928"/>
+          </w:tcPr>
+          <w:p>
+            <w:pPr>
+              <w:spacing w:before="0" w:after="0"/>
+            </w:pPr>
+            <w:r>
+              <w:rPr>
+                <w:b w:val="0"/>
+                <w:i/>
+                <w:sz w:val="17"/>
+              </w:rPr>
+              <w:t>Informează și mobilizează elevii și părinții.</w:t>
+            </w:r>
+          </w:p>
+        </w:tc>
+        <w:tc>
+          <w:tcPr>
+            <w:tcW w:type="dxa" w:w="737"/>
+          </w:tcPr>
+          <w:p>
+            <w:pPr>
+              <w:spacing w:before="0" w:after="0"/>
+            </w:pPr>
+          </w:p>
+        </w:tc>
+        <w:tc>
+          <w:tcPr>
+            <w:tcW w:type="dxa" w:w="624"/>
           </w:tcPr>
           <w:p>
             <w:pPr>
@@ -1109,17 +1210,17 @@
         </w:trPr>
         <w:tc>
           <w:tcPr>
-            <w:tcW w:type="dxa" w:w="510"/>
-          </w:tcPr>
-          <w:p>
-            <w:pPr>
-              <w:spacing w:before="0" w:after="0"/>
-            </w:pPr>
-            <w:r>
-              <w:rPr>
-                <w:b w:val="0"/>
-                <w:i w:val="0"/>
-                <w:sz w:val="18"/>
+            <w:tcW w:type="dxa" w:w="454"/>
+          </w:tcPr>
+          <w:p>
+            <w:pPr>
+              <w:spacing w:before="0" w:after="0"/>
+            </w:pPr>
+            <w:r>
+              <w:rPr>
+                <w:b w:val="0"/>
+                <w:i w:val="0"/>
+                <w:sz w:val="17"/>
               </w:rPr>
               <w:t>3</w:t>
             </w:r>
@@ -1127,53 +1228,71 @@
         </w:tc>
         <w:tc>
           <w:tcPr>
-            <w:tcW w:type="dxa" w:w="2041"/>
-          </w:tcPr>
-          <w:p>
-            <w:pPr>
-              <w:spacing w:before="0" w:after="0"/>
-            </w:pPr>
-            <w:r>
-              <w:rPr>
-                <w:b w:val="0"/>
-                <w:i w:val="0"/>
-                <w:sz w:val="18"/>
-              </w:rPr>
-              <w:t>Pregătire logistică</w:t>
-            </w:r>
-          </w:p>
-        </w:tc>
-        <w:tc>
-          <w:tcPr>
-            <w:tcW w:type="dxa" w:w="4989"/>
-          </w:tcPr>
-          <w:p>
-            <w:pPr>
-              <w:spacing w:before="0" w:after="0"/>
-            </w:pPr>
-            <w:r>
-              <w:rPr>
-                <w:b w:val="0"/>
-                <w:i w:val="0"/>
-                <w:sz w:val="18"/>
-              </w:rPr>
-              <w:t>Comunicarea cu unitatea de învățământ (stabilirea datei, a sălii și a grupului); multiplicarea și decuparea materialelor; pregătirea consumabilelor; amenajarea sălii.</w:t>
-            </w:r>
-          </w:p>
-        </w:tc>
-        <w:tc>
-          <w:tcPr>
-            <w:tcW w:type="dxa" w:w="1191"/>
-          </w:tcPr>
-          <w:p>
-            <w:pPr>
-              <w:spacing w:before="0" w:after="0"/>
-            </w:pPr>
-          </w:p>
-        </w:tc>
-        <w:tc>
-          <w:tcPr>
-            <w:tcW w:type="dxa" w:w="907"/>
+            <w:tcW w:type="dxa" w:w="1417"/>
+          </w:tcPr>
+          <w:p>
+            <w:pPr>
+              <w:spacing w:before="0" w:after="0"/>
+            </w:pPr>
+            <w:r>
+              <w:rPr>
+                <w:b w:val="0"/>
+                <w:i w:val="0"/>
+                <w:sz w:val="17"/>
+              </w:rPr>
+              <w:t>Documente și materiale de lucru</w:t>
+            </w:r>
+          </w:p>
+        </w:tc>
+        <w:tc>
+          <w:tcPr>
+            <w:tcW w:type="dxa" w:w="4479"/>
+          </w:tcPr>
+          <w:p>
+            <w:pPr>
+              <w:spacing w:before="0" w:after="0"/>
+            </w:pPr>
+            <w:r>
+              <w:rPr>
+                <w:b w:val="0"/>
+                <w:i w:val="0"/>
+                <w:sz w:val="17"/>
+              </w:rPr>
+              <w:t>Elaborarea agendei și a scenariului ședinței, a materialelor de lucru (Anexele 1–9), a listei de prezență și a instrumentelor de feedback (biletul de ieșire).</w:t>
+            </w:r>
+          </w:p>
+        </w:tc>
+        <w:tc>
+          <w:tcPr>
+            <w:tcW w:type="dxa" w:w="1928"/>
+          </w:tcPr>
+          <w:p>
+            <w:pPr>
+              <w:spacing w:before="0" w:after="0"/>
+            </w:pPr>
+            <w:r>
+              <w:rPr>
+                <w:b w:val="0"/>
+                <w:i/>
+                <w:sz w:val="17"/>
+              </w:rPr>
+              <w:t>Pregătește agende, liste de prezență, materiale de lucru, fișe de feedback.</w:t>
+            </w:r>
+          </w:p>
+        </w:tc>
+        <w:tc>
+          <w:tcPr>
+            <w:tcW w:type="dxa" w:w="737"/>
+          </w:tcPr>
+          <w:p>
+            <w:pPr>
+              <w:spacing w:before="0" w:after="0"/>
+            </w:pPr>
+          </w:p>
+        </w:tc>
+        <w:tc>
+          <w:tcPr>
+            <w:tcW w:type="dxa" w:w="624"/>
           </w:tcPr>
           <w:p>
             <w:pPr>
@@ -1188,17 +1307,17 @@
         </w:trPr>
         <w:tc>
           <w:tcPr>
-            <w:tcW w:type="dxa" w:w="510"/>
-          </w:tcPr>
-          <w:p>
-            <w:pPr>
-              <w:spacing w:before="0" w:after="0"/>
-            </w:pPr>
-            <w:r>
-              <w:rPr>
-                <w:b w:val="0"/>
-                <w:i w:val="0"/>
-                <w:sz w:val="18"/>
+            <w:tcW w:type="dxa" w:w="454"/>
+          </w:tcPr>
+          <w:p>
+            <w:pPr>
+              <w:spacing w:before="0" w:after="0"/>
+            </w:pPr>
+            <w:r>
+              <w:rPr>
+                <w:b w:val="0"/>
+                <w:i w:val="0"/>
+                <w:sz w:val="17"/>
               </w:rPr>
               <w:t>4</w:t>
             </w:r>
@@ -1206,53 +1325,71 @@
         </w:tc>
         <w:tc>
           <w:tcPr>
-            <w:tcW w:type="dxa" w:w="2041"/>
-          </w:tcPr>
-          <w:p>
-            <w:pPr>
-              <w:spacing w:before="0" w:after="0"/>
-            </w:pPr>
-            <w:r>
-              <w:rPr>
-                <w:b w:val="0"/>
-                <w:i w:val="0"/>
-                <w:sz w:val="18"/>
-              </w:rPr>
-              <w:t>Desfășurarea activității cu grupul țintă</w:t>
-            </w:r>
-          </w:p>
-        </w:tc>
-        <w:tc>
-          <w:tcPr>
-            <w:tcW w:type="dxa" w:w="4989"/>
-          </w:tcPr>
-          <w:p>
-            <w:pPr>
-              <w:spacing w:before="0" w:after="0"/>
-            </w:pPr>
-            <w:r>
-              <w:rPr>
-                <w:b w:val="0"/>
-                <w:i w:val="0"/>
-                <w:sz w:val="18"/>
-              </w:rPr>
-              <w:t>Facilitarea atelierului (60 de minute) conform scenariului; gestionarea listei de prezență; realizarea fotografiilor.</w:t>
-            </w:r>
-          </w:p>
-        </w:tc>
-        <w:tc>
-          <w:tcPr>
-            <w:tcW w:type="dxa" w:w="1191"/>
-          </w:tcPr>
-          <w:p>
-            <w:pPr>
-              <w:spacing w:before="0" w:after="0"/>
-            </w:pPr>
-          </w:p>
-        </w:tc>
-        <w:tc>
-          <w:tcPr>
-            <w:tcW w:type="dxa" w:w="907"/>
+            <w:tcW w:type="dxa" w:w="1417"/>
+          </w:tcPr>
+          <w:p>
+            <w:pPr>
+              <w:spacing w:before="0" w:after="0"/>
+            </w:pPr>
+            <w:r>
+              <w:rPr>
+                <w:b w:val="0"/>
+                <w:i w:val="0"/>
+                <w:sz w:val="17"/>
+              </w:rPr>
+              <w:t>Suport logistic</w:t>
+            </w:r>
+          </w:p>
+        </w:tc>
+        <w:tc>
+          <w:tcPr>
+            <w:tcW w:type="dxa" w:w="4479"/>
+          </w:tcPr>
+          <w:p>
+            <w:pPr>
+              <w:spacing w:before="0" w:after="0"/>
+            </w:pPr>
+            <w:r>
+              <w:rPr>
+                <w:b w:val="0"/>
+                <w:i w:val="0"/>
+                <w:sz w:val="17"/>
+              </w:rPr>
+              <w:t>Multiplicarea și decuparea materialelor, pregătirea consumabilelor, amenajarea sălii; verificarea condițiilor de participare și siguranță aplicabile minorilor.</w:t>
+            </w:r>
+          </w:p>
+        </w:tc>
+        <w:tc>
+          <w:tcPr>
+            <w:tcW w:type="dxa" w:w="1928"/>
+          </w:tcPr>
+          <w:p>
+            <w:pPr>
+              <w:spacing w:before="0" w:after="0"/>
+            </w:pPr>
+            <w:r>
+              <w:rPr>
+                <w:b w:val="0"/>
+                <w:i/>
+                <w:sz w:val="17"/>
+              </w:rPr>
+              <w:t>Asigură suportul logistic; verifică condițiile de siguranță pentru minori.</w:t>
+            </w:r>
+          </w:p>
+        </w:tc>
+        <w:tc>
+          <w:tcPr>
+            <w:tcW w:type="dxa" w:w="737"/>
+          </w:tcPr>
+          <w:p>
+            <w:pPr>
+              <w:spacing w:before="0" w:after="0"/>
+            </w:pPr>
+          </w:p>
+        </w:tc>
+        <w:tc>
+          <w:tcPr>
+            <w:tcW w:type="dxa" w:w="624"/>
           </w:tcPr>
           <w:p>
             <w:pPr>
@@ -1267,17 +1404,17 @@
         </w:trPr>
         <w:tc>
           <w:tcPr>
-            <w:tcW w:type="dxa" w:w="510"/>
-          </w:tcPr>
-          <w:p>
-            <w:pPr>
-              <w:spacing w:before="0" w:after="0"/>
-            </w:pPr>
-            <w:r>
-              <w:rPr>
-                <w:b w:val="0"/>
-                <w:i w:val="0"/>
-                <w:sz w:val="18"/>
+            <w:tcW w:type="dxa" w:w="454"/>
+          </w:tcPr>
+          <w:p>
+            <w:pPr>
+              <w:spacing w:before="0" w:after="0"/>
+            </w:pPr>
+            <w:r>
+              <w:rPr>
+                <w:b w:val="0"/>
+                <w:i w:val="0"/>
+                <w:sz w:val="17"/>
               </w:rPr>
               <w:t>5</w:t>
             </w:r>
@@ -1285,53 +1422,71 @@
         </w:tc>
         <w:tc>
           <w:tcPr>
-            <w:tcW w:type="dxa" w:w="2041"/>
-          </w:tcPr>
-          <w:p>
-            <w:pPr>
-              <w:spacing w:before="0" w:after="0"/>
-            </w:pPr>
-            <w:r>
-              <w:rPr>
-                <w:b w:val="0"/>
-                <w:i w:val="0"/>
-                <w:sz w:val="18"/>
-              </w:rPr>
-              <w:t>Evaluare și raportare</w:t>
-            </w:r>
-          </w:p>
-        </w:tc>
-        <w:tc>
-          <w:tcPr>
-            <w:tcW w:type="dxa" w:w="4989"/>
-          </w:tcPr>
-          <w:p>
-            <w:pPr>
-              <w:spacing w:before="0" w:after="0"/>
-            </w:pPr>
-            <w:r>
-              <w:rPr>
-                <w:b w:val="0"/>
-                <w:i w:val="0"/>
-                <w:sz w:val="18"/>
-              </w:rPr>
-              <w:t>Analiza biletelor de ieșire și a produselor elevilor; completarea raportului de desfășurare; centralizarea documentelor justificative; ajustarea planului pentru Ședința 2.</w:t>
-            </w:r>
-          </w:p>
-        </w:tc>
-        <w:tc>
-          <w:tcPr>
-            <w:tcW w:type="dxa" w:w="1191"/>
-          </w:tcPr>
-          <w:p>
-            <w:pPr>
-              <w:spacing w:before="0" w:after="0"/>
-            </w:pPr>
-          </w:p>
-        </w:tc>
-        <w:tc>
-          <w:tcPr>
-            <w:tcW w:type="dxa" w:w="907"/>
+            <w:tcW w:type="dxa" w:w="1417"/>
+          </w:tcPr>
+          <w:p>
+            <w:pPr>
+              <w:spacing w:before="0" w:after="0"/>
+            </w:pPr>
+            <w:r>
+              <w:rPr>
+                <w:b w:val="0"/>
+                <w:i w:val="0"/>
+                <w:sz w:val="17"/>
+              </w:rPr>
+              <w:t>Desfășurarea activității</w:t>
+            </w:r>
+          </w:p>
+        </w:tc>
+        <w:tc>
+          <w:tcPr>
+            <w:tcW w:type="dxa" w:w="4479"/>
+          </w:tcPr>
+          <w:p>
+            <w:pPr>
+              <w:spacing w:before="0" w:after="0"/>
+            </w:pPr>
+            <w:r>
+              <w:rPr>
+                <w:b w:val="0"/>
+                <w:i w:val="0"/>
+                <w:sz w:val="17"/>
+              </w:rPr>
+              <w:t>Facilitarea participării elevilor la atelier (60 de minute), conform scenariului; gestionarea listei de prezență; monitorizarea participării și a implicării elevilor.</w:t>
+            </w:r>
+          </w:p>
+        </w:tc>
+        <w:tc>
+          <w:tcPr>
+            <w:tcW w:type="dxa" w:w="1928"/>
+          </w:tcPr>
+          <w:p>
+            <w:pPr>
+              <w:spacing w:before="0" w:after="0"/>
+            </w:pPr>
+            <w:r>
+              <w:rPr>
+                <w:b w:val="0"/>
+                <w:i/>
+                <w:sz w:val="17"/>
+              </w:rPr>
+              <w:t>Facilitează participarea elevilor; monitorizează implicarea.</w:t>
+            </w:r>
+          </w:p>
+        </w:tc>
+        <w:tc>
+          <w:tcPr>
+            <w:tcW w:type="dxa" w:w="737"/>
+          </w:tcPr>
+          <w:p>
+            <w:pPr>
+              <w:spacing w:before="0" w:after="0"/>
+            </w:pPr>
+          </w:p>
+        </w:tc>
+        <w:tc>
+          <w:tcPr>
+            <w:tcW w:type="dxa" w:w="624"/>
           </w:tcPr>
           <w:p>
             <w:pPr>
@@ -1346,7 +1501,104 @@
         </w:trPr>
         <w:tc>
           <w:tcPr>
-            <w:tcW w:type="dxa" w:w="510"/>
+            <w:tcW w:type="dxa" w:w="454"/>
+          </w:tcPr>
+          <w:p>
+            <w:pPr>
+              <w:spacing w:before="0" w:after="0"/>
+            </w:pPr>
+            <w:r>
+              <w:rPr>
+                <w:b w:val="0"/>
+                <w:i w:val="0"/>
+                <w:sz w:val="17"/>
+              </w:rPr>
+              <w:t>6</w:t>
+            </w:r>
+          </w:p>
+        </w:tc>
+        <w:tc>
+          <w:tcPr>
+            <w:tcW w:type="dxa" w:w="1417"/>
+          </w:tcPr>
+          <w:p>
+            <w:pPr>
+              <w:spacing w:before="0" w:after="0"/>
+            </w:pPr>
+            <w:r>
+              <w:rPr>
+                <w:b w:val="0"/>
+                <w:i w:val="0"/>
+                <w:sz w:val="17"/>
+              </w:rPr>
+              <w:t>Monitorizare și raportare</w:t>
+            </w:r>
+          </w:p>
+        </w:tc>
+        <w:tc>
+          <w:tcPr>
+            <w:tcW w:type="dxa" w:w="4479"/>
+          </w:tcPr>
+          <w:p>
+            <w:pPr>
+              <w:spacing w:before="0" w:after="0"/>
+            </w:pPr>
+            <w:r>
+              <w:rPr>
+                <w:b w:val="0"/>
+                <w:i w:val="0"/>
+                <w:sz w:val="17"/>
+              </w:rPr>
+              <w:t>Centralizarea prezenței, a absențelor, a dificultăților și a feedbackului; informarea echipei; completarea raportului de desfășurare; transmiterea fotografiilor și a sintezei către Expertul comunicare (după verificarea acordurilor); arhivarea fizică și electronică a documentelor.</w:t>
+            </w:r>
+          </w:p>
+        </w:tc>
+        <w:tc>
+          <w:tcPr>
+            <w:tcW w:type="dxa" w:w="1928"/>
+          </w:tcPr>
+          <w:p>
+            <w:pPr>
+              <w:spacing w:before="0" w:after="0"/>
+            </w:pPr>
+            <w:r>
+              <w:rPr>
+                <w:b w:val="0"/>
+                <w:i/>
+                <w:sz w:val="17"/>
+              </w:rPr>
+              <w:t>Centralizează; transmite foto și sinteze Expertului comunicare; raportează; arhivează.</w:t>
+            </w:r>
+          </w:p>
+        </w:tc>
+        <w:tc>
+          <w:tcPr>
+            <w:tcW w:type="dxa" w:w="737"/>
+          </w:tcPr>
+          <w:p>
+            <w:pPr>
+              <w:spacing w:before="0" w:after="0"/>
+            </w:pPr>
+          </w:p>
+        </w:tc>
+        <w:tc>
+          <w:tcPr>
+            <w:tcW w:type="dxa" w:w="624"/>
+          </w:tcPr>
+          <w:p>
+            <w:pPr>
+              <w:spacing w:before="0" w:after="0"/>
+            </w:pPr>
+          </w:p>
+        </w:tc>
+      </w:tr>
+      <w:tr>
+        <w:trPr>
+          <w:cantSplit/>
+        </w:trPr>
+        <w:tc>
+          <w:tcPr>
+            <w:tcW w:type="dxa" w:w="454"/>
             <w:shd w:val="clear" w:color="auto" w:fill="FFF4D2"/>
           </w:tcPr>
           <w:p>
@@ -1357,7 +1609,7 @@
         </w:tc>
         <w:tc>
           <w:tcPr>
-            <w:tcW w:type="dxa" w:w="2041"/>
+            <w:tcW w:type="dxa" w:w="1417"/>
             <w:shd w:val="clear" w:color="auto" w:fill="FFF4D2"/>
           </w:tcPr>
           <w:p>
@@ -1368,7 +1620,7 @@
               <w:rPr>
                 <w:b/>
                 <w:i w:val="0"/>
-                <w:sz w:val="18"/>
+                <w:sz w:val="17"/>
               </w:rPr>
               <w:t>TOTAL ORE</w:t>
             </w:r>
@@ -1376,7 +1628,7 @@
         </w:tc>
         <w:tc>
           <w:tcPr>
-            <w:tcW w:type="dxa" w:w="4989"/>
+            <w:tcW w:type="dxa" w:w="4479"/>
             <w:shd w:val="clear" w:color="auto" w:fill="FFF4D2"/>
           </w:tcPr>
           <w:p>
@@ -1387,7 +1639,7 @@
         </w:tc>
         <w:tc>
           <w:tcPr>
-            <w:tcW w:type="dxa" w:w="1191"/>
+            <w:tcW w:type="dxa" w:w="1928"/>
             <w:shd w:val="clear" w:color="auto" w:fill="FFF4D2"/>
           </w:tcPr>
           <w:p>
@@ -1398,7 +1650,18 @@
         </w:tc>
         <w:tc>
           <w:tcPr>
-            <w:tcW w:type="dxa" w:w="907"/>
+            <w:tcW w:type="dxa" w:w="737"/>
+            <w:shd w:val="clear" w:color="auto" w:fill="FFF4D2"/>
+          </w:tcPr>
+          <w:p>
+            <w:pPr>
+              <w:spacing w:before="0" w:after="0"/>
+            </w:pPr>
+          </w:p>
+        </w:tc>
+        <w:tc>
+          <w:tcPr>
+            <w:tcW w:type="dxa" w:w="624"/>
             <w:shd w:val="clear" w:color="auto" w:fill="FFF4D2"/>
           </w:tcPr>
           <w:p>
@@ -1610,7 +1873,7 @@
                 <w:i w:val="0"/>
                 <w:sz w:val="19"/>
               </w:rPr>
-              <w:t>Lista de prezență semnată de participanți</w:t>
+              <w:t>Agenda și scenariul activității (prezentul document)</w:t>
             </w:r>
           </w:p>
         </w:tc>
@@ -1635,7 +1898,7 @@
                 <w:i w:val="0"/>
                 <w:sz w:val="19"/>
               </w:rPr>
-              <w:t>Fotografii din timpul activității (cu acordul părinților / GDPR)</w:t>
+              <w:t>Lista de prezență semnată de participanți</w:t>
             </w:r>
           </w:p>
         </w:tc>
@@ -1662,7 +1925,7 @@
                 <w:i w:val="0"/>
                 <w:sz w:val="19"/>
               </w:rPr>
-              <w:t>Scenariul activității și materialele-suport (prezentul document)</w:t>
+              <w:t>Materialele de lucru (Anexele) și fișele de feedback</w:t>
             </w:r>
           </w:p>
         </w:tc>
@@ -1688,6 +1951,58 @@
                 <w:sz w:val="19"/>
               </w:rPr>
               <w:t>Produse ale activității (fișe completate de elevi)</w:t>
+            </w:r>
+          </w:p>
+        </w:tc>
+      </w:tr>
+      <w:tr>
+        <w:tc>
+          <w:tcPr>
+            <w:tcW w:type="dxa" w:w="4819"/>
+          </w:tcPr>
+          <w:p>
+            <w:pPr>
+              <w:spacing w:before="0" w:after="0"/>
+            </w:pPr>
+            <w:r>
+              <w:rPr>
+                <w:color w:val="4A2A82"/>
+                <w:sz w:val="23"/>
+              </w:rPr>
+              <w:t xml:space="preserve">☐ </w:t>
+            </w:r>
+            <w:r>
+              <w:rPr>
+                <w:b w:val="0"/>
+                <w:i w:val="0"/>
+                <w:sz w:val="19"/>
+              </w:rPr>
+              <w:t>Fotografii (cu acordurile verificate, conform GDPR)</w:t>
+            </w:r>
+          </w:p>
+        </w:tc>
+        <w:tc>
+          <w:tcPr>
+            <w:tcW w:type="dxa" w:w="4819"/>
+          </w:tcPr>
+          <w:p>
+            <w:pPr>
+              <w:spacing w:before="0" w:after="0"/>
+            </w:pPr>
+            <w:r>
+              <w:rPr>
+                <w:color w:val="4A2A82"/>
+                <w:sz w:val="23"/>
+              </w:rPr>
+              <w:t xml:space="preserve">☐ </w:t>
+            </w:r>
+            <w:r>
+              <w:rPr>
+                <w:b w:val="0"/>
+                <w:i w:val="0"/>
+                <w:sz w:val="19"/>
+              </w:rPr>
+              <w:t>Dovada transmiterii foto / sintezei către Expertul comunicare</w:t>
             </w:r>
           </w:p>
         </w:tc>
@@ -1747,7 +2062,7 @@
     </w:tbl>
     <w:p>
       <w:pPr>
-        <w:spacing w:before="0" w:after="0" w:line="160" w:lineRule="exact"/>
+        <w:spacing w:before="0" w:after="0" w:line="80" w:lineRule="exact"/>
       </w:pPr>
       <w:r/>
     </w:p>
@@ -1780,7 +2095,7 @@
       <w:tr>
         <w:trPr>
           <w:cantSplit/>
-          <w:trHeight w:val="2381" w:hRule="atLeast"/>
+          <w:trHeight w:val="1871" w:hRule="atLeast"/>
         </w:trPr>
         <w:tc>
           <w:tcPr>
@@ -1803,7 +2118,7 @@
           </w:p>
           <w:p>
             <w:pPr>
-              <w:spacing w:before="0" w:after="80"/>
+              <w:spacing w:before="0" w:after="40"/>
               <w:jc w:val="center"/>
             </w:pPr>
             <w:r>
@@ -1814,6 +2129,40 @@
                 <w:sz w:val="18"/>
               </w:rPr>
               <w:t>Facilitator comunitar 2</w:t>
+            </w:r>
+          </w:p>
+          <w:p>
+            <w:pPr>
+              <w:spacing w:before="120" w:after="0"/>
+            </w:pPr>
+            <w:r>
+              <w:rPr>
+                <w:b w:val="0"/>
+                <w:i w:val="0"/>
+                <w:sz w:val="19"/>
+              </w:rPr>
+              <w:t>Nume: GOLOVATIC LIVIA</w:t>
+            </w:r>
+          </w:p>
+          <w:p>
+            <w:pPr>
+              <w:tabs>
+                <w:tab w:pos="2929" w:val="right" w:leader="underscore"/>
+              </w:tabs>
+              <w:spacing w:before="200" w:after="0"/>
+            </w:pPr>
+            <w:r>
+              <w:rPr>
+                <w:b/>
+                <w:sz w:val="19"/>
+              </w:rPr>
+              <w:t xml:space="preserve">Semnătura: </w:t>
+            </w:r>
+            <w:r>
+              <w:rPr>
+                <w:sz w:val="19"/>
+              </w:rPr>
+              <w:tab/>
             </w:r>
           </w:p>
           <w:p>
@@ -1828,13 +2177,48 @@
                 <w:b/>
                 <w:sz w:val="19"/>
               </w:rPr>
-              <w:t xml:space="preserve">Nume: </w:t>
+              <w:t xml:space="preserve">Data: </w:t>
             </w:r>
             <w:r>
               <w:rPr>
                 <w:sz w:val="19"/>
               </w:rPr>
               <w:tab/>
+            </w:r>
+          </w:p>
+        </w:tc>
+        <w:tc>
+          <w:tcPr>
+            <w:tcW w:type="dxa" w:w="3213"/>
+          </w:tcPr>
+          <w:p>
+            <w:pPr>
+              <w:spacing w:before="0" w:after="0"/>
+              <w:jc w:val="center"/>
+            </w:pPr>
+            <w:r>
+              <w:rPr>
+                <w:b/>
+                <w:i w:val="0"/>
+                <w:color w:val="4A2A82"/>
+                <w:sz w:val="20"/>
+              </w:rPr>
+              <w:t>Confirmat</w:t>
+            </w:r>
+          </w:p>
+          <w:p>
+            <w:pPr>
+              <w:spacing w:before="0" w:after="40"/>
+              <w:jc w:val="center"/>
+            </w:pPr>
+            <w:r>
+              <w:rPr>
+                <w:b w:val="0"/>
+                <w:i/>
+                <w:color w:val="666666"/>
+                <w:sz w:val="18"/>
+              </w:rPr>
+              <w:t>Unitatea de învățământ (ștampila)</w:t>
             </w:r>
           </w:p>
           <w:p>
@@ -1842,14 +2226,14 @@
               <w:tabs>
                 <w:tab w:pos="2929" w:val="right" w:leader="underscore"/>
               </w:tabs>
-              <w:spacing w:before="280" w:after="0"/>
-            </w:pPr>
-            <w:r>
-              <w:rPr>
-                <w:b/>
-                <w:sz w:val="19"/>
-              </w:rPr>
-              <w:t xml:space="preserve">Semnătura: </w:t>
+              <w:spacing w:before="120" w:after="0"/>
+            </w:pPr>
+            <w:r>
+              <w:rPr>
+                <w:b/>
+                <w:sz w:val="19"/>
+              </w:rPr>
+              <w:t xml:space="preserve">Nume: </w:t>
             </w:r>
             <w:r>
               <w:rPr>
@@ -1870,48 +2254,13 @@
                 <w:b/>
                 <w:sz w:val="19"/>
               </w:rPr>
-              <w:t xml:space="preserve">Data: </w:t>
+              <w:t xml:space="preserve">Semnătura: </w:t>
             </w:r>
             <w:r>
               <w:rPr>
                 <w:sz w:val="19"/>
               </w:rPr>
               <w:tab/>
-            </w:r>
-          </w:p>
-        </w:tc>
-        <w:tc>
-          <w:tcPr>
-            <w:tcW w:type="dxa" w:w="3213"/>
-          </w:tcPr>
-          <w:p>
-            <w:pPr>
-              <w:spacing w:before="0" w:after="0"/>
-              <w:jc w:val="center"/>
-            </w:pPr>
-            <w:r>
-              <w:rPr>
-                <w:b/>
-                <w:i w:val="0"/>
-                <w:color w:val="4A2A82"/>
-                <w:sz w:val="20"/>
-              </w:rPr>
-              <w:t>Confirmat</w:t>
-            </w:r>
-          </w:p>
-          <w:p>
-            <w:pPr>
-              <w:spacing w:before="0" w:after="80"/>
-              <w:jc w:val="center"/>
-            </w:pPr>
-            <w:r>
-              <w:rPr>
-                <w:b w:val="0"/>
-                <w:i/>
-                <w:color w:val="666666"/>
-                <w:sz w:val="18"/>
-              </w:rPr>
-              <w:t>Unitatea de învățământ (director / diriginte), ștampila</w:t>
             </w:r>
           </w:p>
           <w:p>
@@ -1926,13 +2275,48 @@
                 <w:b/>
                 <w:sz w:val="19"/>
               </w:rPr>
-              <w:t xml:space="preserve">Nume: </w:t>
+              <w:t xml:space="preserve">Data: </w:t>
             </w:r>
             <w:r>
               <w:rPr>
                 <w:sz w:val="19"/>
               </w:rPr>
               <w:tab/>
+            </w:r>
+          </w:p>
+        </w:tc>
+        <w:tc>
+          <w:tcPr>
+            <w:tcW w:type="dxa" w:w="3213"/>
+          </w:tcPr>
+          <w:p>
+            <w:pPr>
+              <w:spacing w:before="0" w:after="0"/>
+              <w:jc w:val="center"/>
+            </w:pPr>
+            <w:r>
+              <w:rPr>
+                <w:b/>
+                <w:i w:val="0"/>
+                <w:color w:val="4A2A82"/>
+                <w:sz w:val="20"/>
+              </w:rPr>
+              <w:t>Avizat</w:t>
+            </w:r>
+          </w:p>
+          <w:p>
+            <w:pPr>
+              <w:spacing w:before="0" w:after="40"/>
+              <w:jc w:val="center"/>
+            </w:pPr>
+            <w:r>
+              <w:rPr>
+                <w:b w:val="0"/>
+                <w:i/>
+                <w:color w:val="666666"/>
+                <w:sz w:val="18"/>
+              </w:rPr>
+              <w:t>Manager de proiect</w:t>
             </w:r>
           </w:p>
           <w:p>
@@ -1940,14 +2324,14 @@
               <w:tabs>
                 <w:tab w:pos="2929" w:val="right" w:leader="underscore"/>
               </w:tabs>
-              <w:spacing w:before="280" w:after="0"/>
-            </w:pPr>
-            <w:r>
-              <w:rPr>
-                <w:b/>
-                <w:sz w:val="19"/>
-              </w:rPr>
-              <w:t xml:space="preserve">Semnătura: </w:t>
+              <w:spacing w:before="120" w:after="0"/>
+            </w:pPr>
+            <w:r>
+              <w:rPr>
+                <w:b/>
+                <w:sz w:val="19"/>
+              </w:rPr>
+              <w:t xml:space="preserve">Nume: </w:t>
             </w:r>
             <w:r>
               <w:rPr>
@@ -1968,48 +2352,13 @@
                 <w:b/>
                 <w:sz w:val="19"/>
               </w:rPr>
-              <w:t xml:space="preserve">Data: </w:t>
+              <w:t xml:space="preserve">Semnătura: </w:t>
             </w:r>
             <w:r>
               <w:rPr>
                 <w:sz w:val="19"/>
               </w:rPr>
               <w:tab/>
-            </w:r>
-          </w:p>
-        </w:tc>
-        <w:tc>
-          <w:tcPr>
-            <w:tcW w:type="dxa" w:w="3213"/>
-          </w:tcPr>
-          <w:p>
-            <w:pPr>
-              <w:spacing w:before="0" w:after="0"/>
-              <w:jc w:val="center"/>
-            </w:pPr>
-            <w:r>
-              <w:rPr>
-                <w:b/>
-                <w:i w:val="0"/>
-                <w:color w:val="4A2A82"/>
-                <w:sz w:val="20"/>
-              </w:rPr>
-              <w:t>Avizat</w:t>
-            </w:r>
-          </w:p>
-          <w:p>
-            <w:pPr>
-              <w:spacing w:before="0" w:after="80"/>
-              <w:jc w:val="center"/>
-            </w:pPr>
-            <w:r>
-              <w:rPr>
-                <w:b w:val="0"/>
-                <w:i/>
-                <w:color w:val="666666"/>
-                <w:sz w:val="18"/>
-              </w:rPr>
-              <w:t>Coordonator / manager de proiect</w:t>
             </w:r>
           </w:p>
           <w:p>
@@ -2018,48 +2367,6 @@
                 <w:tab w:pos="2929" w:val="right" w:leader="underscore"/>
               </w:tabs>
               <w:spacing w:before="160" w:after="0"/>
-            </w:pPr>
-            <w:r>
-              <w:rPr>
-                <w:b/>
-                <w:sz w:val="19"/>
-              </w:rPr>
-              <w:t xml:space="preserve">Nume: </w:t>
-            </w:r>
-            <w:r>
-              <w:rPr>
-                <w:sz w:val="19"/>
-              </w:rPr>
-              <w:tab/>
-            </w:r>
-          </w:p>
-          <w:p>
-            <w:pPr>
-              <w:tabs>
-                <w:tab w:pos="2929" w:val="right" w:leader="underscore"/>
-              </w:tabs>
-              <w:spacing w:before="280" w:after="0"/>
-            </w:pPr>
-            <w:r>
-              <w:rPr>
-                <w:b/>
-                <w:sz w:val="19"/>
-              </w:rPr>
-              <w:t xml:space="preserve">Semnătura: </w:t>
-            </w:r>
-            <w:r>
-              <w:rPr>
-                <w:sz w:val="19"/>
-              </w:rPr>
-              <w:tab/>
-            </w:r>
-          </w:p>
-          <w:p>
-            <w:pPr>
-              <w:tabs>
-                <w:tab w:pos="2929" w:val="right" w:leader="underscore"/>
-              </w:tabs>
-              <w:spacing w:before="200" w:after="0"/>
             </w:pPr>
             <w:r>
               <w:rPr>
@@ -11578,6 +11885,151 @@
     <w:p>
       <w:pPr>
         <w:keepNext/>
+        <w:spacing w:before="160" w:after="80"/>
+      </w:pPr>
+      <w:r>
+        <w:rPr>
+          <w:b/>
+          <w:i w:val="0"/>
+          <w:color w:val="4A2A82"/>
+          <w:sz w:val="22"/>
+        </w:rPr>
+        <w:t>Verificări și transmiteri (conform fișei postului)</w:t>
+      </w:r>
+    </w:p>
+    <w:tbl>
+      <w:tblPr>
+        <w:tblW w:w="9639" w:type="dxa"/>
+        <w:jc w:val="center"/>
+        <w:tblBorders>
+          <w:top w:val="nil"/>
+          <w:left w:val="nil"/>
+          <w:bottom w:val="nil"/>
+          <w:right w:val="nil"/>
+          <w:insideH w:val="nil"/>
+          <w:insideV w:val="nil"/>
+        </w:tblBorders>
+        <w:tblLayout w:type="fixed"/>
+        <w:tblCellMar>
+          <w:top w:w="22" w:type="dxa"/>
+          <w:left w:w="28" w:type="dxa"/>
+          <w:bottom w:w="22" w:type="dxa"/>
+          <w:right w:w="28" w:type="dxa"/>
+        </w:tblCellMar>
+        <w:tblLook w:firstColumn="1" w:firstRow="1" w:lastColumn="0" w:lastRow="0" w:noHBand="0" w:noVBand="1" w:val="04A0"/>
+      </w:tblPr>
+      <w:tblGrid>
+        <w:gridCol w:w="4819"/>
+        <w:gridCol w:w="4819"/>
+      </w:tblGrid>
+      <w:tr>
+        <w:tc>
+          <w:tcPr>
+            <w:tcW w:type="dxa" w:w="4819"/>
+          </w:tcPr>
+          <w:p>
+            <w:pPr>
+              <w:spacing w:before="0" w:after="0"/>
+            </w:pPr>
+            <w:r>
+              <w:rPr>
+                <w:color w:val="4A2A82"/>
+                <w:sz w:val="23"/>
+              </w:rPr>
+              <w:t xml:space="preserve">☐ </w:t>
+            </w:r>
+            <w:r>
+              <w:rPr>
+                <w:b w:val="0"/>
+                <w:i w:val="0"/>
+                <w:sz w:val="19"/>
+              </w:rPr>
+              <w:t>acordurile pentru minori (inclusiv foto) au fost verificate</w:t>
+            </w:r>
+          </w:p>
+        </w:tc>
+        <w:tc>
+          <w:tcPr>
+            <w:tcW w:type="dxa" w:w="4819"/>
+          </w:tcPr>
+          <w:p>
+            <w:pPr>
+              <w:spacing w:before="0" w:after="0"/>
+            </w:pPr>
+            <w:r>
+              <w:rPr>
+                <w:color w:val="4A2A82"/>
+                <w:sz w:val="23"/>
+              </w:rPr>
+              <w:t xml:space="preserve">☐ </w:t>
+            </w:r>
+            <w:r>
+              <w:rPr>
+                <w:b w:val="0"/>
+                <w:i w:val="0"/>
+                <w:sz w:val="19"/>
+              </w:rPr>
+              <w:t>condițiile de participare și siguranță au fost verificate</w:t>
+            </w:r>
+          </w:p>
+        </w:tc>
+      </w:tr>
+      <w:tr>
+        <w:tc>
+          <w:tcPr>
+            <w:tcW w:type="dxa" w:w="4819"/>
+          </w:tcPr>
+          <w:p>
+            <w:pPr>
+              <w:spacing w:before="0" w:after="0"/>
+            </w:pPr>
+            <w:r>
+              <w:rPr>
+                <w:color w:val="4A2A82"/>
+                <w:sz w:val="23"/>
+              </w:rPr>
+              <w:t xml:space="preserve">☐ </w:t>
+            </w:r>
+            <w:r>
+              <w:rPr>
+                <w:b w:val="0"/>
+                <w:i w:val="0"/>
+                <w:sz w:val="19"/>
+              </w:rPr>
+              <w:t>foto și sinteza au fost transmise Expertului comunicare</w:t>
+            </w:r>
+          </w:p>
+        </w:tc>
+        <w:tc>
+          <w:tcPr>
+            <w:tcW w:type="dxa" w:w="4819"/>
+          </w:tcPr>
+          <w:p>
+            <w:pPr>
+              <w:spacing w:before="0" w:after="0"/>
+            </w:pPr>
+            <w:r>
+              <w:rPr>
+                <w:color w:val="4A2A82"/>
+                <w:sz w:val="23"/>
+              </w:rPr>
+              <w:t xml:space="preserve">☐ </w:t>
+            </w:r>
+            <w:r>
+              <w:rPr>
+                <w:b w:val="0"/>
+                <w:i w:val="0"/>
+                <w:sz w:val="19"/>
+              </w:rPr>
+              <w:t>documentele au fost arhivate fizic și electronic</w:t>
+            </w:r>
+          </w:p>
+        </w:tc>
+      </w:tr>
+    </w:tbl>
+    <w:p>
+      <w:pPr>
+        <w:keepNext/>
         <w:spacing w:before="100" w:after="0"/>
       </w:pPr>
       <w:r>
@@ -11586,7 +12038,7 @@
           <w:i w:val="0"/>
           <w:sz w:val="20"/>
         </w:rPr>
-        <w:t>Implicarea și participarea elevilor</w:t>
+        <w:t>Participarea elevilor; absențe și dificultăți semnalate echipei</w:t>
       </w:r>
     </w:p>
     <w:p>
@@ -11665,21 +12117,6 @@
     </w:p>
     <w:p>
       <w:pPr>
-        <w:tabs>
-          <w:tab w:pos="9638" w:val="right" w:leader="underscore"/>
-        </w:tabs>
-        <w:spacing w:before="160" w:after="0"/>
-      </w:pPr>
-      <w:r>
-        <w:rPr>
-          <w:color w:val="9A9A9A"/>
-          <w:sz w:val="20"/>
-        </w:rPr>
-        <w:tab/>
-      </w:r>
-    </w:p>
-    <w:p>
-      <w:pPr>
         <w:keepNext/>
         <w:spacing w:before="100" w:after="0"/>
       </w:pPr>
@@ -11709,21 +12146,6 @@
     </w:p>
     <w:p>
       <w:pPr>
-        <w:tabs>
-          <w:tab w:pos="9638" w:val="right" w:leader="underscore"/>
-        </w:tabs>
-        <w:spacing w:before="160" w:after="0"/>
-      </w:pPr>
-      <w:r>
-        <w:rPr>
-          <w:color w:val="9A9A9A"/>
-          <w:sz w:val="20"/>
-        </w:rPr>
-        <w:tab/>
-      </w:r>
-    </w:p>
-    <w:p>
-      <w:pPr>
         <w:keepNext/>
         <w:spacing w:before="100" w:after="0"/>
       </w:pPr>
@@ -11734,21 +12156,6 @@
           <w:sz w:val="20"/>
         </w:rPr>
         <w:t>Concluzii și recomandări</w:t>
-      </w:r>
-    </w:p>
-    <w:p>
-      <w:pPr>
-        <w:tabs>
-          <w:tab w:pos="9638" w:val="right" w:leader="underscore"/>
-        </w:tabs>
-        <w:spacing w:before="160" w:after="0"/>
-      </w:pPr>
-      <w:r>
-        <w:rPr>
-          <w:color w:val="9A9A9A"/>
-          <w:sz w:val="20"/>
-        </w:rPr>
-        <w:tab/>
       </w:r>
     </w:p>
     <w:p>
@@ -11847,23 +12254,15 @@
           </w:p>
           <w:p>
             <w:pPr>
-              <w:tabs>
-                <w:tab w:pos="4535" w:val="right" w:leader="underscore"/>
-              </w:tabs>
               <w:spacing w:before="160" w:after="0"/>
             </w:pPr>
             <w:r>
               <w:rPr>
-                <w:b/>
-                <w:sz w:val="20"/>
-              </w:rPr>
-              <w:t xml:space="preserve">Nume: </w:t>
-            </w:r>
-            <w:r>
-              <w:rPr>
-                <w:sz w:val="20"/>
-              </w:rPr>
-              <w:tab/>
+                <w:b w:val="0"/>
+                <w:i w:val="0"/>
+                <w:sz w:val="20"/>
+              </w:rPr>
+              <w:t>Nume: GOLOVATIC LIVIA</w:t>
             </w:r>
           </w:p>
           <w:p>

</xml_diff>

<commit_message>
Completează subactivitatea SA5.3 în documentele justificative
Co-Authored-By: Claude Opus 5.5 <noreply@anthropic.com>
Claude-Session: https://claude.ai/code/session_014YvKj2uLd5NfjHU1PMAHuV
</commit_message>
<xml_diff>
--- a/atelier_puncte_forte/Sedinta_1_Cine_sunt_eu_Scenariu_si_Anexe.docx
+++ b/atelier_puncte_forte/Sedinta_1_Cine_sunt_eu_Scenariu_si_Anexe.docx
@@ -318,7 +318,7 @@
                 <w:color w:val="4A2A82"/>
                 <w:sz w:val="19"/>
               </w:rPr>
-              <w:t>Activitatea / subactivitatea din proiect</w:t>
+              <w:t>Subactivitatea din proiect</w:t>
             </w:r>
           </w:p>
         </w:tc>
@@ -329,17 +329,15 @@
           </w:tcPr>
           <w:p>
             <w:pPr>
-              <w:tabs>
-                <w:tab w:pos="6520" w:val="right" w:leader="underscore"/>
-              </w:tabs>
-              <w:spacing w:before="60" w:after="0"/>
-            </w:pPr>
-            <w:r>
-              <w:rPr>
-                <w:color w:val="9A9A9A"/>
-                <w:sz w:val="19"/>
-              </w:rPr>
-              <w:tab/>
+              <w:spacing w:before="0" w:after="0"/>
+            </w:pPr>
+            <w:r>
+              <w:rPr>
+                <w:b w:val="0"/>
+                <w:i w:val="0"/>
+                <w:sz w:val="19"/>
+              </w:rPr>
+              <w:t>SA5.3 – Dezvoltarea de programe de informare și conștientizare</w:t>
             </w:r>
           </w:p>
         </w:tc>
@@ -823,7 +821,7 @@
           <w:i w:val="0"/>
           <w:sz w:val="20"/>
         </w:rPr>
-        <w:t>Ședința face parte dintr-un atelier de dezvoltare personală de 2 ședințe a câte 60 de minute, destinat elevilor din clasele a VII-a – a VIII-a. Scopul ședinței este dezvoltarea autocunoașterii prin identificarea punctelor forte și a resurselor personale, precum și exersarea oferirii și primirii feedbackului pozitiv.</w:t>
+        <w:t>În cadrul subactivității SA5.3 – Dezvoltarea de programe de informare și conștientizare, ședința face parte dintr-un atelier de dezvoltare personală de 2 ședințe a câte 60 de minute, destinat elevilor din clasele a VII-a – a VIII-a. Scopul ședinței este dezvoltarea autocunoașterii prin identificarea punctelor forte și a resurselor personale, precum și exersarea oferirii și primirii feedbackului pozitiv.</w:t>
       </w:r>
     </w:p>
     <w:p>
@@ -2585,7 +2583,21 @@
           <w:b w:val="0"/>
           <w:i w:val="0"/>
         </w:rPr>
-        <w:t>Activitatea contribuie la scopul proiectului UNIC – incluziunea și continuitatea educației elevilor – prin dezvoltarea stimei de sine, a competențelor socio-emoționale și a motivației pentru învățare, factori care susțin participarea și menținerea elevilor în educație.</w:t>
+        <w:t xml:space="preserve">Activitatea se înscrie în subactivitatea </w:t>
+      </w:r>
+      <w:r>
+        <w:rPr>
+          <w:b/>
+          <w:i w:val="0"/>
+        </w:rPr>
+        <w:t>SA5.3 – Dezvoltarea de programe de informare și conștientizare</w:t>
+      </w:r>
+      <w:r>
+        <w:rPr>
+          <w:b w:val="0"/>
+          <w:i w:val="0"/>
+        </w:rPr>
+        <w:t xml:space="preserve"> și contribuie la scopul proiectului UNIC – incluziunea și continuitatea educației elevilor – prin dezvoltarea stimei de sine, a competențelor socio-emoționale și a motivației pentru învățare, factori care susțin participarea și menținerea elevilor în educație.</w:t>
       </w:r>
     </w:p>
     <w:p>

</xml_diff>